<commit_message>
Update: Agregacion de placa a la documentacion
</commit_message>
<xml_diff>
--- a/Documentacion Final/Requisitos - DilanMotos/V3.2-Historia de usuario.docx
+++ b/Documentacion Final/Requisitos - DilanMotos/V3.2-Historia de usuario.docx
@@ -1,6 +1,6 @@
 
 <file path=word/document.xml><?xml version="1.0" encoding="utf-8"?>
-<w:document xmlns:wpc="http://schemas.microsoft.com/office/word/2010/wordprocessingCanvas" xmlns:mc="http://schemas.openxmlformats.org/markup-compatibility/2006" xmlns:o="urn:schemas-microsoft-com:office:office" xmlns:r="http://schemas.openxmlformats.org/officeDocument/2006/relationships" xmlns:m="http://schemas.openxmlformats.org/officeDocument/2006/math" xmlns:v="urn:schemas-microsoft-com:vml" xmlns:wp14="http://schemas.microsoft.com/office/word/2010/wordprocessingDrawing" xmlns:wp="http://schemas.openxmlformats.org/drawingml/2006/wordprocessingDrawing" xmlns:w10="urn:schemas-microsoft-com:office:word" xmlns:w="http://schemas.openxmlformats.org/wordprocessingml/2006/main" xmlns:w14="http://schemas.microsoft.com/office/word/2010/wordml" xmlns:wpg="http://schemas.microsoft.com/office/word/2010/wordprocessingGroup" xmlns:wpi="http://schemas.microsoft.com/office/word/2010/wordprocessingInk" xmlns:wne="http://schemas.microsoft.com/office/word/2006/wordml" xmlns:wps="http://schemas.microsoft.com/office/word/2010/wordprocessingShape" mc:Ignorable="w14 wp14">
+<w:document xmlns:wpc="http://schemas.microsoft.com/office/word/2010/wordprocessingCanvas" xmlns:cx="http://schemas.microsoft.com/office/drawing/2014/chartex" xmlns:cx1="http://schemas.microsoft.com/office/drawing/2015/9/8/chartex" xmlns:cx2="http://schemas.microsoft.com/office/drawing/2015/10/21/chartex" xmlns:cx3="http://schemas.microsoft.com/office/drawing/2016/5/9/chartex" xmlns:cx4="http://schemas.microsoft.com/office/drawing/2016/5/10/chartex" xmlns:cx5="http://schemas.microsoft.com/office/drawing/2016/5/11/chartex" xmlns:cx6="http://schemas.microsoft.com/office/drawing/2016/5/12/chartex" xmlns:cx7="http://schemas.microsoft.com/office/drawing/2016/5/13/chartex" xmlns:cx8="http://schemas.microsoft.com/office/drawing/2016/5/14/chartex" xmlns:mc="http://schemas.openxmlformats.org/markup-compatibility/2006" xmlns:aink="http://schemas.microsoft.com/office/drawing/2016/ink" xmlns:am3d="http://schemas.microsoft.com/office/drawing/2017/model3d" xmlns:o="urn:schemas-microsoft-com:office:office" xmlns:oel="http://schemas.microsoft.com/office/2019/extlst" xmlns:r="http://schemas.openxmlformats.org/officeDocument/2006/relationships" xmlns:m="http://schemas.openxmlformats.org/officeDocument/2006/math" xmlns:v="urn:schemas-microsoft-com:vml" xmlns:wp14="http://schemas.microsoft.com/office/word/2010/wordprocessingDrawing" xmlns:wp="http://schemas.openxmlformats.org/drawingml/2006/wordprocessingDrawing" xmlns:w10="urn:schemas-microsoft-com:office:word" xmlns:w="http://schemas.openxmlformats.org/wordprocessingml/2006/main" xmlns:w14="http://schemas.microsoft.com/office/word/2010/wordml" xmlns:w15="http://schemas.microsoft.com/office/word/2012/wordml" xmlns:w16cex="http://schemas.microsoft.com/office/word/2018/wordml/cex" xmlns:w16cid="http://schemas.microsoft.com/office/word/2016/wordml/cid" xmlns:w16="http://schemas.microsoft.com/office/word/2018/wordml" xmlns:w16du="http://schemas.microsoft.com/office/word/2023/wordml/word16du" xmlns:w16sdtdh="http://schemas.microsoft.com/office/word/2020/wordml/sdtdatahash" xmlns:w16sdtfl="http://schemas.microsoft.com/office/word/2024/wordml/sdtformatlock" xmlns:w16se="http://schemas.microsoft.com/office/word/2015/wordml/symex" xmlns:wpg="http://schemas.microsoft.com/office/word/2010/wordprocessingGroup" xmlns:wpi="http://schemas.microsoft.com/office/word/2010/wordprocessingInk" xmlns:wne="http://schemas.microsoft.com/office/word/2006/wordml" xmlns:wps="http://schemas.microsoft.com/office/word/2010/wordprocessingShape" mc:Ignorable="w14 w15 w16se w16cid w16 w16cex w16sdtdh w16sdtfl w16du wp14">
   <w:body>
     <w:p>
       <w:pPr>
@@ -574,25 +574,7 @@
                 <w:szCs w:val="24"/>
               </w:rPr>
               <w:br/>
-              <w:t xml:space="preserve">Para crear </w:t>
-            </w:r>
-            <w:proofErr w:type="gramStart"/>
-            <w:r>
-              <w:rPr>
-                <w:rFonts w:ascii="Arial" w:hAnsi="Arial" w:cs="Arial"/>
-                <w:sz w:val="24"/>
-                <w:szCs w:val="24"/>
-              </w:rPr>
-              <w:t>mi</w:t>
-            </w:r>
-            <w:proofErr w:type="gramEnd"/>
-            <w:r>
-              <w:rPr>
-                <w:rFonts w:ascii="Arial" w:hAnsi="Arial" w:cs="Arial"/>
-                <w:sz w:val="24"/>
-                <w:szCs w:val="24"/>
-              </w:rPr>
-              <w:t xml:space="preserve"> cuenta en el sistema y poder acceder a los servicios.</w:t>
+              <w:t>Para crear mi cuenta en el sistema y poder acceder a los servicios.</w:t>
             </w:r>
           </w:p>
         </w:tc>
@@ -675,7 +657,27 @@
                 <w:sz w:val="24"/>
                 <w:szCs w:val="24"/>
               </w:rPr>
-              <w:t>Nombre, correo, crear contraseña, marca de moto, modelo y tipo de servicio</w:t>
+              <w:t>Nombre, correo, crear contraseña, marca de moto, modelo</w:t>
+            </w:r>
+            <w:r>
+              <w:rPr>
+                <w:rFonts w:ascii="Arial" w:hAnsi="Arial" w:cs="Arial"/>
+                <w:i/>
+                <w:iCs/>
+                <w:sz w:val="24"/>
+                <w:szCs w:val="24"/>
+              </w:rPr>
+              <w:t>, placa y</w:t>
+            </w:r>
+            <w:r>
+              <w:rPr>
+                <w:rFonts w:ascii="Arial" w:hAnsi="Arial" w:cs="Arial"/>
+                <w:i/>
+                <w:iCs/>
+                <w:sz w:val="24"/>
+                <w:szCs w:val="24"/>
+              </w:rPr>
+              <w:t xml:space="preserve"> tipo de servicio</w:t>
             </w:r>
             <w:r>
               <w:rPr>
@@ -856,7 +858,23 @@
                 <w:sz w:val="24"/>
                 <w:szCs w:val="24"/>
               </w:rPr>
-              <w:t xml:space="preserve"> Nombre, correo electrónico, contraseña, marca de la motocicleta, modelo, tipo de servicio.</w:t>
+              <w:t xml:space="preserve"> Nombre, correo electrónico, contraseña, marca de la motocicleta, modelo</w:t>
+            </w:r>
+            <w:r>
+              <w:rPr>
+                <w:rFonts w:ascii="Arial" w:hAnsi="Arial" w:cs="Arial"/>
+                <w:sz w:val="24"/>
+                <w:szCs w:val="24"/>
+              </w:rPr>
+              <w:t>, placa y</w:t>
+            </w:r>
+            <w:r>
+              <w:rPr>
+                <w:rFonts w:ascii="Arial" w:hAnsi="Arial" w:cs="Arial"/>
+                <w:sz w:val="24"/>
+                <w:szCs w:val="24"/>
+              </w:rPr>
+              <w:t xml:space="preserve"> tipo de servicio.</w:t>
             </w:r>
           </w:p>
           <w:p>
@@ -883,7 +901,16 @@
                 <w:sz w:val="24"/>
                 <w:szCs w:val="24"/>
               </w:rPr>
-              <w:t xml:space="preserve"> Mensaje de confirmación en pantalla y registro exitoso en la base de datos. </w:t>
+              <w:t xml:space="preserve"> Mensaje de confirmación en pantalla y registro </w:t>
+            </w:r>
+            <w:r>
+              <w:rPr>
+                <w:rFonts w:ascii="Arial" w:hAnsi="Arial" w:cs="Arial"/>
+                <w:sz w:val="24"/>
+                <w:szCs w:val="24"/>
+              </w:rPr>
+              <w:lastRenderedPageBreak/>
+              <w:t xml:space="preserve">exitoso en la base de datos. </w:t>
             </w:r>
           </w:p>
           <w:p>
@@ -1178,27 +1205,15 @@
                 <w:szCs w:val="24"/>
               </w:rPr>
             </w:pPr>
-            <w:proofErr w:type="spellStart"/>
-            <w:r>
-              <w:rPr>
-                <w:rFonts w:ascii="Arial" w:hAnsi="Arial" w:cs="Arial"/>
-                <w:b/>
-                <w:bCs/>
-                <w:sz w:val="24"/>
-                <w:szCs w:val="24"/>
-              </w:rPr>
-              <w:t>Definition</w:t>
-            </w:r>
-            <w:proofErr w:type="spellEnd"/>
-            <w:r>
-              <w:rPr>
-                <w:rFonts w:ascii="Arial" w:hAnsi="Arial" w:cs="Arial"/>
-                <w:b/>
-                <w:bCs/>
-                <w:sz w:val="24"/>
-                <w:szCs w:val="24"/>
-              </w:rPr>
-              <w:t xml:space="preserve"> of Done:</w:t>
+            <w:r>
+              <w:rPr>
+                <w:rFonts w:ascii="Arial" w:hAnsi="Arial" w:cs="Arial"/>
+                <w:b/>
+                <w:bCs/>
+                <w:sz w:val="24"/>
+                <w:szCs w:val="24"/>
+              </w:rPr>
+              <w:t>Definition of Done:</w:t>
             </w:r>
           </w:p>
         </w:tc>
@@ -1603,15 +1618,7 @@
                 <w:sz w:val="24"/>
                 <w:szCs w:val="24"/>
               </w:rPr>
-              <w:t>EP-001 | RF001 | CU001 | CP-001-01, CP-001-02, CP-001-03, CP-001-04, CP-001-05 | RNF01, RNF03, RNF06</w:t>
-            </w:r>
-            <w:r>
-              <w:rPr>
-                <w:rFonts w:ascii="Arial" w:hAnsi="Arial" w:cs="Arial"/>
-                <w:sz w:val="24"/>
-                <w:szCs w:val="24"/>
-              </w:rPr>
-              <w:t xml:space="preserve"> </w:t>
+              <w:t xml:space="preserve">EP-001 | RF001 | CU001 | CP-001-01, CP-001-02, CP-001-03, CP-001-04, CP-001-05 | RNF01, RNF03, RNF06 </w:t>
             </w:r>
           </w:p>
         </w:tc>
@@ -2741,27 +2748,15 @@
                 <w:szCs w:val="24"/>
               </w:rPr>
             </w:pPr>
-            <w:proofErr w:type="spellStart"/>
-            <w:r>
-              <w:rPr>
-                <w:rFonts w:ascii="Arial" w:hAnsi="Arial" w:cs="Arial"/>
-                <w:b/>
-                <w:bCs/>
-                <w:sz w:val="24"/>
-                <w:szCs w:val="24"/>
-              </w:rPr>
-              <w:t>Definition</w:t>
-            </w:r>
-            <w:proofErr w:type="spellEnd"/>
-            <w:r>
-              <w:rPr>
-                <w:rFonts w:ascii="Arial" w:hAnsi="Arial" w:cs="Arial"/>
-                <w:b/>
-                <w:bCs/>
-                <w:sz w:val="24"/>
-                <w:szCs w:val="24"/>
-              </w:rPr>
-              <w:t xml:space="preserve"> of Done:</w:t>
+            <w:r>
+              <w:rPr>
+                <w:rFonts w:ascii="Arial" w:hAnsi="Arial" w:cs="Arial"/>
+                <w:b/>
+                <w:bCs/>
+                <w:sz w:val="24"/>
+                <w:szCs w:val="24"/>
+              </w:rPr>
+              <w:t>Definition of Done:</w:t>
             </w:r>
           </w:p>
         </w:tc>
@@ -3108,15 +3103,7 @@
                 <w:sz w:val="24"/>
                 <w:szCs w:val="24"/>
               </w:rPr>
-              <w:t>E</w:t>
-            </w:r>
-            <w:r>
-              <w:rPr>
-                <w:rFonts w:ascii="Arial" w:hAnsi="Arial" w:cs="Arial"/>
-                <w:sz w:val="24"/>
-                <w:szCs w:val="24"/>
-              </w:rPr>
-              <w:t>P-001 | RF002 | CU002 | CP-002-01, CP-002-02, CP-002-03, CP-002-04, CP-002-05 | RNF01, RNF08</w:t>
+              <w:t>EP-001 | RF002 | CU002 | CP-002-01, CP-002-02, CP-002-03, CP-002-04, CP-002-05 | RNF01, RNF08</w:t>
             </w:r>
           </w:p>
         </w:tc>
@@ -3770,43 +3757,7 @@
                 <w:sz w:val="24"/>
                 <w:szCs w:val="24"/>
               </w:rPr>
-              <w:t xml:space="preserve">Permite a cualquier usuario autenticado destruir su token o sesión activa tanto en el </w:t>
-            </w:r>
-            <w:proofErr w:type="spellStart"/>
-            <w:r>
-              <w:rPr>
-                <w:rFonts w:ascii="Arial" w:hAnsi="Arial" w:cs="Arial"/>
-                <w:sz w:val="24"/>
-                <w:szCs w:val="24"/>
-              </w:rPr>
-              <w:t>frontend</w:t>
-            </w:r>
-            <w:proofErr w:type="spellEnd"/>
-            <w:r>
-              <w:rPr>
-                <w:rFonts w:ascii="Arial" w:hAnsi="Arial" w:cs="Arial"/>
-                <w:sz w:val="24"/>
-                <w:szCs w:val="24"/>
-              </w:rPr>
-              <w:t xml:space="preserve"> como en el </w:t>
-            </w:r>
-            <w:proofErr w:type="spellStart"/>
-            <w:r>
-              <w:rPr>
-                <w:rFonts w:ascii="Arial" w:hAnsi="Arial" w:cs="Arial"/>
-                <w:sz w:val="24"/>
-                <w:szCs w:val="24"/>
-              </w:rPr>
-              <w:t>backend</w:t>
-            </w:r>
-            <w:proofErr w:type="spellEnd"/>
-            <w:r>
-              <w:rPr>
-                <w:rFonts w:ascii="Arial" w:hAnsi="Arial" w:cs="Arial"/>
-                <w:sz w:val="24"/>
-                <w:szCs w:val="24"/>
-              </w:rPr>
-              <w:t>, redirigiéndolo a la pantalla pública o de Login de manera automática.</w:t>
+              <w:t>Permite a cualquier usuario autenticado destruir su token o sesión activa tanto en el frontend como en el backend, redirigiéndolo a la pantalla pública o de Login de manera automática.</w:t>
             </w:r>
           </w:p>
         </w:tc>
@@ -4064,43 +4015,7 @@
                 <w:sz w:val="24"/>
                 <w:szCs w:val="24"/>
               </w:rPr>
-              <w:t xml:space="preserve">Escenario 1 (Cierre de sesión seguro): Dado que el usuario autenticado presiona la opción "Cerrar Sesión" en su menú/perfil, cuando confirma la acción, entonces el sistema destruye el token/sesión activa en el </w:t>
-            </w:r>
-            <w:proofErr w:type="spellStart"/>
-            <w:r>
-              <w:rPr>
-                <w:rFonts w:ascii="Arial" w:hAnsi="Arial" w:cs="Arial"/>
-                <w:sz w:val="24"/>
-                <w:szCs w:val="24"/>
-              </w:rPr>
-              <w:t>frontend</w:t>
-            </w:r>
-            <w:proofErr w:type="spellEnd"/>
-            <w:r>
-              <w:rPr>
-                <w:rFonts w:ascii="Arial" w:hAnsi="Arial" w:cs="Arial"/>
-                <w:sz w:val="24"/>
-                <w:szCs w:val="24"/>
-              </w:rPr>
-              <w:t xml:space="preserve"> y </w:t>
-            </w:r>
-            <w:proofErr w:type="spellStart"/>
-            <w:r>
-              <w:rPr>
-                <w:rFonts w:ascii="Arial" w:hAnsi="Arial" w:cs="Arial"/>
-                <w:sz w:val="24"/>
-                <w:szCs w:val="24"/>
-              </w:rPr>
-              <w:t>backend</w:t>
-            </w:r>
-            <w:proofErr w:type="spellEnd"/>
-            <w:r>
-              <w:rPr>
-                <w:rFonts w:ascii="Arial" w:hAnsi="Arial" w:cs="Arial"/>
-                <w:sz w:val="24"/>
-                <w:szCs w:val="24"/>
-              </w:rPr>
-              <w:t>, redirige automáticamente al Login o Pantalla Principal y ningún recurso protegido debe ser accesible tras cerrar sesión sin autenticarse nuevamente.</w:t>
+              <w:t>Escenario 1 (Cierre de sesión seguro): Dado que el usuario autenticado presiona la opción "Cerrar Sesión" en su menú/perfil, cuando confirma la acción, entonces el sistema destruye el token/sesión activa en el frontend y backend, redirige automáticamente al Login o Pantalla Principal y ningún recurso protegido debe ser accesible tras cerrar sesión sin autenticarse nuevamente.</w:t>
             </w:r>
           </w:p>
         </w:tc>
@@ -4277,27 +4192,15 @@
                 <w:szCs w:val="24"/>
               </w:rPr>
             </w:pPr>
-            <w:proofErr w:type="spellStart"/>
-            <w:r>
-              <w:rPr>
-                <w:rFonts w:ascii="Arial" w:hAnsi="Arial" w:cs="Arial"/>
-                <w:b/>
-                <w:bCs/>
-                <w:sz w:val="24"/>
-                <w:szCs w:val="24"/>
-              </w:rPr>
-              <w:t>Definition</w:t>
-            </w:r>
-            <w:proofErr w:type="spellEnd"/>
-            <w:r>
-              <w:rPr>
-                <w:rFonts w:ascii="Arial" w:hAnsi="Arial" w:cs="Arial"/>
-                <w:b/>
-                <w:bCs/>
-                <w:sz w:val="24"/>
-                <w:szCs w:val="24"/>
-              </w:rPr>
-              <w:t xml:space="preserve"> of Done:</w:t>
+            <w:r>
+              <w:rPr>
+                <w:rFonts w:ascii="Arial" w:hAnsi="Arial" w:cs="Arial"/>
+                <w:b/>
+                <w:bCs/>
+                <w:sz w:val="24"/>
+                <w:szCs w:val="24"/>
+              </w:rPr>
+              <w:t>Definition of Done:</w:t>
             </w:r>
           </w:p>
         </w:tc>
@@ -5494,25 +5397,7 @@
                 <w:sz w:val="24"/>
                 <w:szCs w:val="24"/>
               </w:rPr>
-              <w:t xml:space="preserve">Permite a un usuario con sesión activa actualizar su contraseña. El sistema </w:t>
-            </w:r>
-            <w:proofErr w:type="gramStart"/>
-            <w:r>
-              <w:rPr>
-                <w:rFonts w:ascii="Arial" w:hAnsi="Arial" w:cs="Arial"/>
-                <w:sz w:val="24"/>
-                <w:szCs w:val="24"/>
-              </w:rPr>
-              <w:t>valida</w:t>
-            </w:r>
-            <w:proofErr w:type="gramEnd"/>
-            <w:r>
-              <w:rPr>
-                <w:rFonts w:ascii="Arial" w:hAnsi="Arial" w:cs="Arial"/>
-                <w:sz w:val="24"/>
-                <w:szCs w:val="24"/>
-              </w:rPr>
-              <w:t xml:space="preserve"> que la contraseña actual coincida, exige confirmación doble para evitar errores, encripta la nueva clave y despliega una notificación de actualización exitosa.</w:t>
+              <w:t>Permite a un usuario con sesión activa actualizar su contraseña. El sistema valida que la contraseña actual coincida, exige confirmación doble para evitar errores, encripta la nueva clave y despliega una notificación de actualización exitosa.</w:t>
             </w:r>
           </w:p>
         </w:tc>
@@ -5957,25 +5842,7 @@
                 <w:sz w:val="24"/>
                 <w:szCs w:val="24"/>
               </w:rPr>
-              <w:t xml:space="preserve">Vista "Seguridad / Cambiar Contraseña" con tres campos de texto tipo </w:t>
-            </w:r>
-            <w:proofErr w:type="spellStart"/>
-            <w:r>
-              <w:rPr>
-                <w:rFonts w:ascii="Arial" w:hAnsi="Arial" w:cs="Arial"/>
-                <w:sz w:val="24"/>
-                <w:szCs w:val="24"/>
-              </w:rPr>
-              <w:t>password</w:t>
-            </w:r>
-            <w:proofErr w:type="spellEnd"/>
-            <w:r>
-              <w:rPr>
-                <w:rFonts w:ascii="Arial" w:hAnsi="Arial" w:cs="Arial"/>
-                <w:sz w:val="24"/>
-                <w:szCs w:val="24"/>
-              </w:rPr>
-              <w:t xml:space="preserve"> y botón "Actualizar Contraseña".</w:t>
+              <w:t>Vista "Seguridad / Cambiar Contraseña" con tres campos de texto tipo password y botón "Actualizar Contraseña".</w:t>
             </w:r>
           </w:p>
         </w:tc>
@@ -6006,27 +5873,15 @@
                 <w:szCs w:val="24"/>
               </w:rPr>
             </w:pPr>
-            <w:proofErr w:type="spellStart"/>
-            <w:r>
-              <w:rPr>
-                <w:rFonts w:ascii="Arial" w:hAnsi="Arial" w:cs="Arial"/>
-                <w:b/>
-                <w:bCs/>
-                <w:sz w:val="24"/>
-                <w:szCs w:val="24"/>
-              </w:rPr>
-              <w:t>Definition</w:t>
-            </w:r>
-            <w:proofErr w:type="spellEnd"/>
-            <w:r>
-              <w:rPr>
-                <w:rFonts w:ascii="Arial" w:hAnsi="Arial" w:cs="Arial"/>
-                <w:b/>
-                <w:bCs/>
-                <w:sz w:val="24"/>
-                <w:szCs w:val="24"/>
-              </w:rPr>
-              <w:t xml:space="preserve"> of Done:</w:t>
+            <w:r>
+              <w:rPr>
+                <w:rFonts w:ascii="Arial" w:hAnsi="Arial" w:cs="Arial"/>
+                <w:b/>
+                <w:bCs/>
+                <w:sz w:val="24"/>
+                <w:szCs w:val="24"/>
+              </w:rPr>
+              <w:t>Definition of Done:</w:t>
             </w:r>
           </w:p>
         </w:tc>
@@ -6980,18 +6835,8 @@
                 <w:szCs w:val="24"/>
               </w:rPr>
               <w:br/>
-              <w:t>Para volver a acceder al sistema si olvidé mis credenciales o cancelar el proceso si así lo deseo</w:t>
-            </w:r>
-            <w:proofErr w:type="gramStart"/>
-            <w:r>
-              <w:rPr>
-                <w:rFonts w:ascii="Arial" w:hAnsi="Arial" w:cs="Arial"/>
-                <w:sz w:val="24"/>
-                <w:szCs w:val="24"/>
-              </w:rPr>
-              <w:t>..</w:t>
-            </w:r>
-            <w:proofErr w:type="gramEnd"/>
+              <w:t>Para volver a acceder al sistema si olvidé mis credenciales o cancelar el proceso si así lo deseo..</w:t>
+            </w:r>
           </w:p>
         </w:tc>
       </w:tr>
@@ -9013,7 +8858,6 @@
                 <w:szCs w:val="24"/>
               </w:rPr>
             </w:pPr>
-            <w:proofErr w:type="spellStart"/>
             <w:r>
               <w:rPr>
                 <w:rFonts w:ascii="Arial" w:eastAsia="Cambria" w:hAnsi="Arial" w:cs="Arial"/>
@@ -9023,19 +8867,7 @@
                 <w:sz w:val="24"/>
                 <w:szCs w:val="24"/>
               </w:rPr>
-              <w:t>Definition</w:t>
-            </w:r>
-            <w:proofErr w:type="spellEnd"/>
-            <w:r>
-              <w:rPr>
-                <w:rFonts w:ascii="Arial" w:eastAsia="Cambria" w:hAnsi="Arial" w:cs="Arial"/>
-                <w:b/>
-                <w:bCs/>
-                <w:color w:val="FFFFFF"/>
-                <w:sz w:val="24"/>
-                <w:szCs w:val="24"/>
-              </w:rPr>
-              <w:t xml:space="preserve"> of Done:</w:t>
+              <w:t>Definition of Done:</w:t>
             </w:r>
           </w:p>
         </w:tc>
@@ -10372,25 +10204,7 @@
                 <w:sz w:val="24"/>
                 <w:szCs w:val="24"/>
               </w:rPr>
-              <w:t xml:space="preserve">RF002 (Iniciar sesión - Rol </w:t>
-            </w:r>
-            <w:proofErr w:type="spellStart"/>
-            <w:r>
-              <w:rPr>
-                <w:rFonts w:ascii="Arial" w:eastAsia="Cambria" w:hAnsi="Arial" w:cs="Arial"/>
-                <w:sz w:val="24"/>
-                <w:szCs w:val="24"/>
-              </w:rPr>
-              <w:t>Admin</w:t>
-            </w:r>
-            <w:proofErr w:type="spellEnd"/>
-            <w:r>
-              <w:rPr>
-                <w:rFonts w:ascii="Arial" w:eastAsia="Cambria" w:hAnsi="Arial" w:cs="Arial"/>
-                <w:sz w:val="24"/>
-                <w:szCs w:val="24"/>
-              </w:rPr>
-              <w:t xml:space="preserve">) </w:t>
+              <w:t xml:space="preserve">RF002 (Iniciar sesión - Rol Admin) </w:t>
             </w:r>
           </w:p>
         </w:tc>
@@ -10488,7 +10302,6 @@
                 <w:szCs w:val="24"/>
               </w:rPr>
             </w:pPr>
-            <w:proofErr w:type="spellStart"/>
             <w:r>
               <w:rPr>
                 <w:rFonts w:ascii="Arial" w:eastAsia="Cambria" w:hAnsi="Arial" w:cs="Arial"/>
@@ -10498,19 +10311,7 @@
                 <w:sz w:val="24"/>
                 <w:szCs w:val="24"/>
               </w:rPr>
-              <w:t>Definition</w:t>
-            </w:r>
-            <w:proofErr w:type="spellEnd"/>
-            <w:r>
-              <w:rPr>
-                <w:rFonts w:ascii="Arial" w:eastAsia="Cambria" w:hAnsi="Arial" w:cs="Arial"/>
-                <w:b/>
-                <w:bCs/>
-                <w:color w:val="FFFFFF"/>
-                <w:sz w:val="24"/>
-                <w:szCs w:val="24"/>
-              </w:rPr>
-              <w:t xml:space="preserve"> of Done:</w:t>
+              <w:t>Definition of Done:</w:t>
             </w:r>
           </w:p>
         </w:tc>
@@ -11602,25 +11403,7 @@
                 <w:sz w:val="24"/>
                 <w:szCs w:val="24"/>
               </w:rPr>
-              <w:t xml:space="preserve">Marca | Sí | Texto / </w:t>
-            </w:r>
-            <w:proofErr w:type="spellStart"/>
-            <w:r>
-              <w:rPr>
-                <w:rFonts w:ascii="Arial" w:eastAsia="Cambria" w:hAnsi="Arial" w:cs="Arial"/>
-                <w:sz w:val="24"/>
-                <w:szCs w:val="24"/>
-              </w:rPr>
-              <w:t>Dropdown</w:t>
-            </w:r>
-            <w:proofErr w:type="spellEnd"/>
-            <w:r>
-              <w:rPr>
-                <w:rFonts w:ascii="Arial" w:eastAsia="Cambria" w:hAnsi="Arial" w:cs="Arial"/>
-                <w:sz w:val="24"/>
-                <w:szCs w:val="24"/>
-              </w:rPr>
-              <w:t xml:space="preserve"> </w:t>
+              <w:t xml:space="preserve">Marca | Sí | Texto / Dropdown </w:t>
             </w:r>
           </w:p>
           <w:p>
@@ -11639,25 +11422,7 @@
                 <w:sz w:val="24"/>
                 <w:szCs w:val="24"/>
               </w:rPr>
-              <w:t xml:space="preserve">Modelo | Sí | Texto / </w:t>
-            </w:r>
-            <w:proofErr w:type="spellStart"/>
-            <w:r>
-              <w:rPr>
-                <w:rFonts w:ascii="Arial" w:eastAsia="Cambria" w:hAnsi="Arial" w:cs="Arial"/>
-                <w:sz w:val="24"/>
-                <w:szCs w:val="24"/>
-              </w:rPr>
-              <w:t>Dropdown</w:t>
-            </w:r>
-            <w:proofErr w:type="spellEnd"/>
-            <w:r>
-              <w:rPr>
-                <w:rFonts w:ascii="Arial" w:eastAsia="Cambria" w:hAnsi="Arial" w:cs="Arial"/>
-                <w:sz w:val="24"/>
-                <w:szCs w:val="24"/>
-              </w:rPr>
-              <w:t xml:space="preserve"> </w:t>
+              <w:t xml:space="preserve">Modelo | Sí | Texto / Dropdown </w:t>
             </w:r>
           </w:p>
           <w:p>
@@ -11958,7 +11723,6 @@
                 <w:szCs w:val="24"/>
               </w:rPr>
             </w:pPr>
-            <w:proofErr w:type="spellStart"/>
             <w:r>
               <w:rPr>
                 <w:rFonts w:ascii="Arial" w:eastAsia="Cambria" w:hAnsi="Arial" w:cs="Arial"/>
@@ -11968,19 +11732,7 @@
                 <w:sz w:val="24"/>
                 <w:szCs w:val="24"/>
               </w:rPr>
-              <w:t>Definition</w:t>
-            </w:r>
-            <w:proofErr w:type="spellEnd"/>
-            <w:r>
-              <w:rPr>
-                <w:rFonts w:ascii="Arial" w:eastAsia="Cambria" w:hAnsi="Arial" w:cs="Arial"/>
-                <w:b/>
-                <w:bCs/>
-                <w:color w:val="FFFFFF"/>
-                <w:sz w:val="24"/>
-                <w:szCs w:val="24"/>
-              </w:rPr>
-              <w:t xml:space="preserve"> of Done:</w:t>
+              <w:t>Definition of Done:</w:t>
             </w:r>
           </w:p>
         </w:tc>
@@ -12004,41 +11756,13 @@
                 <w:szCs w:val="24"/>
               </w:rPr>
             </w:pPr>
-            <w:proofErr w:type="spellStart"/>
-            <w:r>
-              <w:rPr>
-                <w:rFonts w:ascii="Arial" w:eastAsia="Cambria" w:hAnsi="Arial" w:cs="Arial"/>
-                <w:sz w:val="24"/>
-                <w:szCs w:val="24"/>
-              </w:rPr>
-              <w:t>Endpoint</w:t>
-            </w:r>
-            <w:proofErr w:type="spellEnd"/>
-            <w:r>
-              <w:rPr>
-                <w:rFonts w:ascii="Arial" w:eastAsia="Cambria" w:hAnsi="Arial" w:cs="Arial"/>
-                <w:sz w:val="24"/>
-                <w:szCs w:val="24"/>
-              </w:rPr>
-              <w:t xml:space="preserve"> PUT/PATCH implementado en arquitectura hexagonal con validación de </w:t>
-            </w:r>
-            <w:proofErr w:type="spellStart"/>
-            <w:r>
-              <w:rPr>
-                <w:rFonts w:ascii="Arial" w:eastAsia="Cambria" w:hAnsi="Arial" w:cs="Arial"/>
-                <w:sz w:val="24"/>
-                <w:szCs w:val="24"/>
-              </w:rPr>
-              <w:t>DTOs</w:t>
-            </w:r>
-            <w:proofErr w:type="spellEnd"/>
-            <w:r>
-              <w:rPr>
-                <w:rFonts w:ascii="Arial" w:eastAsia="Cambria" w:hAnsi="Arial" w:cs="Arial"/>
-                <w:sz w:val="24"/>
-                <w:szCs w:val="24"/>
-              </w:rPr>
-              <w:t xml:space="preserve">. </w:t>
+            <w:r>
+              <w:rPr>
+                <w:rFonts w:ascii="Arial" w:eastAsia="Cambria" w:hAnsi="Arial" w:cs="Arial"/>
+                <w:sz w:val="24"/>
+                <w:szCs w:val="24"/>
+              </w:rPr>
+              <w:t xml:space="preserve">Endpoint PUT/PATCH implementado en arquitectura hexagonal con validación de DTOs. </w:t>
             </w:r>
           </w:p>
         </w:tc>
@@ -13411,7 +13135,6 @@
                 <w:szCs w:val="24"/>
               </w:rPr>
             </w:pPr>
-            <w:proofErr w:type="spellStart"/>
             <w:r>
               <w:rPr>
                 <w:rFonts w:ascii="Arial" w:eastAsia="Cambria" w:hAnsi="Arial" w:cs="Arial"/>
@@ -13421,19 +13144,7 @@
                 <w:sz w:val="24"/>
                 <w:szCs w:val="24"/>
               </w:rPr>
-              <w:t>Definition</w:t>
-            </w:r>
-            <w:proofErr w:type="spellEnd"/>
-            <w:r>
-              <w:rPr>
-                <w:rFonts w:ascii="Arial" w:eastAsia="Cambria" w:hAnsi="Arial" w:cs="Arial"/>
-                <w:b/>
-                <w:bCs/>
-                <w:color w:val="FFFFFF"/>
-                <w:sz w:val="24"/>
-                <w:szCs w:val="24"/>
-              </w:rPr>
-              <w:t xml:space="preserve"> of Done:</w:t>
+              <w:t>Definition of Done:</w:t>
             </w:r>
           </w:p>
         </w:tc>
@@ -13759,63 +13470,7 @@
                 <w:sz w:val="24"/>
                 <w:szCs w:val="24"/>
               </w:rPr>
-              <w:t>| CP-RF009-01, CP-RF009-02</w:t>
-            </w:r>
-            <w:r>
-              <w:rPr>
-                <w:rFonts w:ascii="Arial" w:eastAsia="Cambria" w:hAnsi="Arial" w:cs="Arial"/>
-                <w:sz w:val="24"/>
-                <w:szCs w:val="24"/>
-              </w:rPr>
-              <w:t xml:space="preserve">, </w:t>
-            </w:r>
-            <w:r>
-              <w:rPr>
-                <w:rFonts w:ascii="Arial" w:eastAsia="Cambria" w:hAnsi="Arial" w:cs="Arial"/>
-                <w:sz w:val="24"/>
-                <w:szCs w:val="24"/>
-              </w:rPr>
-              <w:t>CP-RF009-03</w:t>
-            </w:r>
-            <w:r>
-              <w:rPr>
-                <w:rFonts w:ascii="Arial" w:eastAsia="Cambria" w:hAnsi="Arial" w:cs="Arial"/>
-                <w:sz w:val="24"/>
-                <w:szCs w:val="24"/>
-              </w:rPr>
-              <w:t xml:space="preserve">, </w:t>
-            </w:r>
-            <w:r>
-              <w:rPr>
-                <w:rFonts w:ascii="Arial" w:eastAsia="Cambria" w:hAnsi="Arial" w:cs="Arial"/>
-                <w:sz w:val="24"/>
-                <w:szCs w:val="24"/>
-              </w:rPr>
-              <w:t>CP-RF009-04</w:t>
-            </w:r>
-            <w:r>
-              <w:rPr>
-                <w:rFonts w:ascii="Arial" w:eastAsia="Cambria" w:hAnsi="Arial" w:cs="Arial"/>
-                <w:sz w:val="24"/>
-                <w:szCs w:val="24"/>
-              </w:rPr>
-              <w:t xml:space="preserve">, </w:t>
-            </w:r>
-            <w:r>
-              <w:rPr>
-                <w:rFonts w:ascii="Arial" w:eastAsia="Cambria" w:hAnsi="Arial" w:cs="Arial"/>
-                <w:sz w:val="24"/>
-                <w:szCs w:val="24"/>
-              </w:rPr>
-              <w:t>CP-RF009-05</w:t>
-            </w:r>
-            <w:r>
-              <w:rPr>
-                <w:rFonts w:ascii="Arial" w:eastAsia="Cambria" w:hAnsi="Arial" w:cs="Arial"/>
-                <w:sz w:val="24"/>
-                <w:szCs w:val="24"/>
-              </w:rPr>
-              <w:t xml:space="preserve"> </w:t>
+              <w:t xml:space="preserve">| CP-RF009-01, CP-RF009-02, CP-RF009-03, CP-RF009-04, CP-RF009-05 </w:t>
             </w:r>
             <w:r>
               <w:rPr>
@@ -14357,25 +14012,7 @@
                 <w:sz w:val="24"/>
                 <w:szCs w:val="24"/>
               </w:rPr>
-              <w:t xml:space="preserve">Quiero: Presionar el botón de retorno o inicio desde cualquier </w:t>
-            </w:r>
-            <w:proofErr w:type="spellStart"/>
-            <w:r>
-              <w:rPr>
-                <w:rFonts w:ascii="Arial" w:eastAsia="Cambria" w:hAnsi="Arial" w:cs="Arial"/>
-                <w:sz w:val="24"/>
-                <w:szCs w:val="24"/>
-              </w:rPr>
-              <w:t>subpantalla</w:t>
-            </w:r>
-            <w:proofErr w:type="spellEnd"/>
-            <w:r>
-              <w:rPr>
-                <w:rFonts w:ascii="Arial" w:eastAsia="Cambria" w:hAnsi="Arial" w:cs="Arial"/>
-                <w:sz w:val="24"/>
-                <w:szCs w:val="24"/>
-              </w:rPr>
-              <w:t>.</w:t>
+              <w:t>Quiero: Presionar el botón de retorno o inicio desde cualquier subpantalla.</w:t>
             </w:r>
           </w:p>
           <w:p>
@@ -14461,43 +14098,7 @@
                 <w:sz w:val="24"/>
                 <w:szCs w:val="24"/>
               </w:rPr>
-              <w:t xml:space="preserve">Gestión de enrutamiento </w:t>
-            </w:r>
-            <w:proofErr w:type="spellStart"/>
-            <w:r>
-              <w:rPr>
-                <w:rFonts w:ascii="Arial" w:eastAsia="Cambria" w:hAnsi="Arial" w:cs="Arial"/>
-                <w:sz w:val="24"/>
-                <w:szCs w:val="24"/>
-              </w:rPr>
-              <w:t>frontend</w:t>
-            </w:r>
-            <w:proofErr w:type="spellEnd"/>
-            <w:r>
-              <w:rPr>
-                <w:rFonts w:ascii="Arial" w:eastAsia="Cambria" w:hAnsi="Arial" w:cs="Arial"/>
-                <w:sz w:val="24"/>
-                <w:szCs w:val="24"/>
-              </w:rPr>
-              <w:t xml:space="preserve"> que conduce a la vista home/dashboard según el rol activo, conservando intacto el token JWT en almacenamiento local/</w:t>
-            </w:r>
-            <w:proofErr w:type="spellStart"/>
-            <w:r>
-              <w:rPr>
-                <w:rFonts w:ascii="Arial" w:eastAsia="Cambria" w:hAnsi="Arial" w:cs="Arial"/>
-                <w:sz w:val="24"/>
-                <w:szCs w:val="24"/>
-              </w:rPr>
-              <w:t>sessionStorage</w:t>
-            </w:r>
-            <w:proofErr w:type="spellEnd"/>
-            <w:r>
-              <w:rPr>
-                <w:rFonts w:ascii="Arial" w:eastAsia="Cambria" w:hAnsi="Arial" w:cs="Arial"/>
-                <w:sz w:val="24"/>
-                <w:szCs w:val="24"/>
-              </w:rPr>
-              <w:t xml:space="preserve">. </w:t>
+              <w:t xml:space="preserve">Gestión de enrutamiento frontend que conduce a la vista home/dashboard según el rol activo, conservando intacto el token JWT en almacenamiento local/sessionStorage. </w:t>
             </w:r>
           </w:p>
         </w:tc>
@@ -14740,25 +14341,7 @@
                 <w:sz w:val="24"/>
                 <w:szCs w:val="24"/>
               </w:rPr>
-              <w:t xml:space="preserve">CA-002 Token caducado o inválido Dado que el token JWT del usuario expiró mientras navegaba, Cuando intente presionar el botón de retorno, Entonces el sistema detectará el error 401 </w:t>
-            </w:r>
-            <w:proofErr w:type="spellStart"/>
-            <w:r>
-              <w:rPr>
-                <w:rFonts w:ascii="Arial" w:eastAsia="Cambria" w:hAnsi="Arial" w:cs="Arial"/>
-                <w:sz w:val="24"/>
-                <w:szCs w:val="24"/>
-              </w:rPr>
-              <w:t>Unauthorized</w:t>
-            </w:r>
-            <w:proofErr w:type="spellEnd"/>
-            <w:r>
-              <w:rPr>
-                <w:rFonts w:ascii="Arial" w:eastAsia="Cambria" w:hAnsi="Arial" w:cs="Arial"/>
-                <w:sz w:val="24"/>
-                <w:szCs w:val="24"/>
-              </w:rPr>
-              <w:t xml:space="preserve"> y lo redirigirá automáticamente a la pantalla de Login. </w:t>
+              <w:t xml:space="preserve">CA-002 Token caducado o inválido Dado que el token JWT del usuario expiró mientras navegaba, Cuando intente presionar el botón de retorno, Entonces el sistema detectará el error 401 Unauthorized y lo redirigirá automáticamente a la pantalla de Login. </w:t>
             </w:r>
           </w:p>
         </w:tc>
@@ -14924,7 +14507,6 @@
                 <w:szCs w:val="24"/>
               </w:rPr>
             </w:pPr>
-            <w:proofErr w:type="spellStart"/>
             <w:r>
               <w:rPr>
                 <w:rFonts w:ascii="Arial" w:eastAsia="Cambria" w:hAnsi="Arial" w:cs="Arial"/>
@@ -14934,19 +14516,7 @@
                 <w:sz w:val="24"/>
                 <w:szCs w:val="24"/>
               </w:rPr>
-              <w:t>Definition</w:t>
-            </w:r>
-            <w:proofErr w:type="spellEnd"/>
-            <w:r>
-              <w:rPr>
-                <w:rFonts w:ascii="Arial" w:eastAsia="Cambria" w:hAnsi="Arial" w:cs="Arial"/>
-                <w:b/>
-                <w:bCs/>
-                <w:color w:val="FFFFFF"/>
-                <w:sz w:val="24"/>
-                <w:szCs w:val="24"/>
-              </w:rPr>
-              <w:t xml:space="preserve"> of Done:</w:t>
+              <w:t>Definition of Done:</w:t>
             </w:r>
           </w:p>
         </w:tc>
@@ -14976,25 +14546,7 @@
                 <w:sz w:val="24"/>
                 <w:szCs w:val="24"/>
               </w:rPr>
-              <w:t xml:space="preserve">Enrutamiento en SPA (Single Page </w:t>
-            </w:r>
-            <w:proofErr w:type="spellStart"/>
-            <w:r>
-              <w:rPr>
-                <w:rFonts w:ascii="Arial" w:eastAsia="Cambria" w:hAnsi="Arial" w:cs="Arial"/>
-                <w:sz w:val="24"/>
-                <w:szCs w:val="24"/>
-              </w:rPr>
-              <w:t>Application</w:t>
-            </w:r>
-            <w:proofErr w:type="spellEnd"/>
-            <w:r>
-              <w:rPr>
-                <w:rFonts w:ascii="Arial" w:eastAsia="Cambria" w:hAnsi="Arial" w:cs="Arial"/>
-                <w:sz w:val="24"/>
-                <w:szCs w:val="24"/>
-              </w:rPr>
-              <w:t xml:space="preserve">) sin recarga completa de página. </w:t>
+              <w:t xml:space="preserve">Enrutamiento en SPA (Single Page Application) sin recarga completa de página. </w:t>
             </w:r>
           </w:p>
         </w:tc>
@@ -15290,79 +14842,23 @@
                 <w:sz w:val="24"/>
                 <w:szCs w:val="24"/>
               </w:rPr>
-              <w:t>CP-RF010-01, CP-RF010-02</w:t>
-            </w:r>
-            <w:r>
-              <w:rPr>
-                <w:rFonts w:ascii="Arial" w:eastAsia="Cambria" w:hAnsi="Arial" w:cs="Arial"/>
-                <w:sz w:val="24"/>
-                <w:szCs w:val="24"/>
-              </w:rPr>
-              <w:t>,</w:t>
-            </w:r>
-            <w:r>
-              <w:rPr>
-                <w:rFonts w:ascii="Arial" w:eastAsia="Cambria" w:hAnsi="Arial" w:cs="Arial"/>
-                <w:sz w:val="24"/>
-                <w:szCs w:val="24"/>
-              </w:rPr>
-              <w:t xml:space="preserve"> </w:t>
-            </w:r>
-            <w:r>
-              <w:rPr>
-                <w:rFonts w:ascii="Arial" w:eastAsia="Cambria" w:hAnsi="Arial" w:cs="Arial"/>
-                <w:sz w:val="24"/>
-                <w:szCs w:val="24"/>
-              </w:rPr>
-              <w:t>CP-RF010-0</w:t>
-            </w:r>
-            <w:r>
-              <w:rPr>
-                <w:rFonts w:ascii="Arial" w:eastAsia="Cambria" w:hAnsi="Arial" w:cs="Arial"/>
-                <w:sz w:val="24"/>
-                <w:szCs w:val="24"/>
-              </w:rPr>
-              <w:t>3</w:t>
-            </w:r>
-            <w:r>
-              <w:rPr>
-                <w:rFonts w:ascii="Arial" w:eastAsia="Cambria" w:hAnsi="Arial" w:cs="Arial"/>
-                <w:sz w:val="24"/>
-                <w:szCs w:val="24"/>
-              </w:rPr>
-              <w:t>,</w:t>
-            </w:r>
-            <w:r>
-              <w:rPr>
-                <w:rFonts w:ascii="Arial" w:eastAsia="Cambria" w:hAnsi="Arial" w:cs="Arial"/>
-                <w:sz w:val="24"/>
-                <w:szCs w:val="24"/>
-              </w:rPr>
-              <w:t>CP-RF010-04</w:t>
-            </w:r>
-            <w:r>
-              <w:rPr>
-                <w:rFonts w:ascii="Arial" w:eastAsia="Cambria" w:hAnsi="Arial" w:cs="Arial"/>
-                <w:sz w:val="24"/>
-                <w:szCs w:val="24"/>
-              </w:rPr>
-              <w:t>,</w:t>
-            </w:r>
-            <w:r>
-              <w:rPr>
-                <w:rFonts w:ascii="Arial" w:eastAsia="Cambria" w:hAnsi="Arial" w:cs="Arial"/>
-                <w:sz w:val="24"/>
-                <w:szCs w:val="24"/>
-              </w:rPr>
-              <w:t xml:space="preserve"> </w:t>
-            </w:r>
-            <w:r>
-              <w:rPr>
-                <w:rFonts w:ascii="Arial" w:eastAsia="Cambria" w:hAnsi="Arial" w:cs="Arial"/>
-                <w:sz w:val="24"/>
-                <w:szCs w:val="24"/>
-              </w:rPr>
-              <w:t>CP-RF010-0</w:t>
+              <w:t xml:space="preserve">CP-RF010-01, CP-RF010-02, </w:t>
+            </w:r>
+            <w:r>
+              <w:rPr>
+                <w:rFonts w:ascii="Arial" w:eastAsia="Cambria" w:hAnsi="Arial" w:cs="Arial"/>
+                <w:sz w:val="24"/>
+                <w:szCs w:val="24"/>
+              </w:rPr>
+              <w:t>CP-RF010-03,</w:t>
+            </w:r>
+            <w:r>
+              <w:rPr>
+                <w:rFonts w:ascii="Arial" w:eastAsia="Cambria" w:hAnsi="Arial" w:cs="Arial"/>
+                <w:sz w:val="24"/>
+                <w:szCs w:val="24"/>
+              </w:rPr>
+              <w:t>CP-RF010-04, CP-RF010-0</w:t>
             </w:r>
             <w:r>
               <w:rPr>
@@ -16425,7 +15921,6 @@
                 <w:szCs w:val="24"/>
               </w:rPr>
             </w:pPr>
-            <w:proofErr w:type="spellStart"/>
             <w:r>
               <w:rPr>
                 <w:rFonts w:ascii="Arial" w:eastAsia="Cambria" w:hAnsi="Arial" w:cs="Arial"/>
@@ -16435,19 +15930,7 @@
                 <w:sz w:val="24"/>
                 <w:szCs w:val="24"/>
               </w:rPr>
-              <w:t>Definition</w:t>
-            </w:r>
-            <w:proofErr w:type="spellEnd"/>
-            <w:r>
-              <w:rPr>
-                <w:rFonts w:ascii="Arial" w:eastAsia="Cambria" w:hAnsi="Arial" w:cs="Arial"/>
-                <w:b/>
-                <w:bCs/>
-                <w:color w:val="FFFFFF"/>
-                <w:sz w:val="24"/>
-                <w:szCs w:val="24"/>
-              </w:rPr>
-              <w:t xml:space="preserve"> of Done:</w:t>
+              <w:t>Definition of Done:</w:t>
             </w:r>
           </w:p>
         </w:tc>
@@ -16477,43 +15960,7 @@
                 <w:sz w:val="24"/>
                 <w:szCs w:val="24"/>
               </w:rPr>
-              <w:t xml:space="preserve">Integración entre el módulo de usuario/vehículos y el </w:t>
-            </w:r>
-            <w:proofErr w:type="spellStart"/>
-            <w:r>
-              <w:rPr>
-                <w:rFonts w:ascii="Arial" w:eastAsia="Cambria" w:hAnsi="Arial" w:cs="Arial"/>
-                <w:sz w:val="24"/>
-                <w:szCs w:val="24"/>
-              </w:rPr>
-              <w:t>frontend</w:t>
-            </w:r>
-            <w:proofErr w:type="spellEnd"/>
-            <w:r>
-              <w:rPr>
-                <w:rFonts w:ascii="Arial" w:eastAsia="Cambria" w:hAnsi="Arial" w:cs="Arial"/>
-                <w:sz w:val="24"/>
-                <w:szCs w:val="24"/>
-              </w:rPr>
-              <w:t xml:space="preserve"> </w:t>
-            </w:r>
-            <w:proofErr w:type="gramStart"/>
-            <w:r>
-              <w:rPr>
-                <w:rFonts w:ascii="Arial" w:eastAsia="Cambria" w:hAnsi="Arial" w:cs="Arial"/>
-                <w:sz w:val="24"/>
-                <w:szCs w:val="24"/>
-              </w:rPr>
-              <w:t>del asistente probada</w:t>
-            </w:r>
-            <w:proofErr w:type="gramEnd"/>
-            <w:r>
-              <w:rPr>
-                <w:rFonts w:ascii="Arial" w:eastAsia="Cambria" w:hAnsi="Arial" w:cs="Arial"/>
-                <w:sz w:val="24"/>
-                <w:szCs w:val="24"/>
-              </w:rPr>
-              <w:t xml:space="preserve">. </w:t>
+              <w:t xml:space="preserve">Integración entre el módulo de usuario/vehículos y el frontend del asistente probada. </w:t>
             </w:r>
           </w:p>
         </w:tc>
@@ -16891,7 +16338,6 @@
       <w:tblPr>
         <w:tblW w:w="0" w:type="auto"/>
         <w:jc w:val="center"/>
-        <w:tblInd w:w="-226" w:type="dxa"/>
         <w:tblBorders>
           <w:top w:val="single" w:sz="4" w:space="0" w:color="D3D3D3"/>
           <w:left w:val="single" w:sz="4" w:space="0" w:color="D3D3D3"/>
@@ -18037,27 +17483,7 @@
                 <w:sz w:val="24"/>
                 <w:szCs w:val="24"/>
               </w:rPr>
-              <w:t xml:space="preserve">CA-003 Adaptabilidad y </w:t>
-            </w:r>
-            <w:proofErr w:type="spellStart"/>
-            <w:r>
-              <w:rPr>
-                <w:rFonts w:ascii="Arial" w:hAnsi="Arial" w:cs="Arial"/>
-                <w:b/>
-                <w:sz w:val="24"/>
-                <w:szCs w:val="24"/>
-              </w:rPr>
-              <w:t>multi</w:t>
-            </w:r>
-            <w:proofErr w:type="spellEnd"/>
-            <w:r>
-              <w:rPr>
-                <w:rFonts w:ascii="Arial" w:hAnsi="Arial" w:cs="Arial"/>
-                <w:b/>
-                <w:sz w:val="24"/>
-                <w:szCs w:val="24"/>
-              </w:rPr>
-              <w:t>-navegador</w:t>
+              <w:t>CA-003 Adaptabilidad y multi-navegador</w:t>
             </w:r>
           </w:p>
           <w:p>
@@ -18288,25 +17714,7 @@
                 <w:sz w:val="24"/>
                 <w:szCs w:val="24"/>
               </w:rPr>
-              <w:t xml:space="preserve">MOCK-012 Pantalla de Generación y </w:t>
-            </w:r>
-            <w:proofErr w:type="spellStart"/>
-            <w:r>
-              <w:rPr>
-                <w:rFonts w:ascii="Arial" w:hAnsi="Arial" w:cs="Arial"/>
-                <w:sz w:val="24"/>
-                <w:szCs w:val="24"/>
-              </w:rPr>
-              <w:t>Recomendador</w:t>
-            </w:r>
-            <w:proofErr w:type="spellEnd"/>
-            <w:r>
-              <w:rPr>
-                <w:rFonts w:ascii="Arial" w:hAnsi="Arial" w:cs="Arial"/>
-                <w:sz w:val="24"/>
-                <w:szCs w:val="24"/>
-              </w:rPr>
-              <w:t xml:space="preserve"> de IA</w:t>
+              <w:t>MOCK-012 Pantalla de Generación y Recomendador de IA</w:t>
             </w:r>
           </w:p>
         </w:tc>
@@ -18342,7 +17750,6 @@
                 <w:szCs w:val="24"/>
               </w:rPr>
             </w:pPr>
-            <w:proofErr w:type="spellStart"/>
             <w:r>
               <w:rPr>
                 <w:rFonts w:ascii="Arial" w:hAnsi="Arial" w:cs="Arial"/>
@@ -18351,18 +17758,7 @@
                 <w:sz w:val="24"/>
                 <w:szCs w:val="24"/>
               </w:rPr>
-              <w:t>Definition</w:t>
-            </w:r>
-            <w:proofErr w:type="spellEnd"/>
-            <w:r>
-              <w:rPr>
-                <w:rFonts w:ascii="Arial" w:hAnsi="Arial" w:cs="Arial"/>
-                <w:b/>
-                <w:color w:val="FFFFFF" w:themeColor="background1"/>
-                <w:sz w:val="24"/>
-                <w:szCs w:val="24"/>
-              </w:rPr>
-              <w:t xml:space="preserve"> of Done:</w:t>
+              <w:t>Definition of Done:</w:t>
             </w:r>
           </w:p>
         </w:tc>
@@ -20063,7 +19459,6 @@
                 <w:szCs w:val="24"/>
               </w:rPr>
             </w:pPr>
-            <w:proofErr w:type="spellStart"/>
             <w:r>
               <w:rPr>
                 <w:rFonts w:ascii="Arial" w:hAnsi="Arial" w:cs="Arial"/>
@@ -20072,18 +19467,7 @@
                 <w:sz w:val="24"/>
                 <w:szCs w:val="24"/>
               </w:rPr>
-              <w:t>Definition</w:t>
-            </w:r>
-            <w:proofErr w:type="spellEnd"/>
-            <w:r>
-              <w:rPr>
-                <w:rFonts w:ascii="Arial" w:hAnsi="Arial" w:cs="Arial"/>
-                <w:b/>
-                <w:color w:val="FFFFFF" w:themeColor="background1"/>
-                <w:sz w:val="24"/>
-                <w:szCs w:val="24"/>
-              </w:rPr>
-              <w:t xml:space="preserve"> of Done:</w:t>
+              <w:t>Definition of Done:</w:t>
             </w:r>
           </w:p>
         </w:tc>
@@ -20166,25 +19550,7 @@
                 <w:sz w:val="24"/>
                 <w:szCs w:val="24"/>
               </w:rPr>
-              <w:t xml:space="preserve">• Pruebas de </w:t>
-            </w:r>
-            <w:proofErr w:type="gramStart"/>
-            <w:r>
-              <w:rPr>
-                <w:rFonts w:ascii="Arial" w:hAnsi="Arial" w:cs="Arial"/>
-                <w:sz w:val="24"/>
-                <w:szCs w:val="24"/>
-              </w:rPr>
-              <w:t>carga menores</w:t>
-            </w:r>
-            <w:proofErr w:type="gramEnd"/>
-            <w:r>
-              <w:rPr>
-                <w:rFonts w:ascii="Arial" w:hAnsi="Arial" w:cs="Arial"/>
-                <w:sz w:val="24"/>
-                <w:szCs w:val="24"/>
-              </w:rPr>
-              <w:t xml:space="preserve"> a 2 segundos exitosas (RNF01).</w:t>
+              <w:t>• Pruebas de carga menores a 2 segundos exitosas (RNF01).</w:t>
             </w:r>
           </w:p>
         </w:tc>
@@ -21641,7 +21007,6 @@
                 <w:szCs w:val="24"/>
               </w:rPr>
             </w:pPr>
-            <w:proofErr w:type="spellStart"/>
             <w:r>
               <w:rPr>
                 <w:rFonts w:ascii="Arial" w:hAnsi="Arial" w:cs="Arial"/>
@@ -21650,18 +21015,7 @@
                 <w:sz w:val="24"/>
                 <w:szCs w:val="24"/>
               </w:rPr>
-              <w:t>Definition</w:t>
-            </w:r>
-            <w:proofErr w:type="spellEnd"/>
-            <w:r>
-              <w:rPr>
-                <w:rFonts w:ascii="Arial" w:hAnsi="Arial" w:cs="Arial"/>
-                <w:b/>
-                <w:color w:val="FFFFFF" w:themeColor="background1"/>
-                <w:sz w:val="24"/>
-                <w:szCs w:val="24"/>
-              </w:rPr>
-              <w:t xml:space="preserve"> of Done:</w:t>
+              <w:t>Definition of Done:</w:t>
             </w:r>
           </w:p>
         </w:tc>
@@ -22962,25 +22316,7 @@
                 <w:sz w:val="24"/>
                 <w:szCs w:val="24"/>
               </w:rPr>
-              <w:t>Cantidad (</w:t>
-            </w:r>
-            <w:proofErr w:type="gramStart"/>
-            <w:r>
-              <w:rPr>
-                <w:rFonts w:ascii="Arial" w:hAnsi="Arial" w:cs="Arial"/>
-                <w:sz w:val="24"/>
-                <w:szCs w:val="24"/>
-              </w:rPr>
-              <w:t>Obligatorio, numérico</w:t>
-            </w:r>
-            <w:proofErr w:type="gramEnd"/>
-            <w:r>
-              <w:rPr>
-                <w:rFonts w:ascii="Arial" w:hAnsi="Arial" w:cs="Arial"/>
-                <w:sz w:val="24"/>
-                <w:szCs w:val="24"/>
-              </w:rPr>
-              <w:t>).</w:t>
+              <w:t>Cantidad (Obligatorio, numérico).</w:t>
             </w:r>
           </w:p>
           <w:p>
@@ -23528,7 +22864,6 @@
                 <w:szCs w:val="24"/>
               </w:rPr>
             </w:pPr>
-            <w:proofErr w:type="spellStart"/>
             <w:r>
               <w:rPr>
                 <w:rFonts w:ascii="Arial" w:hAnsi="Arial" w:cs="Arial"/>
@@ -23537,18 +22872,7 @@
                 <w:sz w:val="24"/>
                 <w:szCs w:val="24"/>
               </w:rPr>
-              <w:t>Definition</w:t>
-            </w:r>
-            <w:proofErr w:type="spellEnd"/>
-            <w:r>
-              <w:rPr>
-                <w:rFonts w:ascii="Arial" w:hAnsi="Arial" w:cs="Arial"/>
-                <w:b/>
-                <w:color w:val="FFFFFF" w:themeColor="background1"/>
-                <w:sz w:val="24"/>
-                <w:szCs w:val="24"/>
-              </w:rPr>
-              <w:t xml:space="preserve"> of Done:</w:t>
+              <w:t>Definition of Done:</w:t>
             </w:r>
           </w:p>
         </w:tc>
@@ -23798,25 +23122,7 @@
                 <w:sz w:val="24"/>
                 <w:szCs w:val="24"/>
               </w:rPr>
-              <w:t xml:space="preserve">CP-015-05    Validar </w:t>
-            </w:r>
-            <w:proofErr w:type="spellStart"/>
-            <w:r>
-              <w:rPr>
-                <w:rFonts w:ascii="Arial" w:hAnsi="Arial" w:cs="Arial"/>
-                <w:sz w:val="24"/>
-                <w:szCs w:val="24"/>
-              </w:rPr>
-              <w:t>resiliencia</w:t>
-            </w:r>
-            <w:proofErr w:type="spellEnd"/>
-            <w:r>
-              <w:rPr>
-                <w:rFonts w:ascii="Arial" w:hAnsi="Arial" w:cs="Arial"/>
-                <w:sz w:val="24"/>
-                <w:szCs w:val="24"/>
-              </w:rPr>
-              <w:t xml:space="preserve"> ante fallo externo</w:t>
+              <w:t>CP-015-05    Validar resiliencia ante fallo externo</w:t>
             </w:r>
           </w:p>
         </w:tc>
@@ -24817,25 +24123,7 @@
                 <w:sz w:val="24"/>
                 <w:szCs w:val="24"/>
               </w:rPr>
-              <w:t>Fecha y hora (</w:t>
-            </w:r>
-            <w:proofErr w:type="spellStart"/>
-            <w:r>
-              <w:rPr>
-                <w:rFonts w:ascii="Arial" w:hAnsi="Arial" w:cs="Arial"/>
-                <w:sz w:val="24"/>
-                <w:szCs w:val="24"/>
-              </w:rPr>
-              <w:t>Timestamp</w:t>
-            </w:r>
-            <w:proofErr w:type="spellEnd"/>
-            <w:r>
-              <w:rPr>
-                <w:rFonts w:ascii="Arial" w:hAnsi="Arial" w:cs="Arial"/>
-                <w:sz w:val="24"/>
-                <w:szCs w:val="24"/>
-              </w:rPr>
-              <w:t>) (Captura automática).</w:t>
+              <w:t>Fecha y hora (Timestamp) (Captura automática).</w:t>
             </w:r>
           </w:p>
         </w:tc>
@@ -25204,7 +24492,6 @@
                 <w:szCs w:val="24"/>
               </w:rPr>
             </w:pPr>
-            <w:proofErr w:type="spellStart"/>
             <w:r>
               <w:rPr>
                 <w:rFonts w:ascii="Arial" w:hAnsi="Arial" w:cs="Arial"/>
@@ -25213,18 +24500,7 @@
                 <w:sz w:val="24"/>
                 <w:szCs w:val="24"/>
               </w:rPr>
-              <w:t>Definition</w:t>
-            </w:r>
-            <w:proofErr w:type="spellEnd"/>
-            <w:r>
-              <w:rPr>
-                <w:rFonts w:ascii="Arial" w:hAnsi="Arial" w:cs="Arial"/>
-                <w:b/>
-                <w:color w:val="FFFFFF" w:themeColor="background1"/>
-                <w:sz w:val="24"/>
-                <w:szCs w:val="24"/>
-              </w:rPr>
-              <w:t xml:space="preserve"> of Done:</w:t>
+              <w:t>Definition of Done:</w:t>
             </w:r>
           </w:p>
         </w:tc>
@@ -26915,7 +26191,6 @@
                 <w:szCs w:val="24"/>
               </w:rPr>
             </w:pPr>
-            <w:proofErr w:type="spellStart"/>
             <w:r>
               <w:rPr>
                 <w:rFonts w:ascii="Arial" w:hAnsi="Arial" w:cs="Arial"/>
@@ -26924,18 +26199,7 @@
                 <w:sz w:val="24"/>
                 <w:szCs w:val="24"/>
               </w:rPr>
-              <w:t>Definition</w:t>
-            </w:r>
-            <w:proofErr w:type="spellEnd"/>
-            <w:r>
-              <w:rPr>
-                <w:rFonts w:ascii="Arial" w:hAnsi="Arial" w:cs="Arial"/>
-                <w:b/>
-                <w:color w:val="FFFFFF" w:themeColor="background1"/>
-                <w:sz w:val="24"/>
-                <w:szCs w:val="24"/>
-              </w:rPr>
-              <w:t xml:space="preserve"> of Done:</w:t>
+              <w:t>Definition of Done:</w:t>
             </w:r>
           </w:p>
         </w:tc>
@@ -29013,7 +28277,6 @@
                 <w:sz w:val="24"/>
                 <w:szCs w:val="24"/>
               </w:rPr>
-              <w:lastRenderedPageBreak/>
               <w:t>Actor Principal:</w:t>
             </w:r>
           </w:p>
@@ -31576,43 +30839,7 @@
                 <w:sz w:val="24"/>
                 <w:szCs w:val="24"/>
               </w:rPr>
-              <w:t>RNF01 (Rendimiento), RNF06 (</w:t>
-            </w:r>
-            <w:proofErr w:type="spellStart"/>
-            <w:r>
-              <w:rPr>
-                <w:rFonts w:ascii="Arial" w:eastAsia="Calibri" w:hAnsi="Arial" w:cs="Arial"/>
-                <w:sz w:val="24"/>
-                <w:szCs w:val="24"/>
-              </w:rPr>
-              <w:t>Multi</w:t>
-            </w:r>
-            <w:proofErr w:type="spellEnd"/>
-            <w:r>
-              <w:rPr>
-                <w:rFonts w:ascii="Arial" w:eastAsia="Calibri" w:hAnsi="Arial" w:cs="Arial"/>
-                <w:sz w:val="24"/>
-                <w:szCs w:val="24"/>
-              </w:rPr>
-              <w:t xml:space="preserve">-navegador / </w:t>
-            </w:r>
-            <w:proofErr w:type="spellStart"/>
-            <w:r>
-              <w:rPr>
-                <w:rFonts w:ascii="Arial" w:eastAsia="Calibri" w:hAnsi="Arial" w:cs="Arial"/>
-                <w:sz w:val="24"/>
-                <w:szCs w:val="24"/>
-              </w:rPr>
-              <w:t>Responsive</w:t>
-            </w:r>
-            <w:proofErr w:type="spellEnd"/>
-            <w:r>
-              <w:rPr>
-                <w:rFonts w:ascii="Arial" w:eastAsia="Calibri" w:hAnsi="Arial" w:cs="Arial"/>
-                <w:sz w:val="24"/>
-                <w:szCs w:val="24"/>
-              </w:rPr>
-              <w:t xml:space="preserve">). </w:t>
+              <w:t xml:space="preserve">RNF01 (Rendimiento), RNF06 (Multi-navegador / Responsive). </w:t>
             </w:r>
           </w:p>
         </w:tc>
@@ -32594,25 +31821,7 @@
                 <w:sz w:val="24"/>
                 <w:szCs w:val="24"/>
               </w:rPr>
-              <w:t xml:space="preserve">El sistema </w:t>
-            </w:r>
-            <w:proofErr w:type="gramStart"/>
-            <w:r>
-              <w:rPr>
-                <w:rFonts w:ascii="Arial" w:eastAsia="Calibri" w:hAnsi="Arial" w:cs="Arial"/>
-                <w:sz w:val="24"/>
-                <w:szCs w:val="24"/>
-              </w:rPr>
-              <w:t>valida</w:t>
-            </w:r>
-            <w:proofErr w:type="gramEnd"/>
-            <w:r>
-              <w:rPr>
-                <w:rFonts w:ascii="Arial" w:eastAsia="Calibri" w:hAnsi="Arial" w:cs="Arial"/>
-                <w:sz w:val="24"/>
-                <w:szCs w:val="24"/>
-              </w:rPr>
-              <w:t xml:space="preserve"> que el cliente en sesión sea el propietario de la PQRS o posea rol Administrador.</w:t>
+              <w:t>El sistema valida que el cliente en sesión sea el propietario de la PQRS o posea rol Administrador.</w:t>
             </w:r>
           </w:p>
           <w:p>
@@ -34082,25 +33291,7 @@
                 <w:sz w:val="24"/>
                 <w:szCs w:val="24"/>
               </w:rPr>
-              <w:t xml:space="preserve">El sistema </w:t>
-            </w:r>
-            <w:proofErr w:type="gramStart"/>
-            <w:r>
-              <w:rPr>
-                <w:rFonts w:ascii="Arial" w:eastAsia="Calibri" w:hAnsi="Arial" w:cs="Arial"/>
-                <w:sz w:val="24"/>
-                <w:szCs w:val="24"/>
-              </w:rPr>
-              <w:t>valida</w:t>
-            </w:r>
-            <w:proofErr w:type="gramEnd"/>
-            <w:r>
-              <w:rPr>
-                <w:rFonts w:ascii="Arial" w:eastAsia="Calibri" w:hAnsi="Arial" w:cs="Arial"/>
-                <w:sz w:val="24"/>
-                <w:szCs w:val="24"/>
-              </w:rPr>
-              <w:t xml:space="preserve"> que el campo de respuesta no esté vacío.</w:t>
+              <w:t>El sistema valida que el campo de respuesta no esté vacío.</w:t>
             </w:r>
           </w:p>
           <w:p>
@@ -34562,25 +33753,7 @@
                 <w:sz w:val="24"/>
                 <w:szCs w:val="24"/>
               </w:rPr>
-              <w:t xml:space="preserve">RN22.1: La respuesta debe quedar firmada digitalmente con el usuario </w:t>
-            </w:r>
-            <w:proofErr w:type="spellStart"/>
-            <w:r>
-              <w:rPr>
-                <w:rFonts w:ascii="Arial" w:eastAsia="Calibri" w:hAnsi="Arial" w:cs="Arial"/>
-                <w:sz w:val="24"/>
-                <w:szCs w:val="24"/>
-              </w:rPr>
-              <w:t>admin</w:t>
-            </w:r>
-            <w:proofErr w:type="spellEnd"/>
-            <w:r>
-              <w:rPr>
-                <w:rFonts w:ascii="Arial" w:eastAsia="Calibri" w:hAnsi="Arial" w:cs="Arial"/>
-                <w:sz w:val="24"/>
-                <w:szCs w:val="24"/>
-              </w:rPr>
-              <w:t xml:space="preserve"> y la marca de tiempo correspondiente.</w:t>
+              <w:t>RN22.1: La respuesta debe quedar firmada digitalmente con el usuario admin y la marca de tiempo correspondiente.</w:t>
             </w:r>
           </w:p>
         </w:tc>
@@ -35245,49 +34418,15 @@
                 <w:szCs w:val="24"/>
               </w:rPr>
             </w:pPr>
-            <w:proofErr w:type="spellStart"/>
-            <w:r>
-              <w:rPr>
-                <w:rFonts w:ascii="Arial" w:hAnsi="Arial" w:cs="Arial"/>
-                <w:b/>
-                <w:bCs/>
-                <w:sz w:val="24"/>
-                <w:szCs w:val="24"/>
-              </w:rPr>
-              <w:t>Story</w:t>
-            </w:r>
-            <w:proofErr w:type="spellEnd"/>
-            <w:r>
-              <w:rPr>
-                <w:rFonts w:ascii="Arial" w:hAnsi="Arial" w:cs="Arial"/>
-                <w:b/>
-                <w:bCs/>
-                <w:sz w:val="24"/>
-                <w:szCs w:val="24"/>
-              </w:rPr>
-              <w:t xml:space="preserve"> </w:t>
-            </w:r>
-            <w:proofErr w:type="spellStart"/>
-            <w:r>
-              <w:rPr>
-                <w:rFonts w:ascii="Arial" w:hAnsi="Arial" w:cs="Arial"/>
-                <w:b/>
-                <w:bCs/>
-                <w:sz w:val="24"/>
-                <w:szCs w:val="24"/>
-              </w:rPr>
-              <w:t>Points</w:t>
-            </w:r>
-            <w:proofErr w:type="spellEnd"/>
-            <w:r>
-              <w:rPr>
-                <w:rFonts w:ascii="Arial" w:hAnsi="Arial" w:cs="Arial"/>
-                <w:b/>
-                <w:bCs/>
-                <w:sz w:val="24"/>
-                <w:szCs w:val="24"/>
-              </w:rPr>
-              <w:t>:</w:t>
+            <w:r>
+              <w:rPr>
+                <w:rFonts w:ascii="Arial" w:hAnsi="Arial" w:cs="Arial"/>
+                <w:b/>
+                <w:bCs/>
+                <w:sz w:val="24"/>
+                <w:szCs w:val="24"/>
+              </w:rPr>
+              <w:t>Story Points:</w:t>
             </w:r>
           </w:p>
         </w:tc>
@@ -35502,25 +34641,7 @@
                 <w:sz w:val="24"/>
                 <w:szCs w:val="24"/>
               </w:rPr>
-              <w:t xml:space="preserve">El sistema presenta una interfaz con un selector interactivo de 1 a 5 estrellas para evaluar el servicio técnico completado. El cliente selecciona la cantidad de estrellas y confirma presionando "Guardar Calificación". El sistema </w:t>
-            </w:r>
-            <w:proofErr w:type="gramStart"/>
-            <w:r>
-              <w:rPr>
-                <w:rFonts w:ascii="Arial" w:hAnsi="Arial" w:cs="Arial"/>
-                <w:sz w:val="24"/>
-                <w:szCs w:val="24"/>
-              </w:rPr>
-              <w:t>valida</w:t>
-            </w:r>
-            <w:proofErr w:type="gramEnd"/>
-            <w:r>
-              <w:rPr>
-                <w:rFonts w:ascii="Arial" w:hAnsi="Arial" w:cs="Arial"/>
-                <w:sz w:val="24"/>
-                <w:szCs w:val="24"/>
-              </w:rPr>
-              <w:t xml:space="preserve"> que se haya seleccionado un valor entero entre 1 y 5, que la sesión esté activa y que exista un servicio técnico previo seleccionado. Si la validación es correcta, almacena el puntaje en la base de datos asociado al registro del servicio y notifica en pantalla la confirmación del registro.</w:t>
+              <w:t>El sistema presenta una interfaz con un selector interactivo de 1 a 5 estrellas para evaluar el servicio técnico completado. El cliente selecciona la cantidad de estrellas y confirma presionando "Guardar Calificación". El sistema valida que se haya seleccionado un valor entero entre 1 y 5, que la sesión esté activa y que exista un servicio técnico previo seleccionado. Si la validación es correcta, almacena el puntaje en la base de datos asociado al registro del servicio y notifica en pantalla la confirmación del registro.</w:t>
             </w:r>
           </w:p>
         </w:tc>
@@ -35982,27 +35103,15 @@
                 <w:szCs w:val="24"/>
               </w:rPr>
             </w:pPr>
-            <w:proofErr w:type="spellStart"/>
-            <w:r>
-              <w:rPr>
-                <w:rFonts w:ascii="Arial" w:hAnsi="Arial" w:cs="Arial"/>
-                <w:b/>
-                <w:bCs/>
-                <w:sz w:val="24"/>
-                <w:szCs w:val="24"/>
-              </w:rPr>
-              <w:t>Mockups</w:t>
-            </w:r>
-            <w:proofErr w:type="spellEnd"/>
-            <w:r>
-              <w:rPr>
-                <w:rFonts w:ascii="Arial" w:hAnsi="Arial" w:cs="Arial"/>
-                <w:b/>
-                <w:bCs/>
-                <w:sz w:val="24"/>
-                <w:szCs w:val="24"/>
-              </w:rPr>
-              <w:t>:</w:t>
+            <w:r>
+              <w:rPr>
+                <w:rFonts w:ascii="Arial" w:hAnsi="Arial" w:cs="Arial"/>
+                <w:b/>
+                <w:bCs/>
+                <w:sz w:val="24"/>
+                <w:szCs w:val="24"/>
+              </w:rPr>
+              <w:t>Mockups:</w:t>
             </w:r>
           </w:p>
         </w:tc>
@@ -36067,27 +35176,15 @@
                 <w:szCs w:val="24"/>
               </w:rPr>
             </w:pPr>
-            <w:proofErr w:type="spellStart"/>
-            <w:r>
-              <w:rPr>
-                <w:rFonts w:ascii="Arial" w:hAnsi="Arial" w:cs="Arial"/>
-                <w:b/>
-                <w:bCs/>
-                <w:sz w:val="24"/>
-                <w:szCs w:val="24"/>
-              </w:rPr>
-              <w:t>Definition</w:t>
-            </w:r>
-            <w:proofErr w:type="spellEnd"/>
-            <w:r>
-              <w:rPr>
-                <w:rFonts w:ascii="Arial" w:hAnsi="Arial" w:cs="Arial"/>
-                <w:b/>
-                <w:bCs/>
-                <w:sz w:val="24"/>
-                <w:szCs w:val="24"/>
-              </w:rPr>
-              <w:t xml:space="preserve"> of Done:</w:t>
+            <w:r>
+              <w:rPr>
+                <w:rFonts w:ascii="Arial" w:hAnsi="Arial" w:cs="Arial"/>
+                <w:b/>
+                <w:bCs/>
+                <w:sz w:val="24"/>
+                <w:szCs w:val="24"/>
+              </w:rPr>
+              <w:t>Definition of Done:</w:t>
             </w:r>
           </w:p>
         </w:tc>
@@ -36121,43 +35218,7 @@
                 <w:sz w:val="24"/>
                 <w:szCs w:val="24"/>
               </w:rPr>
-              <w:t xml:space="preserve">Validación en </w:t>
-            </w:r>
-            <w:proofErr w:type="spellStart"/>
-            <w:r>
-              <w:rPr>
-                <w:rFonts w:ascii="Arial" w:hAnsi="Arial" w:cs="Arial"/>
-                <w:sz w:val="24"/>
-                <w:szCs w:val="24"/>
-              </w:rPr>
-              <w:t>frontend</w:t>
-            </w:r>
-            <w:proofErr w:type="spellEnd"/>
-            <w:r>
-              <w:rPr>
-                <w:rFonts w:ascii="Arial" w:hAnsi="Arial" w:cs="Arial"/>
-                <w:sz w:val="24"/>
-                <w:szCs w:val="24"/>
-              </w:rPr>
-              <w:t xml:space="preserve"> y </w:t>
-            </w:r>
-            <w:proofErr w:type="spellStart"/>
-            <w:r>
-              <w:rPr>
-                <w:rFonts w:ascii="Arial" w:hAnsi="Arial" w:cs="Arial"/>
-                <w:sz w:val="24"/>
-                <w:szCs w:val="24"/>
-              </w:rPr>
-              <w:t>backend</w:t>
-            </w:r>
-            <w:proofErr w:type="spellEnd"/>
-            <w:r>
-              <w:rPr>
-                <w:rFonts w:ascii="Arial" w:hAnsi="Arial" w:cs="Arial"/>
-                <w:sz w:val="24"/>
-                <w:szCs w:val="24"/>
-              </w:rPr>
-              <w:t xml:space="preserve"> de enteros válidos entre 1 y 5 estrellas.</w:t>
+              <w:t>Validación en frontend y backend de enteros válidos entre 1 y 5 estrellas.</w:t>
             </w:r>
           </w:p>
           <w:p>
@@ -36929,49 +35990,15 @@
                 <w:szCs w:val="24"/>
               </w:rPr>
             </w:pPr>
-            <w:proofErr w:type="spellStart"/>
-            <w:r>
-              <w:rPr>
-                <w:rFonts w:ascii="Arial" w:hAnsi="Arial" w:cs="Arial"/>
-                <w:b/>
-                <w:bCs/>
-                <w:sz w:val="24"/>
-                <w:szCs w:val="24"/>
-              </w:rPr>
-              <w:t>Story</w:t>
-            </w:r>
-            <w:proofErr w:type="spellEnd"/>
-            <w:r>
-              <w:rPr>
-                <w:rFonts w:ascii="Arial" w:hAnsi="Arial" w:cs="Arial"/>
-                <w:b/>
-                <w:bCs/>
-                <w:sz w:val="24"/>
-                <w:szCs w:val="24"/>
-              </w:rPr>
-              <w:t xml:space="preserve"> </w:t>
-            </w:r>
-            <w:proofErr w:type="spellStart"/>
-            <w:r>
-              <w:rPr>
-                <w:rFonts w:ascii="Arial" w:hAnsi="Arial" w:cs="Arial"/>
-                <w:b/>
-                <w:bCs/>
-                <w:sz w:val="24"/>
-                <w:szCs w:val="24"/>
-              </w:rPr>
-              <w:t>Points</w:t>
-            </w:r>
-            <w:proofErr w:type="spellEnd"/>
-            <w:r>
-              <w:rPr>
-                <w:rFonts w:ascii="Arial" w:hAnsi="Arial" w:cs="Arial"/>
-                <w:b/>
-                <w:bCs/>
-                <w:sz w:val="24"/>
-                <w:szCs w:val="24"/>
-              </w:rPr>
-              <w:t>:</w:t>
+            <w:r>
+              <w:rPr>
+                <w:rFonts w:ascii="Arial" w:hAnsi="Arial" w:cs="Arial"/>
+                <w:b/>
+                <w:bCs/>
+                <w:sz w:val="24"/>
+                <w:szCs w:val="24"/>
+              </w:rPr>
+              <w:t>Story Points:</w:t>
             </w:r>
           </w:p>
         </w:tc>
@@ -37302,23 +36329,7 @@
                 <w:sz w:val="24"/>
                 <w:szCs w:val="24"/>
               </w:rPr>
-              <w:t xml:space="preserve">RN-004: Solo los usuarios con rol Administrador pueden acceder a </w:t>
-            </w:r>
-            <w:r>
-              <w:rPr>
-                <w:rFonts w:ascii="Arial" w:hAnsi="Arial" w:cs="Arial"/>
-                <w:sz w:val="24"/>
-                <w:szCs w:val="24"/>
-              </w:rPr>
-              <w:t>las métricas consolidadas</w:t>
-            </w:r>
-            <w:r>
-              <w:rPr>
-                <w:rFonts w:ascii="Arial" w:hAnsi="Arial" w:cs="Arial"/>
-                <w:sz w:val="24"/>
-                <w:szCs w:val="24"/>
-              </w:rPr>
-              <w:t xml:space="preserve"> y reportes de </w:t>
+              <w:t xml:space="preserve">RN-004: Solo los usuarios con rol Administrador pueden acceder a las métricas consolidadas y reportes de </w:t>
             </w:r>
             <w:r>
               <w:rPr>
@@ -37691,27 +36702,15 @@
                 <w:szCs w:val="24"/>
               </w:rPr>
             </w:pPr>
-            <w:proofErr w:type="spellStart"/>
-            <w:r>
-              <w:rPr>
-                <w:rFonts w:ascii="Arial" w:hAnsi="Arial" w:cs="Arial"/>
-                <w:b/>
-                <w:bCs/>
-                <w:sz w:val="24"/>
-                <w:szCs w:val="24"/>
-              </w:rPr>
-              <w:t>Mockups</w:t>
-            </w:r>
-            <w:proofErr w:type="spellEnd"/>
-            <w:r>
-              <w:rPr>
-                <w:rFonts w:ascii="Arial" w:hAnsi="Arial" w:cs="Arial"/>
-                <w:b/>
-                <w:bCs/>
-                <w:sz w:val="24"/>
-                <w:szCs w:val="24"/>
-              </w:rPr>
-              <w:t>:</w:t>
+            <w:r>
+              <w:rPr>
+                <w:rFonts w:ascii="Arial" w:hAnsi="Arial" w:cs="Arial"/>
+                <w:b/>
+                <w:bCs/>
+                <w:sz w:val="24"/>
+                <w:szCs w:val="24"/>
+              </w:rPr>
+              <w:t>Mockups:</w:t>
             </w:r>
           </w:p>
         </w:tc>
@@ -37776,27 +36775,15 @@
                 <w:szCs w:val="24"/>
               </w:rPr>
             </w:pPr>
-            <w:proofErr w:type="spellStart"/>
-            <w:r>
-              <w:rPr>
-                <w:rFonts w:ascii="Arial" w:hAnsi="Arial" w:cs="Arial"/>
-                <w:b/>
-                <w:bCs/>
-                <w:sz w:val="24"/>
-                <w:szCs w:val="24"/>
-              </w:rPr>
-              <w:t>Definition</w:t>
-            </w:r>
-            <w:proofErr w:type="spellEnd"/>
-            <w:r>
-              <w:rPr>
-                <w:rFonts w:ascii="Arial" w:hAnsi="Arial" w:cs="Arial"/>
-                <w:b/>
-                <w:bCs/>
-                <w:sz w:val="24"/>
-                <w:szCs w:val="24"/>
-              </w:rPr>
-              <w:t xml:space="preserve"> of Done:</w:t>
+            <w:r>
+              <w:rPr>
+                <w:rFonts w:ascii="Arial" w:hAnsi="Arial" w:cs="Arial"/>
+                <w:b/>
+                <w:bCs/>
+                <w:sz w:val="24"/>
+                <w:szCs w:val="24"/>
+              </w:rPr>
+              <w:t>Definition of Done:</w:t>
             </w:r>
           </w:p>
         </w:tc>
@@ -37847,25 +36834,7 @@
                 <w:sz w:val="24"/>
                 <w:szCs w:val="24"/>
               </w:rPr>
-              <w:t xml:space="preserve">Consulta optimizada en base de datos para </w:t>
-            </w:r>
-            <w:proofErr w:type="spellStart"/>
-            <w:r>
-              <w:rPr>
-                <w:rFonts w:ascii="Arial" w:hAnsi="Arial" w:cs="Arial"/>
-                <w:sz w:val="24"/>
-                <w:szCs w:val="24"/>
-              </w:rPr>
-              <w:t>renderizado</w:t>
-            </w:r>
-            <w:proofErr w:type="spellEnd"/>
-            <w:r>
-              <w:rPr>
-                <w:rFonts w:ascii="Arial" w:hAnsi="Arial" w:cs="Arial"/>
-                <w:sz w:val="24"/>
-                <w:szCs w:val="24"/>
-              </w:rPr>
-              <w:t xml:space="preserve"> de métricas en tiempo menor a 2 segundos (RNF01).  </w:t>
+              <w:t xml:space="preserve">Consulta optimizada en base de datos para renderizado de métricas en tiempo menor a 2 segundos (RNF01).  </w:t>
             </w:r>
           </w:p>
           <w:p>
@@ -38115,25 +37084,7 @@
                 <w:sz w:val="24"/>
                 <w:szCs w:val="24"/>
               </w:rPr>
-              <w:t xml:space="preserve">Lentitud en la generación del reporte consolidado de satisfacción si la cantidad de registros de calificaciones no cuenta con un índice adecuado en la base de datos </w:t>
-            </w:r>
-            <w:proofErr w:type="spellStart"/>
-            <w:r>
-              <w:rPr>
-                <w:rFonts w:ascii="Arial" w:hAnsi="Arial" w:cs="Arial"/>
-                <w:sz w:val="24"/>
-                <w:szCs w:val="24"/>
-              </w:rPr>
-              <w:t>MySQL</w:t>
-            </w:r>
-            <w:proofErr w:type="spellEnd"/>
-            <w:r>
-              <w:rPr>
-                <w:rFonts w:ascii="Arial" w:hAnsi="Arial" w:cs="Arial"/>
-                <w:sz w:val="24"/>
-                <w:szCs w:val="24"/>
-              </w:rPr>
-              <w:t>.</w:t>
+              <w:t>Lentitud en la generación del reporte consolidado de satisfacción si la cantidad de registros de calificaciones no cuenta con un índice adecuado en la base de datos MySQL.</w:t>
             </w:r>
           </w:p>
         </w:tc>
@@ -38216,8 +37167,6 @@
               </w:rPr>
               <w:t>, CP-024-04, CP-024-05</w:t>
             </w:r>
-            <w:bookmarkStart w:id="0" w:name="_GoBack"/>
-            <w:bookmarkEnd w:id="0"/>
             <w:r>
               <w:rPr>
                 <w:rFonts w:ascii="Arial" w:hAnsi="Arial" w:cs="Arial"/>
@@ -38659,49 +37608,15 @@
                 <w:szCs w:val="24"/>
               </w:rPr>
             </w:pPr>
-            <w:proofErr w:type="spellStart"/>
-            <w:r>
-              <w:rPr>
-                <w:rFonts w:ascii="Arial" w:hAnsi="Arial" w:cs="Arial"/>
-                <w:b/>
-                <w:bCs/>
-                <w:sz w:val="24"/>
-                <w:szCs w:val="24"/>
-              </w:rPr>
-              <w:t>Story</w:t>
-            </w:r>
-            <w:proofErr w:type="spellEnd"/>
-            <w:r>
-              <w:rPr>
-                <w:rFonts w:ascii="Arial" w:hAnsi="Arial" w:cs="Arial"/>
-                <w:b/>
-                <w:bCs/>
-                <w:sz w:val="24"/>
-                <w:szCs w:val="24"/>
-              </w:rPr>
-              <w:t xml:space="preserve"> </w:t>
-            </w:r>
-            <w:proofErr w:type="spellStart"/>
-            <w:r>
-              <w:rPr>
-                <w:rFonts w:ascii="Arial" w:hAnsi="Arial" w:cs="Arial"/>
-                <w:b/>
-                <w:bCs/>
-                <w:sz w:val="24"/>
-                <w:szCs w:val="24"/>
-              </w:rPr>
-              <w:t>Points</w:t>
-            </w:r>
-            <w:proofErr w:type="spellEnd"/>
-            <w:r>
-              <w:rPr>
-                <w:rFonts w:ascii="Arial" w:hAnsi="Arial" w:cs="Arial"/>
-                <w:b/>
-                <w:bCs/>
-                <w:sz w:val="24"/>
-                <w:szCs w:val="24"/>
-              </w:rPr>
-              <w:t>:</w:t>
+            <w:r>
+              <w:rPr>
+                <w:rFonts w:ascii="Arial" w:hAnsi="Arial" w:cs="Arial"/>
+                <w:b/>
+                <w:bCs/>
+                <w:sz w:val="24"/>
+                <w:szCs w:val="24"/>
+              </w:rPr>
+              <w:t>Story Points:</w:t>
             </w:r>
           </w:p>
         </w:tc>
@@ -38860,25 +37775,7 @@
                 <w:sz w:val="24"/>
                 <w:szCs w:val="24"/>
               </w:rPr>
-              <w:t xml:space="preserve">Para verificar la valoración asignada o revisar el </w:t>
-            </w:r>
-            <w:proofErr w:type="spellStart"/>
-            <w:r>
-              <w:rPr>
-                <w:rFonts w:ascii="Arial" w:hAnsi="Arial" w:cs="Arial"/>
-                <w:sz w:val="24"/>
-                <w:szCs w:val="24"/>
-              </w:rPr>
-              <w:t>feedback</w:t>
-            </w:r>
-            <w:proofErr w:type="spellEnd"/>
-            <w:r>
-              <w:rPr>
-                <w:rFonts w:ascii="Arial" w:hAnsi="Arial" w:cs="Arial"/>
-                <w:sz w:val="24"/>
-                <w:szCs w:val="24"/>
-              </w:rPr>
-              <w:t xml:space="preserve"> detallado de la atención.</w:t>
+              <w:t>Para verificar la valoración asignada o revisar el feedback detallado de la atención.</w:t>
             </w:r>
           </w:p>
         </w:tc>
@@ -39408,27 +38305,15 @@
                 <w:szCs w:val="24"/>
               </w:rPr>
             </w:pPr>
-            <w:proofErr w:type="spellStart"/>
-            <w:r>
-              <w:rPr>
-                <w:rFonts w:ascii="Arial" w:hAnsi="Arial" w:cs="Arial"/>
-                <w:b/>
-                <w:bCs/>
-                <w:sz w:val="24"/>
-                <w:szCs w:val="24"/>
-              </w:rPr>
-              <w:t>Mockups</w:t>
-            </w:r>
-            <w:proofErr w:type="spellEnd"/>
-            <w:r>
-              <w:rPr>
-                <w:rFonts w:ascii="Arial" w:hAnsi="Arial" w:cs="Arial"/>
-                <w:b/>
-                <w:bCs/>
-                <w:sz w:val="24"/>
-                <w:szCs w:val="24"/>
-              </w:rPr>
-              <w:t>:</w:t>
+            <w:r>
+              <w:rPr>
+                <w:rFonts w:ascii="Arial" w:hAnsi="Arial" w:cs="Arial"/>
+                <w:b/>
+                <w:bCs/>
+                <w:sz w:val="24"/>
+                <w:szCs w:val="24"/>
+              </w:rPr>
+              <w:t>Mockups:</w:t>
             </w:r>
           </w:p>
         </w:tc>
@@ -39493,27 +38378,15 @@
                 <w:szCs w:val="24"/>
               </w:rPr>
             </w:pPr>
-            <w:proofErr w:type="spellStart"/>
-            <w:r>
-              <w:rPr>
-                <w:rFonts w:ascii="Arial" w:hAnsi="Arial" w:cs="Arial"/>
-                <w:b/>
-                <w:bCs/>
-                <w:sz w:val="24"/>
-                <w:szCs w:val="24"/>
-              </w:rPr>
-              <w:t>Definition</w:t>
-            </w:r>
-            <w:proofErr w:type="spellEnd"/>
-            <w:r>
-              <w:rPr>
-                <w:rFonts w:ascii="Arial" w:hAnsi="Arial" w:cs="Arial"/>
-                <w:b/>
-                <w:bCs/>
-                <w:sz w:val="24"/>
-                <w:szCs w:val="24"/>
-              </w:rPr>
-              <w:t xml:space="preserve"> of Done:</w:t>
+            <w:r>
+              <w:rPr>
+                <w:rFonts w:ascii="Arial" w:hAnsi="Arial" w:cs="Arial"/>
+                <w:b/>
+                <w:bCs/>
+                <w:sz w:val="24"/>
+                <w:szCs w:val="24"/>
+              </w:rPr>
+              <w:t>Definition of Done:</w:t>
             </w:r>
           </w:p>
         </w:tc>
@@ -39541,23 +38414,13 @@
                 <w:szCs w:val="24"/>
               </w:rPr>
             </w:pPr>
-            <w:proofErr w:type="spellStart"/>
-            <w:r>
-              <w:rPr>
-                <w:rFonts w:ascii="Arial" w:hAnsi="Arial" w:cs="Arial"/>
-                <w:sz w:val="24"/>
-                <w:szCs w:val="24"/>
-              </w:rPr>
-              <w:t>Renderizado</w:t>
-            </w:r>
-            <w:proofErr w:type="spellEnd"/>
-            <w:r>
-              <w:rPr>
-                <w:rFonts w:ascii="Arial" w:hAnsi="Arial" w:cs="Arial"/>
-                <w:sz w:val="24"/>
-                <w:szCs w:val="24"/>
-              </w:rPr>
-              <w:t xml:space="preserve"> correcto de componentes gráficos (estrellas) según el valor numérico en base de datos.</w:t>
+            <w:r>
+              <w:rPr>
+                <w:rFonts w:ascii="Arial" w:hAnsi="Arial" w:cs="Arial"/>
+                <w:sz w:val="24"/>
+                <w:szCs w:val="24"/>
+              </w:rPr>
+              <w:t>Renderizado correcto de componentes gráficos (estrellas) según el valor numérico en base de datos.</w:t>
             </w:r>
           </w:p>
           <w:p>
@@ -39837,25 +38700,7 @@
                 <w:sz w:val="24"/>
                 <w:szCs w:val="24"/>
               </w:rPr>
-              <w:t xml:space="preserve">Desalineación visual en la representación de las estrellas si el </w:t>
-            </w:r>
-            <w:proofErr w:type="spellStart"/>
-            <w:r>
-              <w:rPr>
-                <w:rFonts w:ascii="Arial" w:hAnsi="Arial" w:cs="Arial"/>
-                <w:sz w:val="24"/>
-                <w:szCs w:val="24"/>
-              </w:rPr>
-              <w:t>frontend</w:t>
-            </w:r>
-            <w:proofErr w:type="spellEnd"/>
-            <w:r>
-              <w:rPr>
-                <w:rFonts w:ascii="Arial" w:hAnsi="Arial" w:cs="Arial"/>
-                <w:sz w:val="24"/>
-                <w:szCs w:val="24"/>
-              </w:rPr>
-              <w:t xml:space="preserve"> no procesa correctamente valores nulos cuando el registro aún no posee calificación.</w:t>
+              <w:t>Desalineación visual en la representación de las estrellas si el frontend no procesa correctamente valores nulos cuando el registro aún no posee calificación.</w:t>
             </w:r>
           </w:p>
         </w:tc>
@@ -40398,49 +39243,15 @@
                 <w:szCs w:val="24"/>
               </w:rPr>
             </w:pPr>
-            <w:proofErr w:type="spellStart"/>
-            <w:r>
-              <w:rPr>
-                <w:rFonts w:ascii="Arial" w:hAnsi="Arial" w:cs="Arial"/>
-                <w:b/>
-                <w:bCs/>
-                <w:sz w:val="24"/>
-                <w:szCs w:val="24"/>
-              </w:rPr>
-              <w:t>Story</w:t>
-            </w:r>
-            <w:proofErr w:type="spellEnd"/>
-            <w:r>
-              <w:rPr>
-                <w:rFonts w:ascii="Arial" w:hAnsi="Arial" w:cs="Arial"/>
-                <w:b/>
-                <w:bCs/>
-                <w:sz w:val="24"/>
-                <w:szCs w:val="24"/>
-              </w:rPr>
-              <w:t xml:space="preserve"> </w:t>
-            </w:r>
-            <w:proofErr w:type="spellStart"/>
-            <w:r>
-              <w:rPr>
-                <w:rFonts w:ascii="Arial" w:hAnsi="Arial" w:cs="Arial"/>
-                <w:b/>
-                <w:bCs/>
-                <w:sz w:val="24"/>
-                <w:szCs w:val="24"/>
-              </w:rPr>
-              <w:t>Points</w:t>
-            </w:r>
-            <w:proofErr w:type="spellEnd"/>
-            <w:r>
-              <w:rPr>
-                <w:rFonts w:ascii="Arial" w:hAnsi="Arial" w:cs="Arial"/>
-                <w:b/>
-                <w:bCs/>
-                <w:sz w:val="24"/>
-                <w:szCs w:val="24"/>
-              </w:rPr>
-              <w:t>:</w:t>
+            <w:r>
+              <w:rPr>
+                <w:rFonts w:ascii="Arial" w:hAnsi="Arial" w:cs="Arial"/>
+                <w:b/>
+                <w:bCs/>
+                <w:sz w:val="24"/>
+                <w:szCs w:val="24"/>
+              </w:rPr>
+              <w:t>Story Points:</w:t>
             </w:r>
           </w:p>
         </w:tc>
@@ -41127,27 +39938,15 @@
                 <w:szCs w:val="24"/>
               </w:rPr>
             </w:pPr>
-            <w:proofErr w:type="spellStart"/>
-            <w:r>
-              <w:rPr>
-                <w:rFonts w:ascii="Arial" w:hAnsi="Arial" w:cs="Arial"/>
-                <w:b/>
-                <w:bCs/>
-                <w:sz w:val="24"/>
-                <w:szCs w:val="24"/>
-              </w:rPr>
-              <w:t>Mockups</w:t>
-            </w:r>
-            <w:proofErr w:type="spellEnd"/>
-            <w:r>
-              <w:rPr>
-                <w:rFonts w:ascii="Arial" w:hAnsi="Arial" w:cs="Arial"/>
-                <w:b/>
-                <w:bCs/>
-                <w:sz w:val="24"/>
-                <w:szCs w:val="24"/>
-              </w:rPr>
-              <w:t>:</w:t>
+            <w:r>
+              <w:rPr>
+                <w:rFonts w:ascii="Arial" w:hAnsi="Arial" w:cs="Arial"/>
+                <w:b/>
+                <w:bCs/>
+                <w:sz w:val="24"/>
+                <w:szCs w:val="24"/>
+              </w:rPr>
+              <w:t>Mockups:</w:t>
             </w:r>
           </w:p>
         </w:tc>
@@ -41181,25 +39980,7 @@
                 <w:sz w:val="24"/>
                 <w:szCs w:val="24"/>
               </w:rPr>
-              <w:t xml:space="preserve">Panel administrativo "Gestión de PQRS" con tabla de solicitudes en estado 'Pendiente', formulario modal de atención con la consulta original del cliente, caja de texto </w:t>
-            </w:r>
-            <w:proofErr w:type="spellStart"/>
-            <w:r>
-              <w:rPr>
-                <w:rFonts w:ascii="Arial" w:hAnsi="Arial" w:cs="Arial"/>
-                <w:sz w:val="24"/>
-                <w:szCs w:val="24"/>
-              </w:rPr>
-              <w:t>multilínea</w:t>
-            </w:r>
-            <w:proofErr w:type="spellEnd"/>
-            <w:r>
-              <w:rPr>
-                <w:rFonts w:ascii="Arial" w:hAnsi="Arial" w:cs="Arial"/>
-                <w:sz w:val="24"/>
-                <w:szCs w:val="24"/>
-              </w:rPr>
-              <w:t xml:space="preserve"> para la respuesta oficial y botón de acción "Cerrar </w:t>
+              <w:t xml:space="preserve">Panel administrativo "Gestión de PQRS" con tabla de solicitudes en estado 'Pendiente', formulario modal de atención con la consulta original del cliente, caja de texto multilínea para la respuesta oficial y botón de acción "Cerrar </w:t>
             </w:r>
             <w:r>
               <w:rPr>
@@ -41239,7 +40020,6 @@
                 <w:szCs w:val="24"/>
               </w:rPr>
             </w:pPr>
-            <w:proofErr w:type="spellStart"/>
             <w:r>
               <w:rPr>
                 <w:rFonts w:ascii="Arial" w:hAnsi="Arial" w:cs="Arial"/>
@@ -41249,18 +40029,7 @@
                 <w:szCs w:val="24"/>
               </w:rPr>
               <w:lastRenderedPageBreak/>
-              <w:t>Definition</w:t>
-            </w:r>
-            <w:proofErr w:type="spellEnd"/>
-            <w:r>
-              <w:rPr>
-                <w:rFonts w:ascii="Arial" w:hAnsi="Arial" w:cs="Arial"/>
-                <w:b/>
-                <w:bCs/>
-                <w:sz w:val="24"/>
-                <w:szCs w:val="24"/>
-              </w:rPr>
-              <w:t xml:space="preserve"> of Done:</w:t>
+              <w:t>Definition of Done:</w:t>
             </w:r>
           </w:p>
         </w:tc>
@@ -41868,7 +40637,7 @@
       </w:pPr>
     </w:p>
     <w:sectPr>
-      <w:footerReference w:type="default" r:id="rId8"/>
+      <w:footerReference w:type="default" r:id="rId7"/>
       <w:pgSz w:w="12240" w:h="15840"/>
       <w:pgMar w:top="1417" w:right="1701" w:bottom="1417" w:left="1701" w:header="708" w:footer="708" w:gutter="0"/>
       <w:pgNumType w:start="1"/>
@@ -41879,7 +40648,7 @@
 </file>
 
 <file path=word/endnotes.xml><?xml version="1.0" encoding="utf-8"?>
-<w:endnotes xmlns:wpc="http://schemas.microsoft.com/office/word/2010/wordprocessingCanvas" xmlns:mc="http://schemas.openxmlformats.org/markup-compatibility/2006" xmlns:o="urn:schemas-microsoft-com:office:office" xmlns:r="http://schemas.openxmlformats.org/officeDocument/2006/relationships" xmlns:m="http://schemas.openxmlformats.org/officeDocument/2006/math" xmlns:v="urn:schemas-microsoft-com:vml" xmlns:wp14="http://schemas.microsoft.com/office/word/2010/wordprocessingDrawing" xmlns:wp="http://schemas.openxmlformats.org/drawingml/2006/wordprocessingDrawing" xmlns:w10="urn:schemas-microsoft-com:office:word" xmlns:w="http://schemas.openxmlformats.org/wordprocessingml/2006/main" xmlns:w14="http://schemas.microsoft.com/office/word/2010/wordml" xmlns:wpg="http://schemas.microsoft.com/office/word/2010/wordprocessingGroup" xmlns:wpi="http://schemas.microsoft.com/office/word/2010/wordprocessingInk" xmlns:wne="http://schemas.microsoft.com/office/word/2006/wordml" xmlns:wps="http://schemas.microsoft.com/office/word/2010/wordprocessingShape" mc:Ignorable="w14 wp14">
+<w:endnotes xmlns:wpc="http://schemas.microsoft.com/office/word/2010/wordprocessingCanvas" xmlns:cx="http://schemas.microsoft.com/office/drawing/2014/chartex" xmlns:cx1="http://schemas.microsoft.com/office/drawing/2015/9/8/chartex" xmlns:cx2="http://schemas.microsoft.com/office/drawing/2015/10/21/chartex" xmlns:cx3="http://schemas.microsoft.com/office/drawing/2016/5/9/chartex" xmlns:cx4="http://schemas.microsoft.com/office/drawing/2016/5/10/chartex" xmlns:cx5="http://schemas.microsoft.com/office/drawing/2016/5/11/chartex" xmlns:cx6="http://schemas.microsoft.com/office/drawing/2016/5/12/chartex" xmlns:cx7="http://schemas.microsoft.com/office/drawing/2016/5/13/chartex" xmlns:cx8="http://schemas.microsoft.com/office/drawing/2016/5/14/chartex" xmlns:mc="http://schemas.openxmlformats.org/markup-compatibility/2006" xmlns:aink="http://schemas.microsoft.com/office/drawing/2016/ink" xmlns:am3d="http://schemas.microsoft.com/office/drawing/2017/model3d" xmlns:o="urn:schemas-microsoft-com:office:office" xmlns:oel="http://schemas.microsoft.com/office/2019/extlst" xmlns:r="http://schemas.openxmlformats.org/officeDocument/2006/relationships" xmlns:m="http://schemas.openxmlformats.org/officeDocument/2006/math" xmlns:v="urn:schemas-microsoft-com:vml" xmlns:wp14="http://schemas.microsoft.com/office/word/2010/wordprocessingDrawing" xmlns:wp="http://schemas.openxmlformats.org/drawingml/2006/wordprocessingDrawing" xmlns:w10="urn:schemas-microsoft-com:office:word" xmlns:w="http://schemas.openxmlformats.org/wordprocessingml/2006/main" xmlns:w14="http://schemas.microsoft.com/office/word/2010/wordml" xmlns:w15="http://schemas.microsoft.com/office/word/2012/wordml" xmlns:w16cex="http://schemas.microsoft.com/office/word/2018/wordml/cex" xmlns:w16cid="http://schemas.microsoft.com/office/word/2016/wordml/cid" xmlns:w16="http://schemas.microsoft.com/office/word/2018/wordml" xmlns:w16du="http://schemas.microsoft.com/office/word/2023/wordml/word16du" xmlns:w16sdtdh="http://schemas.microsoft.com/office/word/2020/wordml/sdtdatahash" xmlns:w16sdtfl="http://schemas.microsoft.com/office/word/2024/wordml/sdtformatlock" xmlns:w16se="http://schemas.microsoft.com/office/word/2015/wordml/symex" xmlns:wpg="http://schemas.microsoft.com/office/word/2010/wordprocessingGroup" xmlns:wpi="http://schemas.microsoft.com/office/word/2010/wordprocessingInk" xmlns:wne="http://schemas.microsoft.com/office/word/2006/wordml" xmlns:wps="http://schemas.microsoft.com/office/word/2010/wordprocessingShape" mc:Ignorable="w14 w15 w16se w16cid w16 w16cex w16sdtdh w16sdtfl w16du wp14">
   <w:endnote w:type="separator" w:id="-1">
     <w:p>
       <w:pPr>
@@ -41904,7 +40673,7 @@
 </file>
 
 <file path=word/footer1.xml><?xml version="1.0" encoding="utf-8"?>
-<w:ftr xmlns:wpc="http://schemas.microsoft.com/office/word/2010/wordprocessingCanvas" xmlns:mc="http://schemas.openxmlformats.org/markup-compatibility/2006" xmlns:o="urn:schemas-microsoft-com:office:office" xmlns:r="http://schemas.openxmlformats.org/officeDocument/2006/relationships" xmlns:m="http://schemas.openxmlformats.org/officeDocument/2006/math" xmlns:v="urn:schemas-microsoft-com:vml" xmlns:wp14="http://schemas.microsoft.com/office/word/2010/wordprocessingDrawing" xmlns:wp="http://schemas.openxmlformats.org/drawingml/2006/wordprocessingDrawing" xmlns:w10="urn:schemas-microsoft-com:office:word" xmlns:w="http://schemas.openxmlformats.org/wordprocessingml/2006/main" xmlns:w14="http://schemas.microsoft.com/office/word/2010/wordml" xmlns:wpg="http://schemas.microsoft.com/office/word/2010/wordprocessingGroup" xmlns:wpi="http://schemas.microsoft.com/office/word/2010/wordprocessingInk" xmlns:wne="http://schemas.microsoft.com/office/word/2006/wordml" xmlns:wps="http://schemas.microsoft.com/office/word/2010/wordprocessingShape" mc:Ignorable="w14 wp14">
+<w:ftr xmlns:wpc="http://schemas.microsoft.com/office/word/2010/wordprocessingCanvas" xmlns:cx="http://schemas.microsoft.com/office/drawing/2014/chartex" xmlns:cx1="http://schemas.microsoft.com/office/drawing/2015/9/8/chartex" xmlns:cx2="http://schemas.microsoft.com/office/drawing/2015/10/21/chartex" xmlns:cx3="http://schemas.microsoft.com/office/drawing/2016/5/9/chartex" xmlns:cx4="http://schemas.microsoft.com/office/drawing/2016/5/10/chartex" xmlns:cx5="http://schemas.microsoft.com/office/drawing/2016/5/11/chartex" xmlns:cx6="http://schemas.microsoft.com/office/drawing/2016/5/12/chartex" xmlns:cx7="http://schemas.microsoft.com/office/drawing/2016/5/13/chartex" xmlns:cx8="http://schemas.microsoft.com/office/drawing/2016/5/14/chartex" xmlns:mc="http://schemas.openxmlformats.org/markup-compatibility/2006" xmlns:aink="http://schemas.microsoft.com/office/drawing/2016/ink" xmlns:am3d="http://schemas.microsoft.com/office/drawing/2017/model3d" xmlns:o="urn:schemas-microsoft-com:office:office" xmlns:oel="http://schemas.microsoft.com/office/2019/extlst" xmlns:r="http://schemas.openxmlformats.org/officeDocument/2006/relationships" xmlns:m="http://schemas.openxmlformats.org/officeDocument/2006/math" xmlns:v="urn:schemas-microsoft-com:vml" xmlns:wp14="http://schemas.microsoft.com/office/word/2010/wordprocessingDrawing" xmlns:wp="http://schemas.openxmlformats.org/drawingml/2006/wordprocessingDrawing" xmlns:w10="urn:schemas-microsoft-com:office:word" xmlns:w="http://schemas.openxmlformats.org/wordprocessingml/2006/main" xmlns:w14="http://schemas.microsoft.com/office/word/2010/wordml" xmlns:w15="http://schemas.microsoft.com/office/word/2012/wordml" xmlns:w16cex="http://schemas.microsoft.com/office/word/2018/wordml/cex" xmlns:w16cid="http://schemas.microsoft.com/office/word/2016/wordml/cid" xmlns:w16="http://schemas.microsoft.com/office/word/2018/wordml" xmlns:w16du="http://schemas.microsoft.com/office/word/2023/wordml/word16du" xmlns:w16sdtdh="http://schemas.microsoft.com/office/word/2020/wordml/sdtdatahash" xmlns:w16sdtfl="http://schemas.microsoft.com/office/word/2024/wordml/sdtformatlock" xmlns:w16se="http://schemas.microsoft.com/office/word/2015/wordml/symex" xmlns:wpg="http://schemas.microsoft.com/office/word/2010/wordprocessingGroup" xmlns:wpi="http://schemas.microsoft.com/office/word/2010/wordprocessingInk" xmlns:wne="http://schemas.microsoft.com/office/word/2006/wordml" xmlns:wps="http://schemas.microsoft.com/office/word/2010/wordprocessingShape" mc:Ignorable="w14 w15 w16se w16cid w16 w16cex w16sdtdh w16sdtfl w16du wp14">
   <w:p>
     <w:pPr>
       <w:pBdr>
@@ -41929,7 +40698,7 @@
 </file>
 
 <file path=word/footnotes.xml><?xml version="1.0" encoding="utf-8"?>
-<w:footnotes xmlns:wpc="http://schemas.microsoft.com/office/word/2010/wordprocessingCanvas" xmlns:mc="http://schemas.openxmlformats.org/markup-compatibility/2006" xmlns:o="urn:schemas-microsoft-com:office:office" xmlns:r="http://schemas.openxmlformats.org/officeDocument/2006/relationships" xmlns:m="http://schemas.openxmlformats.org/officeDocument/2006/math" xmlns:v="urn:schemas-microsoft-com:vml" xmlns:wp14="http://schemas.microsoft.com/office/word/2010/wordprocessingDrawing" xmlns:wp="http://schemas.openxmlformats.org/drawingml/2006/wordprocessingDrawing" xmlns:w10="urn:schemas-microsoft-com:office:word" xmlns:w="http://schemas.openxmlformats.org/wordprocessingml/2006/main" xmlns:w14="http://schemas.microsoft.com/office/word/2010/wordml" xmlns:wpg="http://schemas.microsoft.com/office/word/2010/wordprocessingGroup" xmlns:wpi="http://schemas.microsoft.com/office/word/2010/wordprocessingInk" xmlns:wne="http://schemas.microsoft.com/office/word/2006/wordml" xmlns:wps="http://schemas.microsoft.com/office/word/2010/wordprocessingShape" mc:Ignorable="w14 wp14">
+<w:footnotes xmlns:wpc="http://schemas.microsoft.com/office/word/2010/wordprocessingCanvas" xmlns:cx="http://schemas.microsoft.com/office/drawing/2014/chartex" xmlns:cx1="http://schemas.microsoft.com/office/drawing/2015/9/8/chartex" xmlns:cx2="http://schemas.microsoft.com/office/drawing/2015/10/21/chartex" xmlns:cx3="http://schemas.microsoft.com/office/drawing/2016/5/9/chartex" xmlns:cx4="http://schemas.microsoft.com/office/drawing/2016/5/10/chartex" xmlns:cx5="http://schemas.microsoft.com/office/drawing/2016/5/11/chartex" xmlns:cx6="http://schemas.microsoft.com/office/drawing/2016/5/12/chartex" xmlns:cx7="http://schemas.microsoft.com/office/drawing/2016/5/13/chartex" xmlns:cx8="http://schemas.microsoft.com/office/drawing/2016/5/14/chartex" xmlns:mc="http://schemas.openxmlformats.org/markup-compatibility/2006" xmlns:aink="http://schemas.microsoft.com/office/drawing/2016/ink" xmlns:am3d="http://schemas.microsoft.com/office/drawing/2017/model3d" xmlns:o="urn:schemas-microsoft-com:office:office" xmlns:oel="http://schemas.microsoft.com/office/2019/extlst" xmlns:r="http://schemas.openxmlformats.org/officeDocument/2006/relationships" xmlns:m="http://schemas.openxmlformats.org/officeDocument/2006/math" xmlns:v="urn:schemas-microsoft-com:vml" xmlns:wp14="http://schemas.microsoft.com/office/word/2010/wordprocessingDrawing" xmlns:wp="http://schemas.openxmlformats.org/drawingml/2006/wordprocessingDrawing" xmlns:w10="urn:schemas-microsoft-com:office:word" xmlns:w="http://schemas.openxmlformats.org/wordprocessingml/2006/main" xmlns:w14="http://schemas.microsoft.com/office/word/2010/wordml" xmlns:w15="http://schemas.microsoft.com/office/word/2012/wordml" xmlns:w16cex="http://schemas.microsoft.com/office/word/2018/wordml/cex" xmlns:w16cid="http://schemas.microsoft.com/office/word/2016/wordml/cid" xmlns:w16="http://schemas.microsoft.com/office/word/2018/wordml" xmlns:w16du="http://schemas.microsoft.com/office/word/2023/wordml/word16du" xmlns:w16sdtdh="http://schemas.microsoft.com/office/word/2020/wordml/sdtdatahash" xmlns:w16sdtfl="http://schemas.microsoft.com/office/word/2024/wordml/sdtformatlock" xmlns:w16se="http://schemas.microsoft.com/office/word/2015/wordml/symex" xmlns:wpg="http://schemas.microsoft.com/office/word/2010/wordprocessingGroup" xmlns:wpi="http://schemas.microsoft.com/office/word/2010/wordprocessingInk" xmlns:wne="http://schemas.microsoft.com/office/word/2006/wordml" xmlns:wps="http://schemas.microsoft.com/office/word/2010/wordprocessingShape" mc:Ignorable="w14 w15 w16se w16cid w16 w16cex w16sdtdh w16sdtfl w16du wp14">
   <w:footnote w:type="separator" w:id="-1">
     <w:p>
       <w:pPr>
@@ -41954,8 +40723,8 @@
 </file>
 
 <file path=word/numbering.xml><?xml version="1.0" encoding="utf-8"?>
-<w:numbering xmlns:wpc="http://schemas.microsoft.com/office/word/2010/wordprocessingCanvas" xmlns:mc="http://schemas.openxmlformats.org/markup-compatibility/2006" xmlns:o="urn:schemas-microsoft-com:office:office" xmlns:r="http://schemas.openxmlformats.org/officeDocument/2006/relationships" xmlns:m="http://schemas.openxmlformats.org/officeDocument/2006/math" xmlns:v="urn:schemas-microsoft-com:vml" xmlns:wp14="http://schemas.microsoft.com/office/word/2010/wordprocessingDrawing" xmlns:wp="http://schemas.openxmlformats.org/drawingml/2006/wordprocessingDrawing" xmlns:w10="urn:schemas-microsoft-com:office:word" xmlns:w="http://schemas.openxmlformats.org/wordprocessingml/2006/main" xmlns:w14="http://schemas.microsoft.com/office/word/2010/wordml" xmlns:wpg="http://schemas.microsoft.com/office/word/2010/wordprocessingGroup" xmlns:wpi="http://schemas.microsoft.com/office/word/2010/wordprocessingInk" xmlns:wne="http://schemas.microsoft.com/office/word/2006/wordml" xmlns:wps="http://schemas.microsoft.com/office/word/2010/wordprocessingShape" mc:Ignorable="w14 wp14">
-  <w:abstractNum w:abstractNumId="0">
+<w:numbering xmlns:wpc="http://schemas.microsoft.com/office/word/2010/wordprocessingCanvas" xmlns:cx="http://schemas.microsoft.com/office/drawing/2014/chartex" xmlns:cx1="http://schemas.microsoft.com/office/drawing/2015/9/8/chartex" xmlns:cx2="http://schemas.microsoft.com/office/drawing/2015/10/21/chartex" xmlns:cx3="http://schemas.microsoft.com/office/drawing/2016/5/9/chartex" xmlns:cx4="http://schemas.microsoft.com/office/drawing/2016/5/10/chartex" xmlns:cx5="http://schemas.microsoft.com/office/drawing/2016/5/11/chartex" xmlns:cx6="http://schemas.microsoft.com/office/drawing/2016/5/12/chartex" xmlns:cx7="http://schemas.microsoft.com/office/drawing/2016/5/13/chartex" xmlns:cx8="http://schemas.microsoft.com/office/drawing/2016/5/14/chartex" xmlns:mc="http://schemas.openxmlformats.org/markup-compatibility/2006" xmlns:aink="http://schemas.microsoft.com/office/drawing/2016/ink" xmlns:am3d="http://schemas.microsoft.com/office/drawing/2017/model3d" xmlns:o="urn:schemas-microsoft-com:office:office" xmlns:oel="http://schemas.microsoft.com/office/2019/extlst" xmlns:r="http://schemas.openxmlformats.org/officeDocument/2006/relationships" xmlns:m="http://schemas.openxmlformats.org/officeDocument/2006/math" xmlns:v="urn:schemas-microsoft-com:vml" xmlns:wp14="http://schemas.microsoft.com/office/word/2010/wordprocessingDrawing" xmlns:wp="http://schemas.openxmlformats.org/drawingml/2006/wordprocessingDrawing" xmlns:w10="urn:schemas-microsoft-com:office:word" xmlns:w="http://schemas.openxmlformats.org/wordprocessingml/2006/main" xmlns:w14="http://schemas.microsoft.com/office/word/2010/wordml" xmlns:w15="http://schemas.microsoft.com/office/word/2012/wordml" xmlns:w16cex="http://schemas.microsoft.com/office/word/2018/wordml/cex" xmlns:w16cid="http://schemas.microsoft.com/office/word/2016/wordml/cid" xmlns:w16="http://schemas.microsoft.com/office/word/2018/wordml" xmlns:w16du="http://schemas.microsoft.com/office/word/2023/wordml/word16du" xmlns:w16sdtdh="http://schemas.microsoft.com/office/word/2020/wordml/sdtdatahash" xmlns:w16sdtfl="http://schemas.microsoft.com/office/word/2024/wordml/sdtformatlock" xmlns:w16se="http://schemas.microsoft.com/office/word/2015/wordml/symex" xmlns:wpg="http://schemas.microsoft.com/office/word/2010/wordprocessingGroup" xmlns:wpi="http://schemas.microsoft.com/office/word/2010/wordprocessingInk" xmlns:wne="http://schemas.microsoft.com/office/word/2006/wordml" xmlns:wps="http://schemas.microsoft.com/office/word/2010/wordprocessingShape" mc:Ignorable="w14 w15 w16se w16cid w16 w16cex w16sdtdh w16sdtfl w16du wp14">
+  <w:abstractNum w:abstractNumId="0" w15:restartNumberingAfterBreak="0">
     <w:nsid w:val="158A0C29"/>
     <w:multiLevelType w:val="multilevel"/>
     <w:tmpl w:val="72D4B7F2"/>
@@ -42068,7 +40837,7 @@
       </w:rPr>
     </w:lvl>
   </w:abstractNum>
-  <w:abstractNum w:abstractNumId="1">
+  <w:abstractNum w:abstractNumId="1" w15:restartNumberingAfterBreak="0">
     <w:nsid w:val="1B082A22"/>
     <w:multiLevelType w:val="multilevel"/>
     <w:tmpl w:val="32625A26"/>
@@ -42181,7 +40950,7 @@
       </w:rPr>
     </w:lvl>
   </w:abstractNum>
-  <w:abstractNum w:abstractNumId="2">
+  <w:abstractNum w:abstractNumId="2" w15:restartNumberingAfterBreak="0">
     <w:nsid w:val="237E5CA4"/>
     <w:multiLevelType w:val="multilevel"/>
     <w:tmpl w:val="8C3E94B4"/>
@@ -42312,7 +41081,7 @@
       </w:rPr>
     </w:lvl>
   </w:abstractNum>
-  <w:abstractNum w:abstractNumId="3">
+  <w:abstractNum w:abstractNumId="3" w15:restartNumberingAfterBreak="0">
     <w:nsid w:val="23C5681E"/>
     <w:multiLevelType w:val="multilevel"/>
     <w:tmpl w:val="030413B8"/>
@@ -42425,7 +41194,7 @@
       </w:rPr>
     </w:lvl>
   </w:abstractNum>
-  <w:abstractNum w:abstractNumId="4">
+  <w:abstractNum w:abstractNumId="4" w15:restartNumberingAfterBreak="0">
     <w:nsid w:val="28784C4D"/>
     <w:multiLevelType w:val="multilevel"/>
     <w:tmpl w:val="C15C9000"/>
@@ -42556,7 +41325,7 @@
       </w:rPr>
     </w:lvl>
   </w:abstractNum>
-  <w:abstractNum w:abstractNumId="5">
+  <w:abstractNum w:abstractNumId="5" w15:restartNumberingAfterBreak="0">
     <w:nsid w:val="2B2D0CC9"/>
     <w:multiLevelType w:val="multilevel"/>
     <w:tmpl w:val="42F64E46"/>
@@ -42669,7 +41438,7 @@
       </w:rPr>
     </w:lvl>
   </w:abstractNum>
-  <w:abstractNum w:abstractNumId="6">
+  <w:abstractNum w:abstractNumId="6" w15:restartNumberingAfterBreak="0">
     <w:nsid w:val="36621D1B"/>
     <w:multiLevelType w:val="multilevel"/>
     <w:tmpl w:val="7F78A9BA"/>
@@ -42782,7 +41551,7 @@
       </w:rPr>
     </w:lvl>
   </w:abstractNum>
-  <w:abstractNum w:abstractNumId="7">
+  <w:abstractNum w:abstractNumId="7" w15:restartNumberingAfterBreak="0">
     <w:nsid w:val="3D8B457B"/>
     <w:multiLevelType w:val="multilevel"/>
     <w:tmpl w:val="913E6158"/>
@@ -42913,7 +41682,7 @@
       </w:rPr>
     </w:lvl>
   </w:abstractNum>
-  <w:abstractNum w:abstractNumId="8">
+  <w:abstractNum w:abstractNumId="8" w15:restartNumberingAfterBreak="0">
     <w:nsid w:val="45272B29"/>
     <w:multiLevelType w:val="multilevel"/>
     <w:tmpl w:val="DD00EF88"/>
@@ -43044,7 +41813,7 @@
       </w:rPr>
     </w:lvl>
   </w:abstractNum>
-  <w:abstractNum w:abstractNumId="9">
+  <w:abstractNum w:abstractNumId="9" w15:restartNumberingAfterBreak="0">
     <w:nsid w:val="457848D8"/>
     <w:multiLevelType w:val="multilevel"/>
     <w:tmpl w:val="9B50F69A"/>
@@ -43130,7 +41899,7 @@
       </w:pPr>
     </w:lvl>
   </w:abstractNum>
-  <w:abstractNum w:abstractNumId="10">
+  <w:abstractNum w:abstractNumId="10" w15:restartNumberingAfterBreak="0">
     <w:nsid w:val="48D13A28"/>
     <w:multiLevelType w:val="multilevel"/>
     <w:tmpl w:val="97AAE230"/>
@@ -43243,7 +42012,7 @@
       </w:rPr>
     </w:lvl>
   </w:abstractNum>
-  <w:abstractNum w:abstractNumId="11">
+  <w:abstractNum w:abstractNumId="11" w15:restartNumberingAfterBreak="0">
     <w:nsid w:val="620074DD"/>
     <w:multiLevelType w:val="multilevel"/>
     <w:tmpl w:val="1B166AC0"/>
@@ -43374,7 +42143,7 @@
       </w:rPr>
     </w:lvl>
   </w:abstractNum>
-  <w:abstractNum w:abstractNumId="12">
+  <w:abstractNum w:abstractNumId="12" w15:restartNumberingAfterBreak="0">
     <w:nsid w:val="67811A76"/>
     <w:multiLevelType w:val="multilevel"/>
     <w:tmpl w:val="8F30AE98"/>
@@ -43487,50 +42256,50 @@
       </w:rPr>
     </w:lvl>
   </w:abstractNum>
-  <w:num w:numId="1">
+  <w:num w:numId="1" w16cid:durableId="1354720120">
     <w:abstractNumId w:val="5"/>
   </w:num>
-  <w:num w:numId="2">
+  <w:num w:numId="2" w16cid:durableId="1746222651">
     <w:abstractNumId w:val="10"/>
   </w:num>
-  <w:num w:numId="3">
+  <w:num w:numId="3" w16cid:durableId="389235611">
     <w:abstractNumId w:val="12"/>
   </w:num>
-  <w:num w:numId="4">
+  <w:num w:numId="4" w16cid:durableId="1620837628">
     <w:abstractNumId w:val="0"/>
   </w:num>
-  <w:num w:numId="5">
+  <w:num w:numId="5" w16cid:durableId="1679231611">
     <w:abstractNumId w:val="1"/>
   </w:num>
-  <w:num w:numId="6">
+  <w:num w:numId="6" w16cid:durableId="1059549860">
     <w:abstractNumId w:val="3"/>
   </w:num>
-  <w:num w:numId="7">
+  <w:num w:numId="7" w16cid:durableId="19943093">
     <w:abstractNumId w:val="9"/>
   </w:num>
-  <w:num w:numId="8">
+  <w:num w:numId="8" w16cid:durableId="996806189">
     <w:abstractNumId w:val="11"/>
   </w:num>
-  <w:num w:numId="9">
+  <w:num w:numId="9" w16cid:durableId="1863740892">
     <w:abstractNumId w:val="8"/>
   </w:num>
-  <w:num w:numId="10">
+  <w:num w:numId="10" w16cid:durableId="1458796833">
     <w:abstractNumId w:val="4"/>
   </w:num>
-  <w:num w:numId="11">
+  <w:num w:numId="11" w16cid:durableId="960920474">
     <w:abstractNumId w:val="2"/>
   </w:num>
-  <w:num w:numId="12">
+  <w:num w:numId="12" w16cid:durableId="1329287123">
     <w:abstractNumId w:val="7"/>
   </w:num>
-  <w:num w:numId="13">
+  <w:num w:numId="13" w16cid:durableId="1126001916">
     <w:abstractNumId w:val="6"/>
   </w:num>
 </w:numbering>
 </file>
 
 <file path=word/styles.xml><?xml version="1.0" encoding="utf-8"?>
-<w:styles xmlns:mc="http://schemas.openxmlformats.org/markup-compatibility/2006" xmlns:r="http://schemas.openxmlformats.org/officeDocument/2006/relationships" xmlns:w="http://schemas.openxmlformats.org/wordprocessingml/2006/main" xmlns:w14="http://schemas.microsoft.com/office/word/2010/wordml" mc:Ignorable="w14">
+<w:styles xmlns:mc="http://schemas.openxmlformats.org/markup-compatibility/2006" xmlns:r="http://schemas.openxmlformats.org/officeDocument/2006/relationships" xmlns:w="http://schemas.openxmlformats.org/wordprocessingml/2006/main" xmlns:w14="http://schemas.microsoft.com/office/word/2010/wordml" xmlns:w15="http://schemas.microsoft.com/office/word/2012/wordml" xmlns:w16cex="http://schemas.microsoft.com/office/word/2018/wordml/cex" xmlns:w16cid="http://schemas.microsoft.com/office/word/2016/wordml/cid" xmlns:w16="http://schemas.microsoft.com/office/word/2018/wordml" xmlns:w16du="http://schemas.microsoft.com/office/word/2023/wordml/word16du" xmlns:w16sdtdh="http://schemas.microsoft.com/office/word/2020/wordml/sdtdatahash" xmlns:w16sdtfl="http://schemas.microsoft.com/office/word/2024/wordml/sdtformatlock" xmlns:w16se="http://schemas.microsoft.com/office/word/2015/wordml/symex" mc:Ignorable="w14 w15 w16se w16cid w16 w16cex w16sdtdh w16sdtfl w16du">
   <w:docDefaults>
     <w:rPrDefault>
       <w:rPr>
@@ -43546,768 +42315,383 @@
       </w:pPr>
     </w:pPrDefault>
   </w:docDefaults>
-  <w:latentStyles w:defLockedState="0" w:defUIPriority="99" w:defSemiHidden="1" w:defUnhideWhenUsed="1" w:defQFormat="0" w:count="267">
-    <w:lsdException w:name="Normal" w:semiHidden="0" w:uiPriority="0" w:unhideWhenUsed="0" w:qFormat="1"/>
-    <w:lsdException w:name="heading 1" w:semiHidden="0" w:uiPriority="9" w:unhideWhenUsed="0" w:qFormat="1"/>
-    <w:lsdException w:name="heading 2" w:uiPriority="9" w:qFormat="1"/>
-    <w:lsdException w:name="heading 3" w:uiPriority="9" w:qFormat="1"/>
-    <w:lsdException w:name="heading 4" w:uiPriority="9" w:qFormat="1"/>
-    <w:lsdException w:name="heading 5" w:uiPriority="9" w:qFormat="1"/>
-    <w:lsdException w:name="heading 6" w:uiPriority="9" w:qFormat="1"/>
-    <w:lsdException w:name="heading 7" w:uiPriority="9" w:qFormat="1"/>
-    <w:lsdException w:name="heading 8" w:uiPriority="9" w:qFormat="1"/>
-    <w:lsdException w:name="heading 9" w:uiPriority="9" w:qFormat="1"/>
-    <w:lsdException w:name="toc 1" w:uiPriority="39"/>
-    <w:lsdException w:name="toc 2" w:uiPriority="39"/>
-    <w:lsdException w:name="toc 3" w:uiPriority="39"/>
-    <w:lsdException w:name="toc 4" w:uiPriority="39"/>
-    <w:lsdException w:name="toc 5" w:uiPriority="39"/>
-    <w:lsdException w:name="toc 6" w:uiPriority="39"/>
-    <w:lsdException w:name="toc 7" w:uiPriority="39"/>
-    <w:lsdException w:name="toc 8" w:uiPriority="39"/>
-    <w:lsdException w:name="toc 9" w:uiPriority="39"/>
-    <w:lsdException w:name="caption" w:uiPriority="35" w:qFormat="1"/>
-    <w:lsdException w:name="Title" w:semiHidden="0" w:uiPriority="10" w:unhideWhenUsed="0" w:qFormat="1"/>
-    <w:lsdException w:name="Default Paragraph Font" w:uiPriority="1"/>
-    <w:lsdException w:name="Subtitle" w:semiHidden="0" w:uiPriority="11" w:unhideWhenUsed="0" w:qFormat="1"/>
-    <w:lsdException w:name="Strong" w:semiHidden="0" w:uiPriority="22" w:unhideWhenUsed="0" w:qFormat="1"/>
-    <w:lsdException w:name="Emphasis" w:semiHidden="0" w:uiPriority="20" w:unhideWhenUsed="0" w:qFormat="1"/>
-    <w:lsdException w:name="Table Grid" w:semiHidden="0" w:uiPriority="39" w:unhideWhenUsed="0"/>
-    <w:lsdException w:name="Placeholder Text" w:unhideWhenUsed="0"/>
-    <w:lsdException w:name="No Spacing" w:semiHidden="0" w:uiPriority="1" w:unhideWhenUsed="0" w:qFormat="1"/>
-    <w:lsdException w:name="Light Shading" w:semiHidden="0" w:uiPriority="60" w:unhideWhenUsed="0"/>
-    <w:lsdException w:name="Light List" w:semiHidden="0" w:uiPriority="61" w:unhideWhenUsed="0"/>
-    <w:lsdException w:name="Light Grid" w:semiHidden="0" w:uiPriority="62" w:unhideWhenUsed="0"/>
-    <w:lsdException w:name="Medium Shading 1" w:semiHidden="0" w:uiPriority="63" w:unhideWhenUsed="0"/>
-    <w:lsdException w:name="Medium Shading 2" w:semiHidden="0" w:uiPriority="64" w:unhideWhenUsed="0"/>
-    <w:lsdException w:name="Medium List 1" w:semiHidden="0" w:uiPriority="65" w:unhideWhenUsed="0"/>
-    <w:lsdException w:name="Medium List 2" w:semiHidden="0" w:uiPriority="66" w:unhideWhenUsed="0"/>
-    <w:lsdException w:name="Medium Grid 1" w:semiHidden="0" w:uiPriority="67" w:unhideWhenUsed="0"/>
-    <w:lsdException w:name="Medium Grid 2" w:semiHidden="0" w:uiPriority="68" w:unhideWhenUsed="0"/>
-    <w:lsdException w:name="Medium Grid 3" w:semiHidden="0" w:uiPriority="69" w:unhideWhenUsed="0"/>
-    <w:lsdException w:name="Dark List" w:semiHidden="0" w:uiPriority="70" w:unhideWhenUsed="0"/>
-    <w:lsdException w:name="Colorful Shading" w:semiHidden="0" w:uiPriority="71" w:unhideWhenUsed="0"/>
-    <w:lsdException w:name="Colorful List" w:semiHidden="0" w:uiPriority="72" w:unhideWhenUsed="0"/>
-    <w:lsdException w:name="Colorful Grid" w:semiHidden="0" w:uiPriority="73" w:unhideWhenUsed="0"/>
-    <w:lsdException w:name="Light Shading Accent 1" w:semiHidden="0" w:uiPriority="60" w:unhideWhenUsed="0"/>
-    <w:lsdException w:name="Light List Accent 1" w:semiHidden="0" w:uiPriority="61" w:unhideWhenUsed="0"/>
-    <w:lsdException w:name="Light Grid Accent 1" w:semiHidden="0" w:uiPriority="62" w:unhideWhenUsed="0"/>
-    <w:lsdException w:name="Medium Shading 1 Accent 1" w:semiHidden="0" w:uiPriority="63" w:unhideWhenUsed="0"/>
-    <w:lsdException w:name="Medium Shading 2 Accent 1" w:semiHidden="0" w:uiPriority="64" w:unhideWhenUsed="0"/>
-    <w:lsdException w:name="Medium List 1 Accent 1" w:semiHidden="0" w:uiPriority="65" w:unhideWhenUsed="0"/>
-    <w:lsdException w:name="Revision" w:unhideWhenUsed="0"/>
-    <w:lsdException w:name="List Paragraph" w:semiHidden="0" w:uiPriority="34" w:unhideWhenUsed="0" w:qFormat="1"/>
-    <w:lsdException w:name="Quote" w:semiHidden="0" w:uiPriority="29" w:unhideWhenUsed="0" w:qFormat="1"/>
-    <w:lsdException w:name="Intense Quote" w:semiHidden="0" w:uiPriority="30" w:unhideWhenUsed="0" w:qFormat="1"/>
-    <w:lsdException w:name="Medium List 2 Accent 1" w:semiHidden="0" w:uiPriority="66" w:unhideWhenUsed="0"/>
-    <w:lsdException w:name="Medium Grid 1 Accent 1" w:semiHidden="0" w:uiPriority="67" w:unhideWhenUsed="0"/>
-    <w:lsdException w:name="Medium Grid 2 Accent 1" w:semiHidden="0" w:uiPriority="68" w:unhideWhenUsed="0"/>
-    <w:lsdException w:name="Medium Grid 3 Accent 1" w:semiHidden="0" w:uiPriority="69" w:unhideWhenUsed="0"/>
-    <w:lsdException w:name="Dark List Accent 1" w:semiHidden="0" w:uiPriority="70" w:unhideWhenUsed="0"/>
-    <w:lsdException w:name="Colorful Shading Accent 1" w:semiHidden="0" w:uiPriority="71" w:unhideWhenUsed="0"/>
-    <w:lsdException w:name="Colorful List Accent 1" w:semiHidden="0" w:uiPriority="72" w:unhideWhenUsed="0"/>
-    <w:lsdException w:name="Colorful Grid Accent 1" w:semiHidden="0" w:uiPriority="73" w:unhideWhenUsed="0"/>
-    <w:lsdException w:name="Light Shading Accent 2" w:semiHidden="0" w:uiPriority="60" w:unhideWhenUsed="0"/>
-    <w:lsdException w:name="Light List Accent 2" w:semiHidden="0" w:uiPriority="61" w:unhideWhenUsed="0"/>
-    <w:lsdException w:name="Light Grid Accent 2" w:semiHidden="0" w:uiPriority="62" w:unhideWhenUsed="0"/>
-    <w:lsdException w:name="Medium Shading 1 Accent 2" w:semiHidden="0" w:uiPriority="63" w:unhideWhenUsed="0"/>
-    <w:lsdException w:name="Medium Shading 2 Accent 2" w:semiHidden="0" w:uiPriority="64" w:unhideWhenUsed="0"/>
-    <w:lsdException w:name="Medium List 1 Accent 2" w:semiHidden="0" w:uiPriority="65" w:unhideWhenUsed="0"/>
-    <w:lsdException w:name="Medium List 2 Accent 2" w:semiHidden="0" w:uiPriority="66" w:unhideWhenUsed="0"/>
-    <w:lsdException w:name="Medium Grid 1 Accent 2" w:semiHidden="0" w:uiPriority="67" w:unhideWhenUsed="0"/>
-    <w:lsdException w:name="Medium Grid 2 Accent 2" w:semiHidden="0" w:uiPriority="68" w:unhideWhenUsed="0"/>
-    <w:lsdException w:name="Medium Grid 3 Accent 2" w:semiHidden="0" w:uiPriority="69" w:unhideWhenUsed="0"/>
-    <w:lsdException w:name="Dark List Accent 2" w:semiHidden="0" w:uiPriority="70" w:unhideWhenUsed="0"/>
-    <w:lsdException w:name="Colorful Shading Accent 2" w:semiHidden="0" w:uiPriority="71" w:unhideWhenUsed="0"/>
-    <w:lsdException w:name="Colorful List Accent 2" w:semiHidden="0" w:uiPriority="72" w:unhideWhenUsed="0"/>
-    <w:lsdException w:name="Colorful Grid Accent 2" w:semiHidden="0" w:uiPriority="73" w:unhideWhenUsed="0"/>
-    <w:lsdException w:name="Light Shading Accent 3" w:semiHidden="0" w:uiPriority="60" w:unhideWhenUsed="0"/>
-    <w:lsdException w:name="Light List Accent 3" w:semiHidden="0" w:uiPriority="61" w:unhideWhenUsed="0"/>
-    <w:lsdException w:name="Light Grid Accent 3" w:semiHidden="0" w:uiPriority="62" w:unhideWhenUsed="0"/>
-    <w:lsdException w:name="Medium Shading 1 Accent 3" w:semiHidden="0" w:uiPriority="63" w:unhideWhenUsed="0"/>
-    <w:lsdException w:name="Medium Shading 2 Accent 3" w:semiHidden="0" w:uiPriority="64" w:unhideWhenUsed="0"/>
-    <w:lsdException w:name="Medium List 1 Accent 3" w:semiHidden="0" w:uiPriority="65" w:unhideWhenUsed="0"/>
-    <w:lsdException w:name="Medium List 2 Accent 3" w:semiHidden="0" w:uiPriority="66" w:unhideWhenUsed="0"/>
-    <w:lsdException w:name="Medium Grid 1 Accent 3" w:semiHidden="0" w:uiPriority="67" w:unhideWhenUsed="0"/>
-    <w:lsdException w:name="Medium Grid 2 Accent 3" w:semiHidden="0" w:uiPriority="68" w:unhideWhenUsed="0"/>
-    <w:lsdException w:name="Medium Grid 3 Accent 3" w:semiHidden="0" w:uiPriority="69" w:unhideWhenUsed="0"/>
-    <w:lsdException w:name="Dark List Accent 3" w:semiHidden="0" w:uiPriority="70" w:unhideWhenUsed="0"/>
-    <w:lsdException w:name="Colorful Shading Accent 3" w:semiHidden="0" w:uiPriority="71" w:unhideWhenUsed="0"/>
-    <w:lsdException w:name="Colorful List Accent 3" w:semiHidden="0" w:uiPriority="72" w:unhideWhenUsed="0"/>
-    <w:lsdException w:name="Colorful Grid Accent 3" w:semiHidden="0" w:uiPriority="73" w:unhideWhenUsed="0"/>
-    <w:lsdException w:name="Light Shading Accent 4" w:semiHidden="0" w:uiPriority="60" w:unhideWhenUsed="0"/>
-    <w:lsdException w:name="Light List Accent 4" w:semiHidden="0" w:uiPriority="61" w:unhideWhenUsed="0"/>
-    <w:lsdException w:name="Light Grid Accent 4" w:semiHidden="0" w:uiPriority="62" w:unhideWhenUsed="0"/>
-    <w:lsdException w:name="Medium Shading 1 Accent 4" w:semiHidden="0" w:uiPriority="63" w:unhideWhenUsed="0"/>
-    <w:lsdException w:name="Medium Shading 2 Accent 4" w:semiHidden="0" w:uiPriority="64" w:unhideWhenUsed="0"/>
-    <w:lsdException w:name="Medium List 1 Accent 4" w:semiHidden="0" w:uiPriority="65" w:unhideWhenUsed="0"/>
-    <w:lsdException w:name="Medium List 2 Accent 4" w:semiHidden="0" w:uiPriority="66" w:unhideWhenUsed="0"/>
-    <w:lsdException w:name="Medium Grid 1 Accent 4" w:semiHidden="0" w:uiPriority="67" w:unhideWhenUsed="0"/>
-    <w:lsdException w:name="Medium Grid 2 Accent 4" w:semiHidden="0" w:uiPriority="68" w:unhideWhenUsed="0"/>
-    <w:lsdException w:name="Medium Grid 3 Accent 4" w:semiHidden="0" w:uiPriority="69" w:unhideWhenUsed="0"/>
-    <w:lsdException w:name="Dark List Accent 4" w:semiHidden="0" w:uiPriority="70" w:unhideWhenUsed="0"/>
-    <w:lsdException w:name="Colorful Shading Accent 4" w:semiHidden="0" w:uiPriority="71" w:unhideWhenUsed="0"/>
-    <w:lsdException w:name="Colorful List Accent 4" w:semiHidden="0" w:uiPriority="72" w:unhideWhenUsed="0"/>
-    <w:lsdException w:name="Colorful Grid Accent 4" w:semiHidden="0" w:uiPriority="73" w:unhideWhenUsed="0"/>
-    <w:lsdException w:name="Light Shading Accent 5" w:semiHidden="0" w:uiPriority="60" w:unhideWhenUsed="0"/>
-    <w:lsdException w:name="Light List Accent 5" w:semiHidden="0" w:uiPriority="61" w:unhideWhenUsed="0"/>
-    <w:lsdException w:name="Light Grid Accent 5" w:semiHidden="0" w:uiPriority="62" w:unhideWhenUsed="0"/>
-    <w:lsdException w:name="Medium Shading 1 Accent 5" w:semiHidden="0" w:uiPriority="63" w:unhideWhenUsed="0"/>
-    <w:lsdException w:name="Medium Shading 2 Accent 5" w:semiHidden="0" w:uiPriority="64" w:unhideWhenUsed="0"/>
-    <w:lsdException w:name="Medium List 1 Accent 5" w:semiHidden="0" w:uiPriority="65" w:unhideWhenUsed="0"/>
-    <w:lsdException w:name="Medium List 2 Accent 5" w:semiHidden="0" w:uiPriority="66" w:unhideWhenUsed="0"/>
-    <w:lsdException w:name="Medium Grid 1 Accent 5" w:semiHidden="0" w:uiPriority="67" w:unhideWhenUsed="0"/>
-    <w:lsdException w:name="Medium Grid 2 Accent 5" w:semiHidden="0" w:uiPriority="68" w:unhideWhenUsed="0"/>
-    <w:lsdException w:name="Medium Grid 3 Accent 5" w:semiHidden="0" w:uiPriority="69" w:unhideWhenUsed="0"/>
-    <w:lsdException w:name="Dark List Accent 5" w:semiHidden="0" w:uiPriority="70" w:unhideWhenUsed="0"/>
-    <w:lsdException w:name="Colorful Shading Accent 5" w:semiHidden="0" w:uiPriority="71" w:unhideWhenUsed="0"/>
-    <w:lsdException w:name="Colorful List Accent 5" w:semiHidden="0" w:uiPriority="72" w:unhideWhenUsed="0"/>
-    <w:lsdException w:name="Colorful Grid Accent 5" w:semiHidden="0" w:uiPriority="73" w:unhideWhenUsed="0"/>
-    <w:lsdException w:name="Light Shading Accent 6" w:semiHidden="0" w:uiPriority="60" w:unhideWhenUsed="0"/>
-    <w:lsdException w:name="Light List Accent 6" w:semiHidden="0" w:uiPriority="61" w:unhideWhenUsed="0"/>
-    <w:lsdException w:name="Light Grid Accent 6" w:semiHidden="0" w:uiPriority="62" w:unhideWhenUsed="0"/>
-    <w:lsdException w:name="Medium Shading 1 Accent 6" w:semiHidden="0" w:uiPriority="63" w:unhideWhenUsed="0"/>
-    <w:lsdException w:name="Medium Shading 2 Accent 6" w:semiHidden="0" w:uiPriority="64" w:unhideWhenUsed="0"/>
-    <w:lsdException w:name="Medium List 1 Accent 6" w:semiHidden="0" w:uiPriority="65" w:unhideWhenUsed="0"/>
-    <w:lsdException w:name="Medium List 2 Accent 6" w:semiHidden="0" w:uiPriority="66" w:unhideWhenUsed="0"/>
-    <w:lsdException w:name="Medium Grid 1 Accent 6" w:semiHidden="0" w:uiPriority="67" w:unhideWhenUsed="0"/>
-    <w:lsdException w:name="Medium Grid 2 Accent 6" w:semiHidden="0" w:uiPriority="68" w:unhideWhenUsed="0"/>
-    <w:lsdException w:name="Medium Grid 3 Accent 6" w:semiHidden="0" w:uiPriority="69" w:unhideWhenUsed="0"/>
-    <w:lsdException w:name="Dark List Accent 6" w:semiHidden="0" w:uiPriority="70" w:unhideWhenUsed="0"/>
-    <w:lsdException w:name="Colorful Shading Accent 6" w:semiHidden="0" w:uiPriority="71" w:unhideWhenUsed="0"/>
-    <w:lsdException w:name="Colorful List Accent 6" w:semiHidden="0" w:uiPriority="72" w:unhideWhenUsed="0"/>
-    <w:lsdException w:name="Colorful Grid Accent 6" w:semiHidden="0" w:uiPriority="73" w:unhideWhenUsed="0"/>
-    <w:lsdException w:name="Subtle Emphasis" w:semiHidden="0" w:uiPriority="19" w:unhideWhenUsed="0" w:qFormat="1"/>
-    <w:lsdException w:name="Intense Emphasis" w:semiHidden="0" w:uiPriority="21" w:unhideWhenUsed="0" w:qFormat="1"/>
-    <w:lsdException w:name="Subtle Reference" w:semiHidden="0" w:uiPriority="31" w:unhideWhenUsed="0" w:qFormat="1"/>
-    <w:lsdException w:name="Intense Reference" w:semiHidden="0" w:uiPriority="32" w:unhideWhenUsed="0" w:qFormat="1"/>
-    <w:lsdException w:name="Book Title" w:semiHidden="0" w:uiPriority="33" w:unhideWhenUsed="0" w:qFormat="1"/>
-    <w:lsdException w:name="Bibliography" w:uiPriority="37"/>
-    <w:lsdException w:name="TOC Heading" w:uiPriority="39" w:qFormat="1"/>
-  </w:latentStyles>
-  <w:style w:type="paragraph" w:default="1" w:styleId="Normal">
-    <w:name w:val="Normal"/>
-    <w:qFormat/>
-  </w:style>
-  <w:style w:type="paragraph" w:styleId="Ttulo1">
-    <w:name w:val="heading 1"/>
-    <w:basedOn w:val="Normal"/>
-    <w:next w:val="Normal"/>
-    <w:uiPriority w:val="9"/>
-    <w:qFormat/>
-    <w:pPr>
-      <w:keepNext/>
-      <w:keepLines/>
-      <w:spacing w:before="360" w:after="80"/>
-      <w:outlineLvl w:val="0"/>
-    </w:pPr>
-    <w:rPr>
-      <w:rFonts w:ascii="Play" w:eastAsia="Play" w:hAnsi="Play" w:cs="Play"/>
-      <w:color w:val="0F4761"/>
-      <w:sz w:val="40"/>
-      <w:szCs w:val="40"/>
-    </w:rPr>
-  </w:style>
-  <w:style w:type="paragraph" w:styleId="Ttulo2">
-    <w:name w:val="heading 2"/>
-    <w:basedOn w:val="Normal"/>
-    <w:next w:val="Normal"/>
-    <w:uiPriority w:val="9"/>
-    <w:semiHidden/>
-    <w:unhideWhenUsed/>
-    <w:qFormat/>
-    <w:pPr>
-      <w:keepNext/>
-      <w:keepLines/>
-      <w:spacing w:before="160" w:after="80"/>
-      <w:outlineLvl w:val="1"/>
-    </w:pPr>
-    <w:rPr>
-      <w:rFonts w:ascii="Play" w:eastAsia="Play" w:hAnsi="Play" w:cs="Play"/>
-      <w:color w:val="0F4761"/>
-      <w:sz w:val="32"/>
-      <w:szCs w:val="32"/>
-    </w:rPr>
-  </w:style>
-  <w:style w:type="paragraph" w:styleId="Ttulo3">
-    <w:name w:val="heading 3"/>
-    <w:basedOn w:val="Normal"/>
-    <w:next w:val="Normal"/>
-    <w:uiPriority w:val="9"/>
-    <w:semiHidden/>
-    <w:unhideWhenUsed/>
-    <w:qFormat/>
-    <w:pPr>
-      <w:keepNext/>
-      <w:keepLines/>
-      <w:spacing w:before="160" w:after="80"/>
-      <w:outlineLvl w:val="2"/>
-    </w:pPr>
-    <w:rPr>
-      <w:color w:val="0F4761"/>
-      <w:sz w:val="28"/>
-      <w:szCs w:val="28"/>
-    </w:rPr>
-  </w:style>
-  <w:style w:type="paragraph" w:styleId="Ttulo4">
-    <w:name w:val="heading 4"/>
-    <w:basedOn w:val="Normal"/>
-    <w:next w:val="Normal"/>
-    <w:uiPriority w:val="9"/>
-    <w:semiHidden/>
-    <w:unhideWhenUsed/>
-    <w:qFormat/>
-    <w:pPr>
-      <w:keepNext/>
-      <w:keepLines/>
-      <w:spacing w:before="80" w:after="40"/>
-      <w:outlineLvl w:val="3"/>
-    </w:pPr>
-    <w:rPr>
-      <w:i/>
-      <w:iCs/>
-      <w:color w:val="0F4761"/>
-    </w:rPr>
-  </w:style>
-  <w:style w:type="paragraph" w:styleId="Ttulo5">
-    <w:name w:val="heading 5"/>
-    <w:basedOn w:val="Normal"/>
-    <w:next w:val="Normal"/>
-    <w:uiPriority w:val="9"/>
-    <w:semiHidden/>
-    <w:unhideWhenUsed/>
-    <w:qFormat/>
-    <w:pPr>
-      <w:keepNext/>
-      <w:keepLines/>
-      <w:spacing w:before="80" w:after="40"/>
-      <w:outlineLvl w:val="4"/>
-    </w:pPr>
-    <w:rPr>
-      <w:color w:val="0F4761"/>
-    </w:rPr>
-  </w:style>
-  <w:style w:type="paragraph" w:styleId="Ttulo6">
-    <w:name w:val="heading 6"/>
-    <w:basedOn w:val="Normal"/>
-    <w:next w:val="Normal"/>
-    <w:uiPriority w:val="9"/>
-    <w:semiHidden/>
-    <w:unhideWhenUsed/>
-    <w:qFormat/>
-    <w:pPr>
-      <w:keepNext/>
-      <w:keepLines/>
-      <w:spacing w:before="40" w:after="0"/>
-      <w:outlineLvl w:val="5"/>
-    </w:pPr>
-    <w:rPr>
-      <w:i/>
-      <w:iCs/>
-      <w:color w:val="595959"/>
-    </w:rPr>
-  </w:style>
-  <w:style w:type="character" w:default="1" w:styleId="Fuentedeprrafopredeter">
-    <w:name w:val="Default Paragraph Font"/>
-    <w:uiPriority w:val="1"/>
-    <w:semiHidden/>
-    <w:unhideWhenUsed/>
-  </w:style>
-  <w:style w:type="table" w:default="1" w:styleId="Tablanormal">
-    <w:name w:val="Normal Table"/>
-    <w:uiPriority w:val="99"/>
-    <w:semiHidden/>
-    <w:unhideWhenUsed/>
-    <w:tblPr>
-      <w:tblInd w:w="0" w:type="dxa"/>
-      <w:tblCellMar>
-        <w:top w:w="0" w:type="dxa"/>
-        <w:left w:w="108" w:type="dxa"/>
-        <w:bottom w:w="0" w:type="dxa"/>
-        <w:right w:w="108" w:type="dxa"/>
-      </w:tblCellMar>
-    </w:tblPr>
-  </w:style>
-  <w:style w:type="numbering" w:default="1" w:styleId="Sinlista">
-    <w:name w:val="No List"/>
-    <w:uiPriority w:val="99"/>
-    <w:semiHidden/>
-    <w:unhideWhenUsed/>
-  </w:style>
-  <w:style w:type="table" w:customStyle="1" w:styleId="TableNormal">
-    <w:name w:val="TableNormal"/>
-    <w:tblPr>
-      <w:tblCellMar>
-        <w:top w:w="100" w:type="dxa"/>
-        <w:left w:w="100" w:type="dxa"/>
-        <w:bottom w:w="100" w:type="dxa"/>
-        <w:right w:w="100" w:type="dxa"/>
-      </w:tblCellMar>
-    </w:tblPr>
-  </w:style>
-  <w:style w:type="paragraph" w:styleId="Ttulo">
-    <w:name w:val="Title"/>
-    <w:basedOn w:val="Normal"/>
-    <w:next w:val="Normal"/>
-    <w:uiPriority w:val="10"/>
-    <w:qFormat/>
-    <w:pPr>
-      <w:spacing w:after="80" w:line="240" w:lineRule="auto"/>
-    </w:pPr>
-    <w:rPr>
-      <w:rFonts w:ascii="Play" w:eastAsia="Play" w:hAnsi="Play" w:cs="Play"/>
-      <w:sz w:val="56"/>
-      <w:szCs w:val="56"/>
-    </w:rPr>
-  </w:style>
-  <w:style w:type="paragraph" w:styleId="Subttulo">
-    <w:name w:val="Subtitle"/>
-    <w:basedOn w:val="Normal"/>
-    <w:next w:val="Normal"/>
-    <w:uiPriority w:val="11"/>
-    <w:qFormat/>
-    <w:rPr>
-      <w:color w:val="595959"/>
-      <w:sz w:val="28"/>
-      <w:szCs w:val="28"/>
-    </w:rPr>
-  </w:style>
-  <w:style w:type="table" w:customStyle="1" w:styleId="a">
-    <w:basedOn w:val="TableNormal"/>
-    <w:tblPr>
-      <w:tblStyleRowBandSize w:val="1"/>
-      <w:tblStyleColBandSize w:val="1"/>
-      <w:tblCellMar>
-        <w:top w:w="15" w:type="dxa"/>
-        <w:left w:w="15" w:type="dxa"/>
-        <w:bottom w:w="15" w:type="dxa"/>
-        <w:right w:w="15" w:type="dxa"/>
-      </w:tblCellMar>
-    </w:tblPr>
-  </w:style>
-  <w:style w:type="table" w:customStyle="1" w:styleId="a0">
-    <w:basedOn w:val="TableNormal"/>
-    <w:tblPr>
-      <w:tblStyleRowBandSize w:val="1"/>
-      <w:tblStyleColBandSize w:val="1"/>
-      <w:tblCellMar>
-        <w:top w:w="15" w:type="dxa"/>
-        <w:left w:w="15" w:type="dxa"/>
-        <w:bottom w:w="15" w:type="dxa"/>
-        <w:right w:w="15" w:type="dxa"/>
-      </w:tblCellMar>
-    </w:tblPr>
-  </w:style>
-  <w:style w:type="table" w:customStyle="1" w:styleId="a1">
-    <w:basedOn w:val="TableNormal"/>
-    <w:tblPr>
-      <w:tblStyleRowBandSize w:val="1"/>
-      <w:tblStyleColBandSize w:val="1"/>
-      <w:tblCellMar>
-        <w:top w:w="15" w:type="dxa"/>
-        <w:left w:w="15" w:type="dxa"/>
-        <w:bottom w:w="15" w:type="dxa"/>
-        <w:right w:w="15" w:type="dxa"/>
-      </w:tblCellMar>
-    </w:tblPr>
-  </w:style>
-  <w:style w:type="table" w:customStyle="1" w:styleId="a2">
-    <w:basedOn w:val="TableNormal"/>
-    <w:tblPr>
-      <w:tblStyleRowBandSize w:val="1"/>
-      <w:tblStyleColBandSize w:val="1"/>
-      <w:tblCellMar>
-        <w:top w:w="15" w:type="dxa"/>
-        <w:left w:w="15" w:type="dxa"/>
-        <w:bottom w:w="15" w:type="dxa"/>
-        <w:right w:w="15" w:type="dxa"/>
-      </w:tblCellMar>
-    </w:tblPr>
-  </w:style>
-  <w:style w:type="table" w:customStyle="1" w:styleId="a3">
-    <w:basedOn w:val="TableNormal"/>
-    <w:tblPr>
-      <w:tblStyleRowBandSize w:val="1"/>
-      <w:tblStyleColBandSize w:val="1"/>
-      <w:tblCellMar>
-        <w:top w:w="15" w:type="dxa"/>
-        <w:left w:w="15" w:type="dxa"/>
-        <w:bottom w:w="15" w:type="dxa"/>
-        <w:right w:w="15" w:type="dxa"/>
-      </w:tblCellMar>
-    </w:tblPr>
-  </w:style>
-  <w:style w:type="table" w:customStyle="1" w:styleId="a4">
-    <w:basedOn w:val="TableNormal"/>
-    <w:tblPr>
-      <w:tblStyleRowBandSize w:val="1"/>
-      <w:tblStyleColBandSize w:val="1"/>
-    </w:tblPr>
-  </w:style>
-  <w:style w:type="table" w:customStyle="1" w:styleId="a5">
-    <w:basedOn w:val="TableNormal"/>
-    <w:tblPr>
-      <w:tblStyleRowBandSize w:val="1"/>
-      <w:tblStyleColBandSize w:val="1"/>
-    </w:tblPr>
-  </w:style>
-  <w:style w:type="table" w:customStyle="1" w:styleId="a6">
-    <w:basedOn w:val="TableNormal"/>
-    <w:tblPr>
-      <w:tblStyleRowBandSize w:val="1"/>
-      <w:tblStyleColBandSize w:val="1"/>
-    </w:tblPr>
-  </w:style>
-  <w:style w:type="table" w:customStyle="1" w:styleId="a7">
-    <w:basedOn w:val="TableNormal"/>
-    <w:tblPr>
-      <w:tblStyleRowBandSize w:val="1"/>
-      <w:tblStyleColBandSize w:val="1"/>
-    </w:tblPr>
-  </w:style>
-  <w:style w:type="table" w:customStyle="1" w:styleId="a8">
-    <w:basedOn w:val="TableNormal"/>
-    <w:tblPr>
-      <w:tblStyleRowBandSize w:val="1"/>
-      <w:tblStyleColBandSize w:val="1"/>
-    </w:tblPr>
-  </w:style>
-  <w:style w:type="table" w:customStyle="1" w:styleId="a9">
-    <w:basedOn w:val="TableNormal"/>
-    <w:tblPr>
-      <w:tblStyleRowBandSize w:val="1"/>
-      <w:tblStyleColBandSize w:val="1"/>
-    </w:tblPr>
-  </w:style>
-  <w:style w:type="table" w:customStyle="1" w:styleId="aa">
-    <w:basedOn w:val="TableNormal"/>
-    <w:tblPr>
-      <w:tblStyleRowBandSize w:val="1"/>
-      <w:tblStyleColBandSize w:val="1"/>
-      <w:tblCellMar>
-        <w:top w:w="0" w:type="dxa"/>
-        <w:left w:w="115" w:type="dxa"/>
-        <w:bottom w:w="0" w:type="dxa"/>
-        <w:right w:w="115" w:type="dxa"/>
-      </w:tblCellMar>
-    </w:tblPr>
-  </w:style>
-  <w:style w:type="table" w:customStyle="1" w:styleId="ab">
-    <w:basedOn w:val="TableNormal"/>
-    <w:tblPr>
-      <w:tblStyleRowBandSize w:val="1"/>
-      <w:tblStyleColBandSize w:val="1"/>
-      <w:tblCellMar>
-        <w:top w:w="0" w:type="dxa"/>
-        <w:left w:w="115" w:type="dxa"/>
-        <w:bottom w:w="0" w:type="dxa"/>
-        <w:right w:w="115" w:type="dxa"/>
-      </w:tblCellMar>
-    </w:tblPr>
-  </w:style>
-  <w:style w:type="table" w:customStyle="1" w:styleId="ac">
-    <w:basedOn w:val="TableNormal"/>
-    <w:tblPr>
-      <w:tblStyleRowBandSize w:val="1"/>
-      <w:tblStyleColBandSize w:val="1"/>
-      <w:tblCellMar>
-        <w:top w:w="0" w:type="dxa"/>
-        <w:left w:w="115" w:type="dxa"/>
-        <w:bottom w:w="0" w:type="dxa"/>
-        <w:right w:w="115" w:type="dxa"/>
-      </w:tblCellMar>
-    </w:tblPr>
-  </w:style>
-  <w:style w:type="table" w:customStyle="1" w:styleId="ad">
-    <w:basedOn w:val="TableNormal"/>
-    <w:tblPr>
-      <w:tblStyleRowBandSize w:val="1"/>
-      <w:tblStyleColBandSize w:val="1"/>
-      <w:tblCellMar>
-        <w:top w:w="0" w:type="dxa"/>
-        <w:left w:w="115" w:type="dxa"/>
-        <w:bottom w:w="0" w:type="dxa"/>
-        <w:right w:w="115" w:type="dxa"/>
-      </w:tblCellMar>
-    </w:tblPr>
-  </w:style>
-  <w:style w:type="table" w:customStyle="1" w:styleId="ae">
-    <w:basedOn w:val="TableNormal"/>
-    <w:tblPr>
-      <w:tblStyleRowBandSize w:val="1"/>
-      <w:tblStyleColBandSize w:val="1"/>
-      <w:tblCellMar>
-        <w:top w:w="0" w:type="dxa"/>
-        <w:left w:w="115" w:type="dxa"/>
-        <w:bottom w:w="0" w:type="dxa"/>
-        <w:right w:w="115" w:type="dxa"/>
-      </w:tblCellMar>
-    </w:tblPr>
-  </w:style>
-  <w:style w:type="table" w:customStyle="1" w:styleId="af">
-    <w:basedOn w:val="TableNormal"/>
-    <w:tblPr>
-      <w:tblStyleRowBandSize w:val="1"/>
-      <w:tblStyleColBandSize w:val="1"/>
-      <w:tblCellMar>
-        <w:top w:w="0" w:type="dxa"/>
-        <w:left w:w="115" w:type="dxa"/>
-        <w:bottom w:w="0" w:type="dxa"/>
-        <w:right w:w="115" w:type="dxa"/>
-      </w:tblCellMar>
-    </w:tblPr>
-  </w:style>
-  <w:style w:type="table" w:customStyle="1" w:styleId="af0">
-    <w:basedOn w:val="TableNormal"/>
-    <w:tblPr>
-      <w:tblStyleRowBandSize w:val="1"/>
-      <w:tblStyleColBandSize w:val="1"/>
-      <w:tblCellMar>
-        <w:top w:w="0" w:type="dxa"/>
-        <w:left w:w="115" w:type="dxa"/>
-        <w:bottom w:w="0" w:type="dxa"/>
-        <w:right w:w="115" w:type="dxa"/>
-      </w:tblCellMar>
-    </w:tblPr>
-  </w:style>
-  <w:style w:type="table" w:customStyle="1" w:styleId="af1">
-    <w:basedOn w:val="TableNormal"/>
-    <w:tblPr>
-      <w:tblStyleRowBandSize w:val="1"/>
-      <w:tblStyleColBandSize w:val="1"/>
-      <w:tblCellMar>
-        <w:top w:w="0" w:type="dxa"/>
-        <w:left w:w="115" w:type="dxa"/>
-        <w:bottom w:w="0" w:type="dxa"/>
-        <w:right w:w="115" w:type="dxa"/>
-      </w:tblCellMar>
-    </w:tblPr>
-  </w:style>
-  <w:style w:type="table" w:customStyle="1" w:styleId="af2">
-    <w:basedOn w:val="TableNormal"/>
-    <w:tblPr>
-      <w:tblStyleRowBandSize w:val="1"/>
-      <w:tblStyleColBandSize w:val="1"/>
-      <w:tblCellMar>
-        <w:top w:w="0" w:type="dxa"/>
-        <w:left w:w="115" w:type="dxa"/>
-        <w:bottom w:w="0" w:type="dxa"/>
-        <w:right w:w="115" w:type="dxa"/>
-      </w:tblCellMar>
-    </w:tblPr>
-  </w:style>
-  <w:style w:type="table" w:customStyle="1" w:styleId="af3">
-    <w:basedOn w:val="TableNormal"/>
-    <w:tblPr>
-      <w:tblStyleRowBandSize w:val="1"/>
-      <w:tblStyleColBandSize w:val="1"/>
-      <w:tblCellMar>
-        <w:top w:w="0" w:type="dxa"/>
-        <w:left w:w="115" w:type="dxa"/>
-        <w:bottom w:w="0" w:type="dxa"/>
-        <w:right w:w="115" w:type="dxa"/>
-      </w:tblCellMar>
-    </w:tblPr>
-  </w:style>
-  <w:style w:type="table" w:customStyle="1" w:styleId="af4">
-    <w:basedOn w:val="TableNormal"/>
-    <w:tblPr>
-      <w:tblStyleRowBandSize w:val="1"/>
-      <w:tblStyleColBandSize w:val="1"/>
-      <w:tblCellMar>
-        <w:top w:w="0" w:type="dxa"/>
-        <w:left w:w="115" w:type="dxa"/>
-        <w:bottom w:w="0" w:type="dxa"/>
-        <w:right w:w="115" w:type="dxa"/>
-      </w:tblCellMar>
-    </w:tblPr>
-  </w:style>
-  <w:style w:type="table" w:customStyle="1" w:styleId="af5">
-    <w:basedOn w:val="TableNormal"/>
-    <w:tblPr>
-      <w:tblStyleRowBandSize w:val="1"/>
-      <w:tblStyleColBandSize w:val="1"/>
-    </w:tblPr>
-  </w:style>
-  <w:style w:type="table" w:customStyle="1" w:styleId="af6">
-    <w:basedOn w:val="TableNormal"/>
-    <w:tblPr>
-      <w:tblStyleRowBandSize w:val="1"/>
-      <w:tblStyleColBandSize w:val="1"/>
-    </w:tblPr>
-  </w:style>
-  <w:style w:type="table" w:customStyle="1" w:styleId="af7">
-    <w:basedOn w:val="TableNormal"/>
-    <w:tblPr>
-      <w:tblStyleRowBandSize w:val="1"/>
-      <w:tblStyleColBandSize w:val="1"/>
-    </w:tblPr>
-  </w:style>
-  <w:style w:type="table" w:customStyle="1" w:styleId="af8">
-    <w:basedOn w:val="TableNormal"/>
-    <w:tblPr>
-      <w:tblStyleRowBandSize w:val="1"/>
-      <w:tblStyleColBandSize w:val="1"/>
-    </w:tblPr>
-  </w:style>
-</w:styles>
-</file>
-
-<file path=word/stylesWithEffects.xml><?xml version="1.0" encoding="utf-8"?>
-<w:styles xmlns:wpc="http://schemas.microsoft.com/office/word/2010/wordprocessingCanvas" xmlns:mc="http://schemas.openxmlformats.org/markup-compatibility/2006" xmlns:o="urn:schemas-microsoft-com:office:office" xmlns:r="http://schemas.openxmlformats.org/officeDocument/2006/relationships" xmlns:m="http://schemas.openxmlformats.org/officeDocument/2006/math" xmlns:v="urn:schemas-microsoft-com:vml" xmlns:wp14="http://schemas.microsoft.com/office/word/2010/wordprocessingDrawing" xmlns:wp="http://schemas.openxmlformats.org/drawingml/2006/wordprocessingDrawing" xmlns:w10="urn:schemas-microsoft-com:office:word" xmlns:w="http://schemas.openxmlformats.org/wordprocessingml/2006/main" xmlns:w14="http://schemas.microsoft.com/office/word/2010/wordml" xmlns:wpg="http://schemas.microsoft.com/office/word/2010/wordprocessingGroup" xmlns:wpi="http://schemas.microsoft.com/office/word/2010/wordprocessingInk" xmlns:wne="http://schemas.microsoft.com/office/word/2006/wordml" xmlns:wps="http://schemas.microsoft.com/office/word/2010/wordprocessingShape" mc:Ignorable="w14 wp14">
-  <w:docDefaults>
-    <w:rPrDefault>
-      <w:rPr>
-        <w:rFonts w:ascii="Aptos" w:eastAsia="Aptos" w:hAnsi="Aptos" w:cs="Aptos"/>
-        <w:sz w:val="22"/>
-        <w:szCs w:val="22"/>
-        <w:lang w:val="es-CO" w:eastAsia="es-CO" w:bidi="ar-SA"/>
-      </w:rPr>
-    </w:rPrDefault>
-    <w:pPrDefault>
-      <w:pPr>
-        <w:spacing w:after="160" w:line="259" w:lineRule="auto"/>
-      </w:pPr>
-    </w:pPrDefault>
-  </w:docDefaults>
-  <w:latentStyles w:defLockedState="0" w:defUIPriority="99" w:defSemiHidden="1" w:defUnhideWhenUsed="1" w:defQFormat="0" w:count="267">
-    <w:lsdException w:name="Normal" w:semiHidden="0" w:uiPriority="0" w:unhideWhenUsed="0" w:qFormat="1"/>
-    <w:lsdException w:name="heading 1" w:semiHidden="0" w:uiPriority="9" w:unhideWhenUsed="0" w:qFormat="1"/>
-    <w:lsdException w:name="heading 2" w:uiPriority="9" w:qFormat="1"/>
-    <w:lsdException w:name="heading 3" w:uiPriority="9" w:qFormat="1"/>
-    <w:lsdException w:name="heading 4" w:uiPriority="9" w:qFormat="1"/>
-    <w:lsdException w:name="heading 5" w:uiPriority="9" w:qFormat="1"/>
-    <w:lsdException w:name="heading 6" w:uiPriority="9" w:qFormat="1"/>
-    <w:lsdException w:name="heading 7" w:uiPriority="9" w:qFormat="1"/>
-    <w:lsdException w:name="heading 8" w:uiPriority="9" w:qFormat="1"/>
-    <w:lsdException w:name="heading 9" w:uiPriority="9" w:qFormat="1"/>
-    <w:lsdException w:name="toc 1" w:uiPriority="39"/>
-    <w:lsdException w:name="toc 2" w:uiPriority="39"/>
-    <w:lsdException w:name="toc 3" w:uiPriority="39"/>
-    <w:lsdException w:name="toc 4" w:uiPriority="39"/>
-    <w:lsdException w:name="toc 5" w:uiPriority="39"/>
-    <w:lsdException w:name="toc 6" w:uiPriority="39"/>
-    <w:lsdException w:name="toc 7" w:uiPriority="39"/>
-    <w:lsdException w:name="toc 8" w:uiPriority="39"/>
-    <w:lsdException w:name="toc 9" w:uiPriority="39"/>
-    <w:lsdException w:name="caption" w:uiPriority="35" w:qFormat="1"/>
-    <w:lsdException w:name="Title" w:semiHidden="0" w:uiPriority="10" w:unhideWhenUsed="0" w:qFormat="1"/>
-    <w:lsdException w:name="Default Paragraph Font" w:uiPriority="1"/>
-    <w:lsdException w:name="Subtitle" w:semiHidden="0" w:uiPriority="11" w:unhideWhenUsed="0" w:qFormat="1"/>
-    <w:lsdException w:name="Strong" w:semiHidden="0" w:uiPriority="22" w:unhideWhenUsed="0" w:qFormat="1"/>
-    <w:lsdException w:name="Emphasis" w:semiHidden="0" w:uiPriority="20" w:unhideWhenUsed="0" w:qFormat="1"/>
-    <w:lsdException w:name="Table Grid" w:semiHidden="0" w:uiPriority="39" w:unhideWhenUsed="0"/>
-    <w:lsdException w:name="Placeholder Text" w:unhideWhenUsed="0"/>
-    <w:lsdException w:name="No Spacing" w:semiHidden="0" w:uiPriority="1" w:unhideWhenUsed="0" w:qFormat="1"/>
-    <w:lsdException w:name="Light Shading" w:semiHidden="0" w:uiPriority="60" w:unhideWhenUsed="0"/>
-    <w:lsdException w:name="Light List" w:semiHidden="0" w:uiPriority="61" w:unhideWhenUsed="0"/>
-    <w:lsdException w:name="Light Grid" w:semiHidden="0" w:uiPriority="62" w:unhideWhenUsed="0"/>
-    <w:lsdException w:name="Medium Shading 1" w:semiHidden="0" w:uiPriority="63" w:unhideWhenUsed="0"/>
-    <w:lsdException w:name="Medium Shading 2" w:semiHidden="0" w:uiPriority="64" w:unhideWhenUsed="0"/>
-    <w:lsdException w:name="Medium List 1" w:semiHidden="0" w:uiPriority="65" w:unhideWhenUsed="0"/>
-    <w:lsdException w:name="Medium List 2" w:semiHidden="0" w:uiPriority="66" w:unhideWhenUsed="0"/>
-    <w:lsdException w:name="Medium Grid 1" w:semiHidden="0" w:uiPriority="67" w:unhideWhenUsed="0"/>
-    <w:lsdException w:name="Medium Grid 2" w:semiHidden="0" w:uiPriority="68" w:unhideWhenUsed="0"/>
-    <w:lsdException w:name="Medium Grid 3" w:semiHidden="0" w:uiPriority="69" w:unhideWhenUsed="0"/>
-    <w:lsdException w:name="Dark List" w:semiHidden="0" w:uiPriority="70" w:unhideWhenUsed="0"/>
-    <w:lsdException w:name="Colorful Shading" w:semiHidden="0" w:uiPriority="71" w:unhideWhenUsed="0"/>
-    <w:lsdException w:name="Colorful List" w:semiHidden="0" w:uiPriority="72" w:unhideWhenUsed="0"/>
-    <w:lsdException w:name="Colorful Grid" w:semiHidden="0" w:uiPriority="73" w:unhideWhenUsed="0"/>
-    <w:lsdException w:name="Light Shading Accent 1" w:semiHidden="0" w:uiPriority="60" w:unhideWhenUsed="0"/>
-    <w:lsdException w:name="Light List Accent 1" w:semiHidden="0" w:uiPriority="61" w:unhideWhenUsed="0"/>
-    <w:lsdException w:name="Light Grid Accent 1" w:semiHidden="0" w:uiPriority="62" w:unhideWhenUsed="0"/>
-    <w:lsdException w:name="Medium Shading 1 Accent 1" w:semiHidden="0" w:uiPriority="63" w:unhideWhenUsed="0"/>
-    <w:lsdException w:name="Medium Shading 2 Accent 1" w:semiHidden="0" w:uiPriority="64" w:unhideWhenUsed="0"/>
-    <w:lsdException w:name="Medium List 1 Accent 1" w:semiHidden="0" w:uiPriority="65" w:unhideWhenUsed="0"/>
-    <w:lsdException w:name="Revision" w:unhideWhenUsed="0"/>
-    <w:lsdException w:name="List Paragraph" w:semiHidden="0" w:uiPriority="34" w:unhideWhenUsed="0" w:qFormat="1"/>
-    <w:lsdException w:name="Quote" w:semiHidden="0" w:uiPriority="29" w:unhideWhenUsed="0" w:qFormat="1"/>
-    <w:lsdException w:name="Intense Quote" w:semiHidden="0" w:uiPriority="30" w:unhideWhenUsed="0" w:qFormat="1"/>
-    <w:lsdException w:name="Medium List 2 Accent 1" w:semiHidden="0" w:uiPriority="66" w:unhideWhenUsed="0"/>
-    <w:lsdException w:name="Medium Grid 1 Accent 1" w:semiHidden="0" w:uiPriority="67" w:unhideWhenUsed="0"/>
-    <w:lsdException w:name="Medium Grid 2 Accent 1" w:semiHidden="0" w:uiPriority="68" w:unhideWhenUsed="0"/>
-    <w:lsdException w:name="Medium Grid 3 Accent 1" w:semiHidden="0" w:uiPriority="69" w:unhideWhenUsed="0"/>
-    <w:lsdException w:name="Dark List Accent 1" w:semiHidden="0" w:uiPriority="70" w:unhideWhenUsed="0"/>
-    <w:lsdException w:name="Colorful Shading Accent 1" w:semiHidden="0" w:uiPriority="71" w:unhideWhenUsed="0"/>
-    <w:lsdException w:name="Colorful List Accent 1" w:semiHidden="0" w:uiPriority="72" w:unhideWhenUsed="0"/>
-    <w:lsdException w:name="Colorful Grid Accent 1" w:semiHidden="0" w:uiPriority="73" w:unhideWhenUsed="0"/>
-    <w:lsdException w:name="Light Shading Accent 2" w:semiHidden="0" w:uiPriority="60" w:unhideWhenUsed="0"/>
-    <w:lsdException w:name="Light List Accent 2" w:semiHidden="0" w:uiPriority="61" w:unhideWhenUsed="0"/>
-    <w:lsdException w:name="Light Grid Accent 2" w:semiHidden="0" w:uiPriority="62" w:unhideWhenUsed="0"/>
-    <w:lsdException w:name="Medium Shading 1 Accent 2" w:semiHidden="0" w:uiPriority="63" w:unhideWhenUsed="0"/>
-    <w:lsdException w:name="Medium Shading 2 Accent 2" w:semiHidden="0" w:uiPriority="64" w:unhideWhenUsed="0"/>
-    <w:lsdException w:name="Medium List 1 Accent 2" w:semiHidden="0" w:uiPriority="65" w:unhideWhenUsed="0"/>
-    <w:lsdException w:name="Medium List 2 Accent 2" w:semiHidden="0" w:uiPriority="66" w:unhideWhenUsed="0"/>
-    <w:lsdException w:name="Medium Grid 1 Accent 2" w:semiHidden="0" w:uiPriority="67" w:unhideWhenUsed="0"/>
-    <w:lsdException w:name="Medium Grid 2 Accent 2" w:semiHidden="0" w:uiPriority="68" w:unhideWhenUsed="0"/>
-    <w:lsdException w:name="Medium Grid 3 Accent 2" w:semiHidden="0" w:uiPriority="69" w:unhideWhenUsed="0"/>
-    <w:lsdException w:name="Dark List Accent 2" w:semiHidden="0" w:uiPriority="70" w:unhideWhenUsed="0"/>
-    <w:lsdException w:name="Colorful Shading Accent 2" w:semiHidden="0" w:uiPriority="71" w:unhideWhenUsed="0"/>
-    <w:lsdException w:name="Colorful List Accent 2" w:semiHidden="0" w:uiPriority="72" w:unhideWhenUsed="0"/>
-    <w:lsdException w:name="Colorful Grid Accent 2" w:semiHidden="0" w:uiPriority="73" w:unhideWhenUsed="0"/>
-    <w:lsdException w:name="Light Shading Accent 3" w:semiHidden="0" w:uiPriority="60" w:unhideWhenUsed="0"/>
-    <w:lsdException w:name="Light List Accent 3" w:semiHidden="0" w:uiPriority="61" w:unhideWhenUsed="0"/>
-    <w:lsdException w:name="Light Grid Accent 3" w:semiHidden="0" w:uiPriority="62" w:unhideWhenUsed="0"/>
-    <w:lsdException w:name="Medium Shading 1 Accent 3" w:semiHidden="0" w:uiPriority="63" w:unhideWhenUsed="0"/>
-    <w:lsdException w:name="Medium Shading 2 Accent 3" w:semiHidden="0" w:uiPriority="64" w:unhideWhenUsed="0"/>
-    <w:lsdException w:name="Medium List 1 Accent 3" w:semiHidden="0" w:uiPriority="65" w:unhideWhenUsed="0"/>
-    <w:lsdException w:name="Medium List 2 Accent 3" w:semiHidden="0" w:uiPriority="66" w:unhideWhenUsed="0"/>
-    <w:lsdException w:name="Medium Grid 1 Accent 3" w:semiHidden="0" w:uiPriority="67" w:unhideWhenUsed="0"/>
-    <w:lsdException w:name="Medium Grid 2 Accent 3" w:semiHidden="0" w:uiPriority="68" w:unhideWhenUsed="0"/>
-    <w:lsdException w:name="Medium Grid 3 Accent 3" w:semiHidden="0" w:uiPriority="69" w:unhideWhenUsed="0"/>
-    <w:lsdException w:name="Dark List Accent 3" w:semiHidden="0" w:uiPriority="70" w:unhideWhenUsed="0"/>
-    <w:lsdException w:name="Colorful Shading Accent 3" w:semiHidden="0" w:uiPriority="71" w:unhideWhenUsed="0"/>
-    <w:lsdException w:name="Colorful List Accent 3" w:semiHidden="0" w:uiPriority="72" w:unhideWhenUsed="0"/>
-    <w:lsdException w:name="Colorful Grid Accent 3" w:semiHidden="0" w:uiPriority="73" w:unhideWhenUsed="0"/>
-    <w:lsdException w:name="Light Shading Accent 4" w:semiHidden="0" w:uiPriority="60" w:unhideWhenUsed="0"/>
-    <w:lsdException w:name="Light List Accent 4" w:semiHidden="0" w:uiPriority="61" w:unhideWhenUsed="0"/>
-    <w:lsdException w:name="Light Grid Accent 4" w:semiHidden="0" w:uiPriority="62" w:unhideWhenUsed="0"/>
-    <w:lsdException w:name="Medium Shading 1 Accent 4" w:semiHidden="0" w:uiPriority="63" w:unhideWhenUsed="0"/>
-    <w:lsdException w:name="Medium Shading 2 Accent 4" w:semiHidden="0" w:uiPriority="64" w:unhideWhenUsed="0"/>
-    <w:lsdException w:name="Medium List 1 Accent 4" w:semiHidden="0" w:uiPriority="65" w:unhideWhenUsed="0"/>
-    <w:lsdException w:name="Medium List 2 Accent 4" w:semiHidden="0" w:uiPriority="66" w:unhideWhenUsed="0"/>
-    <w:lsdException w:name="Medium Grid 1 Accent 4" w:semiHidden="0" w:uiPriority="67" w:unhideWhenUsed="0"/>
-    <w:lsdException w:name="Medium Grid 2 Accent 4" w:semiHidden="0" w:uiPriority="68" w:unhideWhenUsed="0"/>
-    <w:lsdException w:name="Medium Grid 3 Accent 4" w:semiHidden="0" w:uiPriority="69" w:unhideWhenUsed="0"/>
-    <w:lsdException w:name="Dark List Accent 4" w:semiHidden="0" w:uiPriority="70" w:unhideWhenUsed="0"/>
-    <w:lsdException w:name="Colorful Shading Accent 4" w:semiHidden="0" w:uiPriority="71" w:unhideWhenUsed="0"/>
-    <w:lsdException w:name="Colorful List Accent 4" w:semiHidden="0" w:uiPriority="72" w:unhideWhenUsed="0"/>
-    <w:lsdException w:name="Colorful Grid Accent 4" w:semiHidden="0" w:uiPriority="73" w:unhideWhenUsed="0"/>
-    <w:lsdException w:name="Light Shading Accent 5" w:semiHidden="0" w:uiPriority="60" w:unhideWhenUsed="0"/>
-    <w:lsdException w:name="Light List Accent 5" w:semiHidden="0" w:uiPriority="61" w:unhideWhenUsed="0"/>
-    <w:lsdException w:name="Light Grid Accent 5" w:semiHidden="0" w:uiPriority="62" w:unhideWhenUsed="0"/>
-    <w:lsdException w:name="Medium Shading 1 Accent 5" w:semiHidden="0" w:uiPriority="63" w:unhideWhenUsed="0"/>
-    <w:lsdException w:name="Medium Shading 2 Accent 5" w:semiHidden="0" w:uiPriority="64" w:unhideWhenUsed="0"/>
-    <w:lsdException w:name="Medium List 1 Accent 5" w:semiHidden="0" w:uiPriority="65" w:unhideWhenUsed="0"/>
-    <w:lsdException w:name="Medium List 2 Accent 5" w:semiHidden="0" w:uiPriority="66" w:unhideWhenUsed="0"/>
-    <w:lsdException w:name="Medium Grid 1 Accent 5" w:semiHidden="0" w:uiPriority="67" w:unhideWhenUsed="0"/>
-    <w:lsdException w:name="Medium Grid 2 Accent 5" w:semiHidden="0" w:uiPriority="68" w:unhideWhenUsed="0"/>
-    <w:lsdException w:name="Medium Grid 3 Accent 5" w:semiHidden="0" w:uiPriority="69" w:unhideWhenUsed="0"/>
-    <w:lsdException w:name="Dark List Accent 5" w:semiHidden="0" w:uiPriority="70" w:unhideWhenUsed="0"/>
-    <w:lsdException w:name="Colorful Shading Accent 5" w:semiHidden="0" w:uiPriority="71" w:unhideWhenUsed="0"/>
-    <w:lsdException w:name="Colorful List Accent 5" w:semiHidden="0" w:uiPriority="72" w:unhideWhenUsed="0"/>
-    <w:lsdException w:name="Colorful Grid Accent 5" w:semiHidden="0" w:uiPriority="73" w:unhideWhenUsed="0"/>
-    <w:lsdException w:name="Light Shading Accent 6" w:semiHidden="0" w:uiPriority="60" w:unhideWhenUsed="0"/>
-    <w:lsdException w:name="Light List Accent 6" w:semiHidden="0" w:uiPriority="61" w:unhideWhenUsed="0"/>
-    <w:lsdException w:name="Light Grid Accent 6" w:semiHidden="0" w:uiPriority="62" w:unhideWhenUsed="0"/>
-    <w:lsdException w:name="Medium Shading 1 Accent 6" w:semiHidden="0" w:uiPriority="63" w:unhideWhenUsed="0"/>
-    <w:lsdException w:name="Medium Shading 2 Accent 6" w:semiHidden="0" w:uiPriority="64" w:unhideWhenUsed="0"/>
-    <w:lsdException w:name="Medium List 1 Accent 6" w:semiHidden="0" w:uiPriority="65" w:unhideWhenUsed="0"/>
-    <w:lsdException w:name="Medium List 2 Accent 6" w:semiHidden="0" w:uiPriority="66" w:unhideWhenUsed="0"/>
-    <w:lsdException w:name="Medium Grid 1 Accent 6" w:semiHidden="0" w:uiPriority="67" w:unhideWhenUsed="0"/>
-    <w:lsdException w:name="Medium Grid 2 Accent 6" w:semiHidden="0" w:uiPriority="68" w:unhideWhenUsed="0"/>
-    <w:lsdException w:name="Medium Grid 3 Accent 6" w:semiHidden="0" w:uiPriority="69" w:unhideWhenUsed="0"/>
-    <w:lsdException w:name="Dark List Accent 6" w:semiHidden="0" w:uiPriority="70" w:unhideWhenUsed="0"/>
-    <w:lsdException w:name="Colorful Shading Accent 6" w:semiHidden="0" w:uiPriority="71" w:unhideWhenUsed="0"/>
-    <w:lsdException w:name="Colorful List Accent 6" w:semiHidden="0" w:uiPriority="72" w:unhideWhenUsed="0"/>
-    <w:lsdException w:name="Colorful Grid Accent 6" w:semiHidden="0" w:uiPriority="73" w:unhideWhenUsed="0"/>
-    <w:lsdException w:name="Subtle Emphasis" w:semiHidden="0" w:uiPriority="19" w:unhideWhenUsed="0" w:qFormat="1"/>
-    <w:lsdException w:name="Intense Emphasis" w:semiHidden="0" w:uiPriority="21" w:unhideWhenUsed="0" w:qFormat="1"/>
-    <w:lsdException w:name="Subtle Reference" w:semiHidden="0" w:uiPriority="31" w:unhideWhenUsed="0" w:qFormat="1"/>
-    <w:lsdException w:name="Intense Reference" w:semiHidden="0" w:uiPriority="32" w:unhideWhenUsed="0" w:qFormat="1"/>
-    <w:lsdException w:name="Book Title" w:semiHidden="0" w:uiPriority="33" w:unhideWhenUsed="0" w:qFormat="1"/>
-    <w:lsdException w:name="Bibliography" w:uiPriority="37"/>
-    <w:lsdException w:name="TOC Heading" w:uiPriority="39" w:qFormat="1"/>
+  <w:latentStyles w:defLockedState="0" w:defUIPriority="99" w:defSemiHidden="0" w:defUnhideWhenUsed="0" w:defQFormat="0" w:count="376">
+    <w:lsdException w:name="Normal" w:uiPriority="0" w:qFormat="1"/>
+    <w:lsdException w:name="heading 1" w:uiPriority="9" w:qFormat="1"/>
+    <w:lsdException w:name="heading 2" w:semiHidden="1" w:uiPriority="9" w:unhideWhenUsed="1" w:qFormat="1"/>
+    <w:lsdException w:name="heading 3" w:semiHidden="1" w:uiPriority="9" w:unhideWhenUsed="1" w:qFormat="1"/>
+    <w:lsdException w:name="heading 4" w:semiHidden="1" w:uiPriority="9" w:unhideWhenUsed="1" w:qFormat="1"/>
+    <w:lsdException w:name="heading 5" w:semiHidden="1" w:uiPriority="9" w:unhideWhenUsed="1" w:qFormat="1"/>
+    <w:lsdException w:name="heading 6" w:semiHidden="1" w:uiPriority="9" w:unhideWhenUsed="1" w:qFormat="1"/>
+    <w:lsdException w:name="heading 7" w:semiHidden="1" w:uiPriority="9" w:unhideWhenUsed="1" w:qFormat="1"/>
+    <w:lsdException w:name="heading 8" w:semiHidden="1" w:uiPriority="9" w:unhideWhenUsed="1" w:qFormat="1"/>
+    <w:lsdException w:name="heading 9" w:semiHidden="1" w:uiPriority="9" w:unhideWhenUsed="1" w:qFormat="1"/>
+    <w:lsdException w:name="index 1" w:semiHidden="1" w:unhideWhenUsed="1"/>
+    <w:lsdException w:name="index 2" w:semiHidden="1" w:unhideWhenUsed="1"/>
+    <w:lsdException w:name="index 3" w:semiHidden="1" w:unhideWhenUsed="1"/>
+    <w:lsdException w:name="index 4" w:semiHidden="1" w:unhideWhenUsed="1"/>
+    <w:lsdException w:name="index 5" w:semiHidden="1" w:unhideWhenUsed="1"/>
+    <w:lsdException w:name="index 6" w:semiHidden="1" w:unhideWhenUsed="1"/>
+    <w:lsdException w:name="index 7" w:semiHidden="1" w:unhideWhenUsed="1"/>
+    <w:lsdException w:name="index 8" w:semiHidden="1" w:unhideWhenUsed="1"/>
+    <w:lsdException w:name="index 9" w:semiHidden="1" w:unhideWhenUsed="1"/>
+    <w:lsdException w:name="toc 1" w:semiHidden="1" w:uiPriority="39" w:unhideWhenUsed="1"/>
+    <w:lsdException w:name="toc 2" w:semiHidden="1" w:uiPriority="39" w:unhideWhenUsed="1"/>
+    <w:lsdException w:name="toc 3" w:semiHidden="1" w:uiPriority="39" w:unhideWhenUsed="1"/>
+    <w:lsdException w:name="toc 4" w:semiHidden="1" w:uiPriority="39" w:unhideWhenUsed="1"/>
+    <w:lsdException w:name="toc 5" w:semiHidden="1" w:uiPriority="39" w:unhideWhenUsed="1"/>
+    <w:lsdException w:name="toc 6" w:semiHidden="1" w:uiPriority="39" w:unhideWhenUsed="1"/>
+    <w:lsdException w:name="toc 7" w:semiHidden="1" w:uiPriority="39" w:unhideWhenUsed="1"/>
+    <w:lsdException w:name="toc 8" w:semiHidden="1" w:uiPriority="39" w:unhideWhenUsed="1"/>
+    <w:lsdException w:name="toc 9" w:semiHidden="1" w:uiPriority="39" w:unhideWhenUsed="1"/>
+    <w:lsdException w:name="Normal Indent" w:semiHidden="1" w:unhideWhenUsed="1"/>
+    <w:lsdException w:name="footnote text" w:semiHidden="1" w:unhideWhenUsed="1"/>
+    <w:lsdException w:name="annotation text" w:semiHidden="1" w:unhideWhenUsed="1"/>
+    <w:lsdException w:name="header" w:semiHidden="1" w:unhideWhenUsed="1"/>
+    <w:lsdException w:name="footer" w:semiHidden="1" w:unhideWhenUsed="1"/>
+    <w:lsdException w:name="index heading" w:semiHidden="1" w:unhideWhenUsed="1"/>
+    <w:lsdException w:name="caption" w:semiHidden="1" w:uiPriority="35" w:unhideWhenUsed="1" w:qFormat="1"/>
+    <w:lsdException w:name="table of figures" w:semiHidden="1" w:unhideWhenUsed="1"/>
+    <w:lsdException w:name="envelope address" w:semiHidden="1" w:unhideWhenUsed="1"/>
+    <w:lsdException w:name="envelope return" w:semiHidden="1" w:unhideWhenUsed="1"/>
+    <w:lsdException w:name="footnote reference" w:semiHidden="1" w:unhideWhenUsed="1"/>
+    <w:lsdException w:name="annotation reference" w:semiHidden="1" w:unhideWhenUsed="1"/>
+    <w:lsdException w:name="line number" w:semiHidden="1" w:unhideWhenUsed="1"/>
+    <w:lsdException w:name="page number" w:semiHidden="1" w:unhideWhenUsed="1"/>
+    <w:lsdException w:name="endnote reference" w:semiHidden="1" w:unhideWhenUsed="1"/>
+    <w:lsdException w:name="endnote text" w:semiHidden="1" w:unhideWhenUsed="1"/>
+    <w:lsdException w:name="table of authorities" w:semiHidden="1" w:unhideWhenUsed="1"/>
+    <w:lsdException w:name="macro" w:semiHidden="1" w:unhideWhenUsed="1"/>
+    <w:lsdException w:name="toa heading" w:semiHidden="1" w:unhideWhenUsed="1"/>
+    <w:lsdException w:name="List" w:semiHidden="1" w:unhideWhenUsed="1"/>
+    <w:lsdException w:name="List Bullet" w:semiHidden="1" w:unhideWhenUsed="1"/>
+    <w:lsdException w:name="List Number" w:semiHidden="1" w:unhideWhenUsed="1"/>
+    <w:lsdException w:name="List 2" w:semiHidden="1" w:unhideWhenUsed="1"/>
+    <w:lsdException w:name="List 3" w:semiHidden="1" w:unhideWhenUsed="1"/>
+    <w:lsdException w:name="List 4" w:semiHidden="1" w:unhideWhenUsed="1"/>
+    <w:lsdException w:name="List 5" w:semiHidden="1" w:unhideWhenUsed="1"/>
+    <w:lsdException w:name="List Bullet 2" w:semiHidden="1" w:unhideWhenUsed="1"/>
+    <w:lsdException w:name="List Bullet 3" w:semiHidden="1" w:unhideWhenUsed="1"/>
+    <w:lsdException w:name="List Bullet 4" w:semiHidden="1" w:unhideWhenUsed="1"/>
+    <w:lsdException w:name="List Bullet 5" w:semiHidden="1" w:unhideWhenUsed="1"/>
+    <w:lsdException w:name="List Number 2" w:semiHidden="1" w:unhideWhenUsed="1"/>
+    <w:lsdException w:name="List Number 3" w:semiHidden="1" w:unhideWhenUsed="1"/>
+    <w:lsdException w:name="List Number 4" w:semiHidden="1" w:unhideWhenUsed="1"/>
+    <w:lsdException w:name="List Number 5" w:semiHidden="1" w:unhideWhenUsed="1"/>
+    <w:lsdException w:name="Title" w:uiPriority="10" w:qFormat="1"/>
+    <w:lsdException w:name="Closing" w:semiHidden="1" w:unhideWhenUsed="1"/>
+    <w:lsdException w:name="Signature" w:semiHidden="1" w:unhideWhenUsed="1"/>
+    <w:lsdException w:name="Default Paragraph Font" w:semiHidden="1" w:uiPriority="1" w:unhideWhenUsed="1"/>
+    <w:lsdException w:name="Body Text" w:semiHidden="1" w:unhideWhenUsed="1"/>
+    <w:lsdException w:name="Body Text Indent" w:semiHidden="1" w:unhideWhenUsed="1"/>
+    <w:lsdException w:name="List Continue" w:semiHidden="1" w:unhideWhenUsed="1"/>
+    <w:lsdException w:name="List Continue 2" w:semiHidden="1" w:unhideWhenUsed="1"/>
+    <w:lsdException w:name="List Continue 3" w:semiHidden="1" w:unhideWhenUsed="1"/>
+    <w:lsdException w:name="List Continue 4" w:semiHidden="1" w:unhideWhenUsed="1"/>
+    <w:lsdException w:name="List Continue 5" w:semiHidden="1" w:unhideWhenUsed="1"/>
+    <w:lsdException w:name="Message Header" w:semiHidden="1" w:unhideWhenUsed="1"/>
+    <w:lsdException w:name="Subtitle" w:uiPriority="11" w:qFormat="1"/>
+    <w:lsdException w:name="Salutation" w:semiHidden="1" w:unhideWhenUsed="1"/>
+    <w:lsdException w:name="Date" w:semiHidden="1" w:unhideWhenUsed="1"/>
+    <w:lsdException w:name="Body Text First Indent" w:semiHidden="1" w:unhideWhenUsed="1"/>
+    <w:lsdException w:name="Body Text First Indent 2" w:semiHidden="1" w:unhideWhenUsed="1"/>
+    <w:lsdException w:name="Note Heading" w:semiHidden="1" w:unhideWhenUsed="1"/>
+    <w:lsdException w:name="Body Text 2" w:semiHidden="1" w:unhideWhenUsed="1"/>
+    <w:lsdException w:name="Body Text 3" w:semiHidden="1" w:unhideWhenUsed="1"/>
+    <w:lsdException w:name="Body Text Indent 2" w:semiHidden="1" w:unhideWhenUsed="1"/>
+    <w:lsdException w:name="Body Text Indent 3" w:semiHidden="1" w:unhideWhenUsed="1"/>
+    <w:lsdException w:name="Block Text" w:semiHidden="1" w:unhideWhenUsed="1"/>
+    <w:lsdException w:name="Hyperlink" w:semiHidden="1" w:unhideWhenUsed="1"/>
+    <w:lsdException w:name="FollowedHyperlink" w:semiHidden="1" w:unhideWhenUsed="1"/>
+    <w:lsdException w:name="Strong" w:uiPriority="22" w:qFormat="1"/>
+    <w:lsdException w:name="Emphasis" w:uiPriority="20" w:qFormat="1"/>
+    <w:lsdException w:name="Document Map" w:semiHidden="1" w:unhideWhenUsed="1"/>
+    <w:lsdException w:name="Plain Text" w:semiHidden="1" w:unhideWhenUsed="1"/>
+    <w:lsdException w:name="E-mail Signature" w:semiHidden="1" w:unhideWhenUsed="1"/>
+    <w:lsdException w:name="HTML Top of Form" w:semiHidden="1" w:unhideWhenUsed="1"/>
+    <w:lsdException w:name="HTML Bottom of Form" w:semiHidden="1" w:unhideWhenUsed="1"/>
+    <w:lsdException w:name="Normal (Web)" w:semiHidden="1" w:unhideWhenUsed="1"/>
+    <w:lsdException w:name="HTML Acronym" w:semiHidden="1" w:unhideWhenUsed="1"/>
+    <w:lsdException w:name="HTML Address" w:semiHidden="1" w:unhideWhenUsed="1"/>
+    <w:lsdException w:name="HTML Cite" w:semiHidden="1" w:unhideWhenUsed="1"/>
+    <w:lsdException w:name="HTML Code" w:semiHidden="1" w:unhideWhenUsed="1"/>
+    <w:lsdException w:name="HTML Definition" w:semiHidden="1" w:unhideWhenUsed="1"/>
+    <w:lsdException w:name="HTML Keyboard" w:semiHidden="1" w:unhideWhenUsed="1"/>
+    <w:lsdException w:name="HTML Preformatted" w:semiHidden="1" w:unhideWhenUsed="1"/>
+    <w:lsdException w:name="HTML Sample" w:semiHidden="1" w:unhideWhenUsed="1"/>
+    <w:lsdException w:name="HTML Typewriter" w:semiHidden="1" w:unhideWhenUsed="1"/>
+    <w:lsdException w:name="HTML Variable" w:semiHidden="1" w:unhideWhenUsed="1"/>
+    <w:lsdException w:name="Normal Table" w:semiHidden="1" w:unhideWhenUsed="1"/>
+    <w:lsdException w:name="annotation subject" w:semiHidden="1" w:unhideWhenUsed="1"/>
+    <w:lsdException w:name="No List" w:semiHidden="1" w:unhideWhenUsed="1"/>
+    <w:lsdException w:name="Outline List 1" w:semiHidden="1" w:unhideWhenUsed="1"/>
+    <w:lsdException w:name="Outline List 2" w:semiHidden="1" w:unhideWhenUsed="1"/>
+    <w:lsdException w:name="Outline List 3" w:semiHidden="1" w:unhideWhenUsed="1"/>
+    <w:lsdException w:name="Table Simple 1" w:semiHidden="1" w:unhideWhenUsed="1"/>
+    <w:lsdException w:name="Table Simple 2" w:semiHidden="1" w:unhideWhenUsed="1"/>
+    <w:lsdException w:name="Table Simple 3" w:semiHidden="1" w:unhideWhenUsed="1"/>
+    <w:lsdException w:name="Table Classic 1" w:semiHidden="1" w:unhideWhenUsed="1"/>
+    <w:lsdException w:name="Table Classic 2" w:semiHidden="1" w:unhideWhenUsed="1"/>
+    <w:lsdException w:name="Table Classic 3" w:semiHidden="1" w:unhideWhenUsed="1"/>
+    <w:lsdException w:name="Table Classic 4" w:semiHidden="1" w:unhideWhenUsed="1"/>
+    <w:lsdException w:name="Table Colorful 1" w:semiHidden="1" w:unhideWhenUsed="1"/>
+    <w:lsdException w:name="Table Colorful 2" w:semiHidden="1" w:unhideWhenUsed="1"/>
+    <w:lsdException w:name="Table Colorful 3" w:semiHidden="1" w:unhideWhenUsed="1"/>
+    <w:lsdException w:name="Table Columns 1" w:semiHidden="1" w:unhideWhenUsed="1"/>
+    <w:lsdException w:name="Table Columns 2" w:semiHidden="1" w:unhideWhenUsed="1"/>
+    <w:lsdException w:name="Table Columns 3" w:semiHidden="1" w:unhideWhenUsed="1"/>
+    <w:lsdException w:name="Table Columns 4" w:semiHidden="1" w:unhideWhenUsed="1"/>
+    <w:lsdException w:name="Table Columns 5" w:semiHidden="1" w:unhideWhenUsed="1"/>
+    <w:lsdException w:name="Table Grid 1" w:semiHidden="1" w:unhideWhenUsed="1"/>
+    <w:lsdException w:name="Table Grid 2" w:semiHidden="1" w:unhideWhenUsed="1"/>
+    <w:lsdException w:name="Table Grid 3" w:semiHidden="1" w:unhideWhenUsed="1"/>
+    <w:lsdException w:name="Table Grid 4" w:semiHidden="1" w:unhideWhenUsed="1"/>
+    <w:lsdException w:name="Table Grid 5" w:semiHidden="1" w:unhideWhenUsed="1"/>
+    <w:lsdException w:name="Table Grid 6" w:semiHidden="1" w:unhideWhenUsed="1"/>
+    <w:lsdException w:name="Table Grid 7" w:semiHidden="1" w:unhideWhenUsed="1"/>
+    <w:lsdException w:name="Table Grid 8" w:semiHidden="1" w:unhideWhenUsed="1"/>
+    <w:lsdException w:name="Table List 1" w:semiHidden="1" w:unhideWhenUsed="1"/>
+    <w:lsdException w:name="Table List 2" w:semiHidden="1" w:unhideWhenUsed="1"/>
+    <w:lsdException w:name="Table List 3" w:semiHidden="1" w:unhideWhenUsed="1"/>
+    <w:lsdException w:name="Table List 4" w:semiHidden="1" w:unhideWhenUsed="1"/>
+    <w:lsdException w:name="Table List 5" w:semiHidden="1" w:unhideWhenUsed="1"/>
+    <w:lsdException w:name="Table List 6" w:semiHidden="1" w:unhideWhenUsed="1"/>
+    <w:lsdException w:name="Table List 7" w:semiHidden="1" w:unhideWhenUsed="1"/>
+    <w:lsdException w:name="Table List 8" w:semiHidden="1" w:unhideWhenUsed="1"/>
+    <w:lsdException w:name="Table 3D effects 1" w:semiHidden="1" w:unhideWhenUsed="1"/>
+    <w:lsdException w:name="Table 3D effects 2" w:semiHidden="1" w:unhideWhenUsed="1"/>
+    <w:lsdException w:name="Table 3D effects 3" w:semiHidden="1" w:unhideWhenUsed="1"/>
+    <w:lsdException w:name="Table Contemporary" w:semiHidden="1" w:unhideWhenUsed="1"/>
+    <w:lsdException w:name="Table Elegant" w:semiHidden="1" w:unhideWhenUsed="1"/>
+    <w:lsdException w:name="Table Professional" w:semiHidden="1" w:unhideWhenUsed="1"/>
+    <w:lsdException w:name="Table Subtle 1" w:semiHidden="1" w:unhideWhenUsed="1"/>
+    <w:lsdException w:name="Table Subtle 2" w:semiHidden="1" w:unhideWhenUsed="1"/>
+    <w:lsdException w:name="Table Web 1" w:semiHidden="1" w:unhideWhenUsed="1"/>
+    <w:lsdException w:name="Table Web 2" w:semiHidden="1" w:unhideWhenUsed="1"/>
+    <w:lsdException w:name="Table Web 3" w:semiHidden="1" w:unhideWhenUsed="1"/>
+    <w:lsdException w:name="Balloon Text" w:semiHidden="1" w:unhideWhenUsed="1"/>
+    <w:lsdException w:name="Table Grid" w:uiPriority="39"/>
+    <w:lsdException w:name="Table Theme" w:semiHidden="1" w:unhideWhenUsed="1"/>
+    <w:lsdException w:name="Placeholder Text" w:semiHidden="1"/>
+    <w:lsdException w:name="No Spacing" w:uiPriority="1" w:qFormat="1"/>
+    <w:lsdException w:name="Light Shading" w:uiPriority="60"/>
+    <w:lsdException w:name="Light List" w:uiPriority="61"/>
+    <w:lsdException w:name="Light Grid" w:uiPriority="62"/>
+    <w:lsdException w:name="Medium Shading 1" w:uiPriority="63"/>
+    <w:lsdException w:name="Medium Shading 2" w:uiPriority="64"/>
+    <w:lsdException w:name="Medium List 1" w:uiPriority="65"/>
+    <w:lsdException w:name="Medium List 2" w:uiPriority="66"/>
+    <w:lsdException w:name="Medium Grid 1" w:uiPriority="67"/>
+    <w:lsdException w:name="Medium Grid 2" w:uiPriority="68"/>
+    <w:lsdException w:name="Medium Grid 3" w:uiPriority="69"/>
+    <w:lsdException w:name="Dark List" w:uiPriority="70"/>
+    <w:lsdException w:name="Colorful Shading" w:uiPriority="71"/>
+    <w:lsdException w:name="Colorful List" w:uiPriority="72"/>
+    <w:lsdException w:name="Colorful Grid" w:uiPriority="73"/>
+    <w:lsdException w:name="Light Shading Accent 1" w:uiPriority="60"/>
+    <w:lsdException w:name="Light List Accent 1" w:uiPriority="61"/>
+    <w:lsdException w:name="Light Grid Accent 1" w:uiPriority="62"/>
+    <w:lsdException w:name="Medium Shading 1 Accent 1" w:uiPriority="63"/>
+    <w:lsdException w:name="Medium Shading 2 Accent 1" w:uiPriority="64"/>
+    <w:lsdException w:name="Medium List 1 Accent 1" w:uiPriority="65"/>
+    <w:lsdException w:name="Revision" w:semiHidden="1"/>
+    <w:lsdException w:name="List Paragraph" w:uiPriority="34" w:qFormat="1"/>
+    <w:lsdException w:name="Quote" w:uiPriority="29" w:qFormat="1"/>
+    <w:lsdException w:name="Intense Quote" w:uiPriority="30" w:qFormat="1"/>
+    <w:lsdException w:name="Medium List 2 Accent 1" w:uiPriority="66"/>
+    <w:lsdException w:name="Medium Grid 1 Accent 1" w:uiPriority="67"/>
+    <w:lsdException w:name="Medium Grid 2 Accent 1" w:uiPriority="68"/>
+    <w:lsdException w:name="Medium Grid 3 Accent 1" w:uiPriority="69"/>
+    <w:lsdException w:name="Dark List Accent 1" w:uiPriority="70"/>
+    <w:lsdException w:name="Colorful Shading Accent 1" w:uiPriority="71"/>
+    <w:lsdException w:name="Colorful List Accent 1" w:uiPriority="72"/>
+    <w:lsdException w:name="Colorful Grid Accent 1" w:uiPriority="73"/>
+    <w:lsdException w:name="Light Shading Accent 2" w:uiPriority="60"/>
+    <w:lsdException w:name="Light List Accent 2" w:uiPriority="61"/>
+    <w:lsdException w:name="Light Grid Accent 2" w:uiPriority="62"/>
+    <w:lsdException w:name="Medium Shading 1 Accent 2" w:uiPriority="63"/>
+    <w:lsdException w:name="Medium Shading 2 Accent 2" w:uiPriority="64"/>
+    <w:lsdException w:name="Medium List 1 Accent 2" w:uiPriority="65"/>
+    <w:lsdException w:name="Medium List 2 Accent 2" w:uiPriority="66"/>
+    <w:lsdException w:name="Medium Grid 1 Accent 2" w:uiPriority="67"/>
+    <w:lsdException w:name="Medium Grid 2 Accent 2" w:uiPriority="68"/>
+    <w:lsdException w:name="Medium Grid 3 Accent 2" w:uiPriority="69"/>
+    <w:lsdException w:name="Dark List Accent 2" w:uiPriority="70"/>
+    <w:lsdException w:name="Colorful Shading Accent 2" w:uiPriority="71"/>
+    <w:lsdException w:name="Colorful List Accent 2" w:uiPriority="72"/>
+    <w:lsdException w:name="Colorful Grid Accent 2" w:uiPriority="73"/>
+    <w:lsdException w:name="Light Shading Accent 3" w:uiPriority="60"/>
+    <w:lsdException w:name="Light List Accent 3" w:uiPriority="61"/>
+    <w:lsdException w:name="Light Grid Accent 3" w:uiPriority="62"/>
+    <w:lsdException w:name="Medium Shading 1 Accent 3" w:uiPriority="63"/>
+    <w:lsdException w:name="Medium Shading 2 Accent 3" w:uiPriority="64"/>
+    <w:lsdException w:name="Medium List 1 Accent 3" w:uiPriority="65"/>
+    <w:lsdException w:name="Medium List 2 Accent 3" w:uiPriority="66"/>
+    <w:lsdException w:name="Medium Grid 1 Accent 3" w:uiPriority="67"/>
+    <w:lsdException w:name="Medium Grid 2 Accent 3" w:uiPriority="68"/>
+    <w:lsdException w:name="Medium Grid 3 Accent 3" w:uiPriority="69"/>
+    <w:lsdException w:name="Dark List Accent 3" w:uiPriority="70"/>
+    <w:lsdException w:name="Colorful Shading Accent 3" w:uiPriority="71"/>
+    <w:lsdException w:name="Colorful List Accent 3" w:uiPriority="72"/>
+    <w:lsdException w:name="Colorful Grid Accent 3" w:uiPriority="73"/>
+    <w:lsdException w:name="Light Shading Accent 4" w:uiPriority="60"/>
+    <w:lsdException w:name="Light List Accent 4" w:uiPriority="61"/>
+    <w:lsdException w:name="Light Grid Accent 4" w:uiPriority="62"/>
+    <w:lsdException w:name="Medium Shading 1 Accent 4" w:uiPriority="63"/>
+    <w:lsdException w:name="Medium Shading 2 Accent 4" w:uiPriority="64"/>
+    <w:lsdException w:name="Medium List 1 Accent 4" w:uiPriority="65"/>
+    <w:lsdException w:name="Medium List 2 Accent 4" w:uiPriority="66"/>
+    <w:lsdException w:name="Medium Grid 1 Accent 4" w:uiPriority="67"/>
+    <w:lsdException w:name="Medium Grid 2 Accent 4" w:uiPriority="68"/>
+    <w:lsdException w:name="Medium Grid 3 Accent 4" w:uiPriority="69"/>
+    <w:lsdException w:name="Dark List Accent 4" w:uiPriority="70"/>
+    <w:lsdException w:name="Colorful Shading Accent 4" w:uiPriority="71"/>
+    <w:lsdException w:name="Colorful List Accent 4" w:uiPriority="72"/>
+    <w:lsdException w:name="Colorful Grid Accent 4" w:uiPriority="73"/>
+    <w:lsdException w:name="Light Shading Accent 5" w:uiPriority="60"/>
+    <w:lsdException w:name="Light List Accent 5" w:uiPriority="61"/>
+    <w:lsdException w:name="Light Grid Accent 5" w:uiPriority="62"/>
+    <w:lsdException w:name="Medium Shading 1 Accent 5" w:uiPriority="63"/>
+    <w:lsdException w:name="Medium Shading 2 Accent 5" w:uiPriority="64"/>
+    <w:lsdException w:name="Medium List 1 Accent 5" w:uiPriority="65"/>
+    <w:lsdException w:name="Medium List 2 Accent 5" w:uiPriority="66"/>
+    <w:lsdException w:name="Medium Grid 1 Accent 5" w:uiPriority="67"/>
+    <w:lsdException w:name="Medium Grid 2 Accent 5" w:uiPriority="68"/>
+    <w:lsdException w:name="Medium Grid 3 Accent 5" w:uiPriority="69"/>
+    <w:lsdException w:name="Dark List Accent 5" w:uiPriority="70"/>
+    <w:lsdException w:name="Colorful Shading Accent 5" w:uiPriority="71"/>
+    <w:lsdException w:name="Colorful List Accent 5" w:uiPriority="72"/>
+    <w:lsdException w:name="Colorful Grid Accent 5" w:uiPriority="73"/>
+    <w:lsdException w:name="Light Shading Accent 6" w:uiPriority="60"/>
+    <w:lsdException w:name="Light List Accent 6" w:uiPriority="61"/>
+    <w:lsdException w:name="Light Grid Accent 6" w:uiPriority="62"/>
+    <w:lsdException w:name="Medium Shading 1 Accent 6" w:uiPriority="63"/>
+    <w:lsdException w:name="Medium Shading 2 Accent 6" w:uiPriority="64"/>
+    <w:lsdException w:name="Medium List 1 Accent 6" w:uiPriority="65"/>
+    <w:lsdException w:name="Medium List 2 Accent 6" w:uiPriority="66"/>
+    <w:lsdException w:name="Medium Grid 1 Accent 6" w:uiPriority="67"/>
+    <w:lsdException w:name="Medium Grid 2 Accent 6" w:uiPriority="68"/>
+    <w:lsdException w:name="Medium Grid 3 Accent 6" w:uiPriority="69"/>
+    <w:lsdException w:name="Dark List Accent 6" w:uiPriority="70"/>
+    <w:lsdException w:name="Colorful Shading Accent 6" w:uiPriority="71"/>
+    <w:lsdException w:name="Colorful List Accent 6" w:uiPriority="72"/>
+    <w:lsdException w:name="Colorful Grid Accent 6" w:uiPriority="73"/>
+    <w:lsdException w:name="Subtle Emphasis" w:uiPriority="19" w:qFormat="1"/>
+    <w:lsdException w:name="Intense Emphasis" w:uiPriority="21" w:qFormat="1"/>
+    <w:lsdException w:name="Subtle Reference" w:uiPriority="31" w:qFormat="1"/>
+    <w:lsdException w:name="Intense Reference" w:uiPriority="32" w:qFormat="1"/>
+    <w:lsdException w:name="Book Title" w:uiPriority="33" w:qFormat="1"/>
+    <w:lsdException w:name="Bibliography" w:semiHidden="1" w:uiPriority="37" w:unhideWhenUsed="1"/>
+    <w:lsdException w:name="TOC Heading" w:semiHidden="1" w:uiPriority="39" w:unhideWhenUsed="1" w:qFormat="1"/>
+    <w:lsdException w:name="Plain Table 1" w:uiPriority="41"/>
+    <w:lsdException w:name="Plain Table 2" w:uiPriority="42"/>
+    <w:lsdException w:name="Plain Table 3" w:uiPriority="43"/>
+    <w:lsdException w:name="Plain Table 4" w:uiPriority="44"/>
+    <w:lsdException w:name="Plain Table 5" w:uiPriority="45"/>
+    <w:lsdException w:name="Grid Table Light" w:uiPriority="40"/>
+    <w:lsdException w:name="Grid Table 1 Light" w:uiPriority="46"/>
+    <w:lsdException w:name="Grid Table 2" w:uiPriority="47"/>
+    <w:lsdException w:name="Grid Table 3" w:uiPriority="48"/>
+    <w:lsdException w:name="Grid Table 4" w:uiPriority="49"/>
+    <w:lsdException w:name="Grid Table 5 Dark" w:uiPriority="50"/>
+    <w:lsdException w:name="Grid Table 6 Colorful" w:uiPriority="51"/>
+    <w:lsdException w:name="Grid Table 7 Colorful" w:uiPriority="52"/>
+    <w:lsdException w:name="Grid Table 1 Light Accent 1" w:uiPriority="46"/>
+    <w:lsdException w:name="Grid Table 2 Accent 1" w:uiPriority="47"/>
+    <w:lsdException w:name="Grid Table 3 Accent 1" w:uiPriority="48"/>
+    <w:lsdException w:name="Grid Table 4 Accent 1" w:uiPriority="49"/>
+    <w:lsdException w:name="Grid Table 5 Dark Accent 1" w:uiPriority="50"/>
+    <w:lsdException w:name="Grid Table 6 Colorful Accent 1" w:uiPriority="51"/>
+    <w:lsdException w:name="Grid Table 7 Colorful Accent 1" w:uiPriority="52"/>
+    <w:lsdException w:name="Grid Table 1 Light Accent 2" w:uiPriority="46"/>
+    <w:lsdException w:name="Grid Table 2 Accent 2" w:uiPriority="47"/>
+    <w:lsdException w:name="Grid Table 3 Accent 2" w:uiPriority="48"/>
+    <w:lsdException w:name="Grid Table 4 Accent 2" w:uiPriority="49"/>
+    <w:lsdException w:name="Grid Table 5 Dark Accent 2" w:uiPriority="50"/>
+    <w:lsdException w:name="Grid Table 6 Colorful Accent 2" w:uiPriority="51"/>
+    <w:lsdException w:name="Grid Table 7 Colorful Accent 2" w:uiPriority="52"/>
+    <w:lsdException w:name="Grid Table 1 Light Accent 3" w:uiPriority="46"/>
+    <w:lsdException w:name="Grid Table 2 Accent 3" w:uiPriority="47"/>
+    <w:lsdException w:name="Grid Table 3 Accent 3" w:uiPriority="48"/>
+    <w:lsdException w:name="Grid Table 4 Accent 3" w:uiPriority="49"/>
+    <w:lsdException w:name="Grid Table 5 Dark Accent 3" w:uiPriority="50"/>
+    <w:lsdException w:name="Grid Table 6 Colorful Accent 3" w:uiPriority="51"/>
+    <w:lsdException w:name="Grid Table 7 Colorful Accent 3" w:uiPriority="52"/>
+    <w:lsdException w:name="Grid Table 1 Light Accent 4" w:uiPriority="46"/>
+    <w:lsdException w:name="Grid Table 2 Accent 4" w:uiPriority="47"/>
+    <w:lsdException w:name="Grid Table 3 Accent 4" w:uiPriority="48"/>
+    <w:lsdException w:name="Grid Table 4 Accent 4" w:uiPriority="49"/>
+    <w:lsdException w:name="Grid Table 5 Dark Accent 4" w:uiPriority="50"/>
+    <w:lsdException w:name="Grid Table 6 Colorful Accent 4" w:uiPriority="51"/>
+    <w:lsdException w:name="Grid Table 7 Colorful Accent 4" w:uiPriority="52"/>
+    <w:lsdException w:name="Grid Table 1 Light Accent 5" w:uiPriority="46"/>
+    <w:lsdException w:name="Grid Table 2 Accent 5" w:uiPriority="47"/>
+    <w:lsdException w:name="Grid Table 3 Accent 5" w:uiPriority="48"/>
+    <w:lsdException w:name="Grid Table 4 Accent 5" w:uiPriority="49"/>
+    <w:lsdException w:name="Grid Table 5 Dark Accent 5" w:uiPriority="50"/>
+    <w:lsdException w:name="Grid Table 6 Colorful Accent 5" w:uiPriority="51"/>
+    <w:lsdException w:name="Grid Table 7 Colorful Accent 5" w:uiPriority="52"/>
+    <w:lsdException w:name="Grid Table 1 Light Accent 6" w:uiPriority="46"/>
+    <w:lsdException w:name="Grid Table 2 Accent 6" w:uiPriority="47"/>
+    <w:lsdException w:name="Grid Table 3 Accent 6" w:uiPriority="48"/>
+    <w:lsdException w:name="Grid Table 4 Accent 6" w:uiPriority="49"/>
+    <w:lsdException w:name="Grid Table 5 Dark Accent 6" w:uiPriority="50"/>
+    <w:lsdException w:name="Grid Table 6 Colorful Accent 6" w:uiPriority="51"/>
+    <w:lsdException w:name="Grid Table 7 Colorful Accent 6" w:uiPriority="52"/>
+    <w:lsdException w:name="List Table 1 Light" w:uiPriority="46"/>
+    <w:lsdException w:name="List Table 2" w:uiPriority="47"/>
+    <w:lsdException w:name="List Table 3" w:uiPriority="48"/>
+    <w:lsdException w:name="List Table 4" w:uiPriority="49"/>
+    <w:lsdException w:name="List Table 5 Dark" w:uiPriority="50"/>
+    <w:lsdException w:name="List Table 6 Colorful" w:uiPriority="51"/>
+    <w:lsdException w:name="List Table 7 Colorful" w:uiPriority="52"/>
+    <w:lsdException w:name="List Table 1 Light Accent 1" w:uiPriority="46"/>
+    <w:lsdException w:name="List Table 2 Accent 1" w:uiPriority="47"/>
+    <w:lsdException w:name="List Table 3 Accent 1" w:uiPriority="48"/>
+    <w:lsdException w:name="List Table 4 Accent 1" w:uiPriority="49"/>
+    <w:lsdException w:name="List Table 5 Dark Accent 1" w:uiPriority="50"/>
+    <w:lsdException w:name="List Table 6 Colorful Accent 1" w:uiPriority="51"/>
+    <w:lsdException w:name="List Table 7 Colorful Accent 1" w:uiPriority="52"/>
+    <w:lsdException w:name="List Table 1 Light Accent 2" w:uiPriority="46"/>
+    <w:lsdException w:name="List Table 2 Accent 2" w:uiPriority="47"/>
+    <w:lsdException w:name="List Table 3 Accent 2" w:uiPriority="48"/>
+    <w:lsdException w:name="List Table 4 Accent 2" w:uiPriority="49"/>
+    <w:lsdException w:name="List Table 5 Dark Accent 2" w:uiPriority="50"/>
+    <w:lsdException w:name="List Table 6 Colorful Accent 2" w:uiPriority="51"/>
+    <w:lsdException w:name="List Table 7 Colorful Accent 2" w:uiPriority="52"/>
+    <w:lsdException w:name="List Table 1 Light Accent 3" w:uiPriority="46"/>
+    <w:lsdException w:name="List Table 2 Accent 3" w:uiPriority="47"/>
+    <w:lsdException w:name="List Table 3 Accent 3" w:uiPriority="48"/>
+    <w:lsdException w:name="List Table 4 Accent 3" w:uiPriority="49"/>
+    <w:lsdException w:name="List Table 5 Dark Accent 3" w:uiPriority="50"/>
+    <w:lsdException w:name="List Table 6 Colorful Accent 3" w:uiPriority="51"/>
+    <w:lsdException w:name="List Table 7 Colorful Accent 3" w:uiPriority="52"/>
+    <w:lsdException w:name="List Table 1 Light Accent 4" w:uiPriority="46"/>
+    <w:lsdException w:name="List Table 2 Accent 4" w:uiPriority="47"/>
+    <w:lsdException w:name="List Table 3 Accent 4" w:uiPriority="48"/>
+    <w:lsdException w:name="List Table 4 Accent 4" w:uiPriority="49"/>
+    <w:lsdException w:name="List Table 5 Dark Accent 4" w:uiPriority="50"/>
+    <w:lsdException w:name="List Table 6 Colorful Accent 4" w:uiPriority="51"/>
+    <w:lsdException w:name="List Table 7 Colorful Accent 4" w:uiPriority="52"/>
+    <w:lsdException w:name="List Table 1 Light Accent 5" w:uiPriority="46"/>
+    <w:lsdException w:name="List Table 2 Accent 5" w:uiPriority="47"/>
+    <w:lsdException w:name="List Table 3 Accent 5" w:uiPriority="48"/>
+    <w:lsdException w:name="List Table 4 Accent 5" w:uiPriority="49"/>
+    <w:lsdException w:name="List Table 5 Dark Accent 5" w:uiPriority="50"/>
+    <w:lsdException w:name="List Table 6 Colorful Accent 5" w:uiPriority="51"/>
+    <w:lsdException w:name="List Table 7 Colorful Accent 5" w:uiPriority="52"/>
+    <w:lsdException w:name="List Table 1 Light Accent 6" w:uiPriority="46"/>
+    <w:lsdException w:name="List Table 2 Accent 6" w:uiPriority="47"/>
+    <w:lsdException w:name="List Table 3 Accent 6" w:uiPriority="48"/>
+    <w:lsdException w:name="List Table 4 Accent 6" w:uiPriority="49"/>
+    <w:lsdException w:name="List Table 5 Dark Accent 6" w:uiPriority="50"/>
+    <w:lsdException w:name="List Table 6 Colorful Accent 6" w:uiPriority="51"/>
+    <w:lsdException w:name="List Table 7 Colorful Accent 6" w:uiPriority="52"/>
+    <w:lsdException w:name="Mention" w:semiHidden="1" w:unhideWhenUsed="1"/>
+    <w:lsdException w:name="Smart Hyperlink" w:semiHidden="1" w:unhideWhenUsed="1"/>
+    <w:lsdException w:name="Hashtag" w:semiHidden="1" w:unhideWhenUsed="1"/>
+    <w:lsdException w:name="Unresolved Mention" w:semiHidden="1" w:unhideWhenUsed="1"/>
+    <w:lsdException w:name="Smart Link" w:semiHidden="1" w:unhideWhenUsed="1"/>
   </w:latentStyles>
   <w:style w:type="paragraph" w:default="1" w:styleId="Normal">
     <w:name w:val="Normal"/>

</xml_diff>